<commit_message>
Aggiorna il manuale utente guidato
- riscritto il manuale per seguire meglio le linee guida del professore
- chiarito che Python 3.12 e PostgreSQL devono essere solo verificati sulla macchina predisposta
- aggiunte soluzioni operative subito sotto i comandi che possono generare errori
- mantenuta l’installazione tramite script da riga di comando
- evitata la creazione di un eseguibile unico non portabile
- semplificati prerequisiti, installazione, avvio e verifica finale
- aggiunta copia PDF finale e copia DOCX modificabile
</commit_message>
<xml_diff>
--- a/progetto2/docs/MANUALE_UTENTE.docx
+++ b/progetto2/docs/MANUALE_UTENTE.docx
@@ -8,10 +8,9 @@
       </w:pPr>
       <w:r>
         <w:rPr>
-          <w:rFonts w:ascii="Aptos Display" w:hAnsi="Aptos Display"/>
           <w:b/>
-          <w:color w:val="1F4E79"/>
-          <w:sz w:val="44"/>
+          <w:color w:val="2C5282"/>
+          <w:sz w:val="40"/>
         </w:rPr>
         <w:t>Manuale utente</w:t>
       </w:r>
@@ -23,29 +22,29 @@
       <w:r>
         <w:rPr>
           <w:b/>
+          <w:color w:val="594D43"/>
           <w:sz w:val="24"/>
         </w:rPr>
-        <w:t>Gestione Numeri Telefonici - Secondo progetto Programmazione Web</w:t>
+        <w:t>Gestione Numeri Telefonici - secondo progetto</w:t>
+      </w:r>
+    </w:p>
+    <w:p>
+      <w:r>
+        <w:rPr>
+          <w:b/>
+        </w:rPr>
+        <w:t xml:space="preserve">Questo manuale spiega come installare e avviare in locale l'applicazione. </w:t>
+      </w:r>
+      <w:r>
+        <w:t>Seguire i passaggi nell'ordine indicato. Non usare un IDE: usare solo PowerShell su Windows o Terminale su macOS.</w:t>
       </w:r>
     </w:p>
     <w:p>
       <w:pPr>
-        <w:pStyle w:val="Callout"/>
-        <w:shd w:fill="EAF2F8"/>
+        <w:pStyle w:val="Heading1"/>
       </w:pPr>
       <w:r>
-        <w:rPr>
-          <w:b w:val="0"/>
-        </w:rPr>
-        <w:t>Obiettivo: installare e avviare in locale l’applicazione Django con database PostgreSQL. Seguire i passaggi nell’ordine indicato. Non usare Visual Studio Code, Eclipse o altri IDE per l’installazione.</w:t>
-      </w:r>
-    </w:p>
-    <w:p>
-      <w:pPr>
-        <w:pStyle w:val="Heading2"/>
-      </w:pPr>
-      <w:r>
-        <w:t>1. Che cosa si installa</w:t>
+        <w:t>1. Cosa viene preparato</w:t>
       </w:r>
     </w:p>
     <w:tbl>
@@ -54,24 +53,33 @@
         <w:tblW w:type="auto" w:w="0"/>
         <w:jc w:val="center"/>
         <w:tblLook w:firstColumn="1" w:firstRow="1" w:lastColumn="0" w:lastRow="0" w:noHBand="0" w:noVBand="1" w:val="04A0"/>
+        <w:tblBorders>
+          <w:top w:val="single" w:sz="4" w:space="0" w:color="B8AEA6"/>
+          <w:left w:val="single" w:sz="4" w:space="0" w:color="B8AEA6"/>
+          <w:bottom w:val="single" w:sz="4" w:space="0" w:color="B8AEA6"/>
+          <w:right w:val="single" w:sz="4" w:space="0" w:color="B8AEA6"/>
+          <w:insideH w:val="single" w:sz="4" w:space="0" w:color="B8AEA6"/>
+          <w:insideV w:val="single" w:sz="4" w:space="0" w:color="B8AEA6"/>
+        </w:tblBorders>
       </w:tblPr>
       <w:tblGrid>
-        <w:gridCol w:w="5100"/>
-        <w:gridCol w:w="5100"/>
+        <w:gridCol w:w="5270"/>
+        <w:gridCol w:w="5270"/>
       </w:tblGrid>
       <w:tr>
         <w:tc>
           <w:tcPr>
-            <w:tcW w:type="dxa" w:w="5100"/>
+            <w:tcW w:type="dxa" w:w="5270"/>
             <w:vAlign w:val="center"/>
-            <w:shd w:fill="9E9187"/>
+            <w:shd w:fill="8A7A70"/>
           </w:tcPr>
           <w:p>
+            <w:r/>
             <w:r>
               <w:rPr>
                 <w:b/>
                 <w:color w:val="FFFFFF"/>
-                <w:sz w:val="19"/>
+                <w:sz w:val="18"/>
               </w:rPr>
               <w:t>Elemento</w:t>
             </w:r>
@@ -79,16 +87,17 @@
         </w:tc>
         <w:tc>
           <w:tcPr>
-            <w:tcW w:type="dxa" w:w="5100"/>
+            <w:tcW w:type="dxa" w:w="5270"/>
             <w:vAlign w:val="center"/>
-            <w:shd w:fill="9E9187"/>
+            <w:shd w:fill="8A7A70"/>
           </w:tcPr>
           <w:p>
+            <w:r/>
             <w:r>
               <w:rPr>
                 <w:b/>
                 <w:color w:val="FFFFFF"/>
-                <w:sz w:val="19"/>
+                <w:sz w:val="18"/>
               </w:rPr>
               <w:t>Funzione</w:t>
             </w:r>
@@ -98,13 +107,15 @@
       <w:tr>
         <w:tc>
           <w:tcPr>
-            <w:tcW w:type="dxa" w:w="5100"/>
+            <w:tcW w:type="dxa" w:w="5270"/>
             <w:vAlign w:val="center"/>
           </w:tcPr>
           <w:p>
+            <w:r/>
             <w:r>
               <w:rPr>
-                <w:sz w:val="19"/>
+                <w:b/>
+                <w:sz w:val="17"/>
               </w:rPr>
               <w:t>Applicazione Django</w:t>
             </w:r>
@@ -112,15 +123,17 @@
         </w:tc>
         <w:tc>
           <w:tcPr>
-            <w:tcW w:type="dxa" w:w="5100"/>
+            <w:tcW w:type="dxa" w:w="5270"/>
             <w:vAlign w:val="center"/>
           </w:tcPr>
           <w:p>
+            <w:r/>
             <w:r>
               <w:rPr>
-                <w:sz w:val="19"/>
+                <w:b w:val="0"/>
+                <w:sz w:val="17"/>
               </w:rPr>
-              <w:t>Mostra numeri telefonici, SIM, chiamate, filtri e operazioni sulle SIM disattivate.</w:t>
+              <w:t>Mostra numeri telefonici, SIM, chiamate, filtri, schede, tabelle ed esportazioni.</w:t>
             </w:r>
           </w:p>
         </w:tc>
@@ -128,29 +141,33 @@
       <w:tr>
         <w:tc>
           <w:tcPr>
-            <w:tcW w:type="dxa" w:w="5100"/>
+            <w:tcW w:type="dxa" w:w="5270"/>
             <w:vAlign w:val="center"/>
           </w:tcPr>
           <w:p>
+            <w:r/>
             <w:r>
               <w:rPr>
-                <w:sz w:val="19"/>
+                <w:b/>
+                <w:sz w:val="17"/>
               </w:rPr>
-              <w:t>Ambiente virtuale .venv</w:t>
+              <w:t>Ambiente .venv</w:t>
             </w:r>
           </w:p>
         </w:tc>
         <w:tc>
           <w:tcPr>
-            <w:tcW w:type="dxa" w:w="5100"/>
+            <w:tcW w:type="dxa" w:w="5270"/>
             <w:vAlign w:val="center"/>
           </w:tcPr>
           <w:p>
+            <w:r/>
             <w:r>
               <w:rPr>
-                <w:sz w:val="19"/>
+                <w:b w:val="0"/>
+                <w:sz w:val="17"/>
               </w:rPr>
-              <w:t>Contiene le librerie Python usate solo da questo progetto.</w:t>
+              <w:t>Contiene le librerie Python del progetto senza modificare il sistema.</w:t>
             </w:r>
           </w:p>
         </w:tc>
@@ -158,29 +175,33 @@
       <w:tr>
         <w:tc>
           <w:tcPr>
-            <w:tcW w:type="dxa" w:w="5100"/>
+            <w:tcW w:type="dxa" w:w="5270"/>
             <w:vAlign w:val="center"/>
           </w:tcPr>
           <w:p>
+            <w:r/>
             <w:r>
               <w:rPr>
-                <w:sz w:val="19"/>
+                <w:b/>
+                <w:sz w:val="17"/>
               </w:rPr>
-              <w:t>Database PostgreSQL</w:t>
+              <w:t>Database PostgreSQL locale</w:t>
             </w:r>
           </w:p>
         </w:tc>
         <w:tc>
           <w:tcPr>
-            <w:tcW w:type="dxa" w:w="5100"/>
+            <w:tcW w:type="dxa" w:w="5270"/>
             <w:vAlign w:val="center"/>
           </w:tcPr>
           <w:p>
+            <w:r/>
             <w:r>
               <w:rPr>
-                <w:sz w:val="19"/>
+                <w:b w:val="0"/>
+                <w:sz w:val="17"/>
               </w:rPr>
-              <w:t>Contiene dati dimostrativi, statistiche e storico SIM.</w:t>
+              <w:t>Contiene i dati dimostrativi e le statistiche usate dall'applicazione.</w:t>
             </w:r>
           </w:p>
         </w:tc>
@@ -188,13 +209,15 @@
       <w:tr>
         <w:tc>
           <w:tcPr>
-            <w:tcW w:type="dxa" w:w="5100"/>
+            <w:tcW w:type="dxa" w:w="5270"/>
             <w:vAlign w:val="center"/>
           </w:tcPr>
           <w:p>
+            <w:r/>
             <w:r>
               <w:rPr>
-                <w:sz w:val="19"/>
+                <w:b/>
+                <w:sz w:val="17"/>
               </w:rPr>
               <w:t>Backup progetto2_db.backup</w:t>
             </w:r>
@@ -202,15 +225,17 @@
         </w:tc>
         <w:tc>
           <w:tcPr>
-            <w:tcW w:type="dxa" w:w="5100"/>
+            <w:tcW w:type="dxa" w:w="5270"/>
             <w:vAlign w:val="center"/>
           </w:tcPr>
           <w:p>
+            <w:r/>
             <w:r>
               <w:rPr>
-                <w:sz w:val="19"/>
+                <w:b w:val="0"/>
+                <w:sz w:val="17"/>
               </w:rPr>
-              <w:t>Ripristina il database locale senza creare i dati a mano.</w:t>
+              <w:t>Carica il database in modo rapido. Il ripristino richiede meno di un minuto nei test.</w:t>
             </w:r>
           </w:p>
         </w:tc>
@@ -218,111 +243,86 @@
     </w:tbl>
     <w:p>
       <w:pPr>
-        <w:pStyle w:val="Heading2"/>
+        <w:pStyle w:val="Heading1"/>
       </w:pPr>
       <w:r>
         <w:t>2. Prima di iniziare</w:t>
       </w:r>
     </w:p>
     <w:p>
+      <w:pPr>
+        <w:pStyle w:val="ManualBullet"/>
+      </w:pPr>
       <w:r>
-        <w:t>Controllare questi elementi prima di eseguire l’installazione.</w:t>
+        <w:t>Estrarre lo ZIP del progetto in una cartella locale, per esempio Desktop o Documenti.</w:t>
       </w:r>
     </w:p>
     <w:p>
       <w:pPr>
-        <w:ind w:left="227" w:hanging="142"/>
+        <w:pStyle w:val="ManualBullet"/>
+      </w:pPr>
+      <w:r>
+        <w:t>Non rinominare le cartelle interne del progetto.</w:t>
+      </w:r>
+    </w:p>
+    <w:p>
+      <w:pPr>
+        <w:pStyle w:val="ManualBullet"/>
+      </w:pPr>
+      <w:r>
+        <w:t>Controllare che esista il file database/generated/progetto2_db.backup.</w:t>
+      </w:r>
+    </w:p>
+    <w:p>
+      <w:pPr>
+        <w:pStyle w:val="ManualBullet"/>
+      </w:pPr>
+      <w:r>
+        <w:t>Usare la macchina predisposta dal corso. Python 3.12 e PostgreSQL sono già previsti sulla macchina ospite.</w:t>
+      </w:r>
+    </w:p>
+    <w:p>
+      <w:pPr>
+        <w:pStyle w:val="ManualBullet"/>
+      </w:pPr>
+      <w:r>
+        <w:t>Non installare software aggiuntivo se i controlli iniziali sono corretti.</w:t>
+      </w:r>
+    </w:p>
+    <w:p>
+      <w:pPr>
+        <w:pStyle w:val="Heading1"/>
+      </w:pPr>
+      <w:r>
+        <w:t>3. Controllare Python e PostgreSQL</w:t>
+      </w:r>
+    </w:p>
+    <w:p>
+      <w:pPr>
+        <w:pStyle w:val="ManualStep"/>
       </w:pPr>
       <w:r>
         <w:rPr>
           <w:b/>
         </w:rPr>
-        <w:t xml:space="preserve">• </w:t>
+        <w:t xml:space="preserve">1. </w:t>
       </w:r>
       <w:r>
-        <w:t>Python 3.12 installato.</w:t>
+        <w:t>Aprire PowerShell su Windows o Terminale su macOS.</w:t>
       </w:r>
     </w:p>
     <w:p>
       <w:pPr>
-        <w:ind w:left="227" w:hanging="142"/>
+        <w:pStyle w:val="ManualStep"/>
       </w:pPr>
       <w:r>
         <w:rPr>
           <w:b/>
         </w:rPr>
-        <w:t xml:space="preserve">• </w:t>
+        <w:t xml:space="preserve">2. </w:t>
       </w:r>
       <w:r>
-        <w:t>PostgreSQL installato e avviabile.</w:t>
-      </w:r>
-    </w:p>
-    <w:p>
-      <w:pPr>
-        <w:ind w:left="227" w:hanging="142"/>
-      </w:pPr>
-      <w:r>
-        <w:rPr>
-          <w:b/>
-        </w:rPr>
-        <w:t xml:space="preserve">• </w:t>
-      </w:r>
-      <w:r>
-        <w:t>Comandi PostgreSQL disponibili: psql, pg_restore, createdb e dropdb.</w:t>
-      </w:r>
-    </w:p>
-    <w:p>
-      <w:pPr>
-        <w:ind w:left="227" w:hanging="142"/>
-      </w:pPr>
-      <w:r>
-        <w:rPr>
-          <w:b/>
-        </w:rPr>
-        <w:t xml:space="preserve">• </w:t>
-      </w:r>
-      <w:r>
-        <w:t>Browser web aggiornato.</w:t>
-      </w:r>
-    </w:p>
-    <w:p>
-      <w:pPr>
-        <w:ind w:left="227" w:hanging="142"/>
-      </w:pPr>
-      <w:r>
-        <w:rPr>
-          <w:b/>
-        </w:rPr>
-        <w:t xml:space="preserve">• </w:t>
-      </w:r>
-      <w:r>
-        <w:t>Cartella del progetto estratta sul computer.</w:t>
-      </w:r>
-    </w:p>
-    <w:p>
-      <w:pPr>
-        <w:ind w:left="227" w:hanging="142"/>
-      </w:pPr>
-      <w:r>
-        <w:rPr>
-          <w:b/>
-        </w:rPr>
-        <w:t xml:space="preserve">• </w:t>
-      </w:r>
-      <w:r>
-        <w:t>File database/generated/progetto2_db.backup presente nella cartella del progetto.</w:t>
-      </w:r>
-    </w:p>
-    <w:p>
-      <w:pPr>
-        <w:pStyle w:val="Callout"/>
-        <w:shd w:fill="FCE4D6"/>
-      </w:pPr>
-      <w:r>
-        <w:rPr>
-          <w:b w:val="0"/>
-        </w:rPr>
-        <w:t>Se manca uno dei prerequisiti, fermare la procedura. Installare o correggere il componente mancante, poi riprendere dal controllo della cartella.</w:t>
+        <w:t>Eseguire i controlli della piattaforma usata.</w:t>
       </w:r>
     </w:p>
     <w:p>
@@ -330,43 +330,88 @@
         <w:pStyle w:val="Heading2"/>
       </w:pPr>
       <w:r>
-        <w:t>3. Controllare la cartella del progetto</w:t>
-      </w:r>
-    </w:p>
-    <w:p>
-      <w:r>
-        <w:t>Aprire la cartella del progetto e verificare la presenza di questi elementi:</w:t>
+        <w:t>Windows</w:t>
       </w:r>
     </w:p>
     <w:p>
       <w:pPr>
-        <w:pStyle w:val="Command"/>
-        <w:shd w:fill="EFEFEF"/>
+        <w:spacing w:after="60"/>
+        <w:ind w:left="227"/>
       </w:pPr>
       <w:r>
-        <w:t>manage.py</w:t>
-        <w:br/>
-        <w:t>requirements.txt</w:t>
-        <w:br/>
-        <w:t>scripts/</w:t>
-        <w:br/>
-        <w:t>database/generated/progetto2_db.backup</w:t>
-        <w:br/>
-        <w:t>gestionale/</w:t>
-        <w:br/>
-        <w:t>progettotwo/</w:t>
+        <w:rPr>
+          <w:rFonts w:ascii="Consolas" w:hAnsi="Consolas" w:eastAsia="Consolas"/>
+          <w:sz w:val="17"/>
+        </w:rPr>
+        <w:t>python --version</w:t>
       </w:r>
     </w:p>
     <w:p>
       <w:pPr>
-        <w:pStyle w:val="Callout"/>
-        <w:shd w:fill="FCE4D6"/>
+        <w:spacing w:after="60"/>
+        <w:ind w:left="227"/>
       </w:pPr>
       <w:r>
         <w:rPr>
-          <w:b w:val="0"/>
+          <w:rFonts w:ascii="Consolas" w:hAnsi="Consolas" w:eastAsia="Consolas"/>
+          <w:sz w:val="17"/>
         </w:rPr>
-        <w:t>Se manca progetto2_db.backup, copiare il file nella cartella database/generated/. Senza questo file il database rimane vuoto.</w:t>
+        <w:t>psql --version</w:t>
+      </w:r>
+    </w:p>
+    <w:p>
+      <w:pPr>
+        <w:spacing w:after="60"/>
+        <w:ind w:left="227"/>
+      </w:pPr>
+      <w:r>
+        <w:rPr>
+          <w:rFonts w:ascii="Consolas" w:hAnsi="Consolas" w:eastAsia="Consolas"/>
+          <w:sz w:val="17"/>
+        </w:rPr>
+        <w:t>pg_restore --version</w:t>
+      </w:r>
+    </w:p>
+    <w:p>
+      <w:pPr>
+        <w:pStyle w:val="ManualNote"/>
+      </w:pPr>
+      <w:r>
+        <w:rPr>
+          <w:b/>
+        </w:rPr>
+        <w:t xml:space="preserve">Se compare errore: </w:t>
+      </w:r>
+      <w:r>
+        <w:t>se python non indica 3.12, provare py -3.12 --version. Se Python 3.12 manca, installarlo solo su macchina non predisposta con: winget install -e --id Python.Python.3.12</w:t>
+      </w:r>
+    </w:p>
+    <w:p>
+      <w:pPr>
+        <w:pStyle w:val="ManualNote"/>
+      </w:pPr>
+      <w:r>
+        <w:rPr>
+          <w:b/>
+        </w:rPr>
+        <w:t xml:space="preserve">Se compare errore: </w:t>
+      </w:r>
+      <w:r>
+        <w:t>se psql o pg_restore non sono riconosciuti, aggiungere PostgreSQL al PATH e riprovare: $env:Path += ";C:\Program Files\PostgreSQL\16\bin"</w:t>
+      </w:r>
+    </w:p>
+    <w:p>
+      <w:pPr>
+        <w:pStyle w:val="ManualNote"/>
+      </w:pPr>
+      <w:r>
+        <w:rPr>
+          <w:b/>
+        </w:rPr>
+        <w:t xml:space="preserve">Se compare errore: </w:t>
+      </w:r>
+      <w:r>
+        <w:t>se PostgreSQL manca su macchina personale, installare PostgreSQL 16 prima di continuare. Sulla macchina del corso questa installazione non dovrebbe servire.</w:t>
       </w:r>
     </w:p>
     <w:p>
@@ -374,625 +419,587 @@
         <w:pStyle w:val="Heading2"/>
       </w:pPr>
       <w:r>
-        <w:t>4. Installazione su Windows</w:t>
-      </w:r>
-    </w:p>
-    <w:p>
-      <w:r>
-        <w:t>Usare PowerShell dalla cartella del progetto.</w:t>
-      </w:r>
-    </w:p>
-    <w:p>
-      <w:r>
-        <w:t>Aprire PowerShell nella cartella:</w:t>
+        <w:t>macOS</w:t>
       </w:r>
     </w:p>
     <w:p>
       <w:pPr>
-        <w:ind w:left="227" w:hanging="142"/>
+        <w:spacing w:after="60"/>
+        <w:ind w:left="227"/>
+      </w:pPr>
+      <w:r>
+        <w:rPr>
+          <w:rFonts w:ascii="Consolas" w:hAnsi="Consolas" w:eastAsia="Consolas"/>
+          <w:sz w:val="17"/>
+        </w:rPr>
+        <w:t>python3.12 --version</w:t>
+      </w:r>
+    </w:p>
+    <w:p>
+      <w:pPr>
+        <w:spacing w:after="60"/>
+        <w:ind w:left="227"/>
+      </w:pPr>
+      <w:r>
+        <w:rPr>
+          <w:rFonts w:ascii="Consolas" w:hAnsi="Consolas" w:eastAsia="Consolas"/>
+          <w:sz w:val="17"/>
+        </w:rPr>
+        <w:t>psql --version</w:t>
+      </w:r>
+    </w:p>
+    <w:p>
+      <w:pPr>
+        <w:spacing w:after="60"/>
+        <w:ind w:left="227"/>
+      </w:pPr>
+      <w:r>
+        <w:rPr>
+          <w:rFonts w:ascii="Consolas" w:hAnsi="Consolas" w:eastAsia="Consolas"/>
+          <w:sz w:val="17"/>
+        </w:rPr>
+        <w:t>pg_restore --version</w:t>
+      </w:r>
+    </w:p>
+    <w:p>
+      <w:pPr>
+        <w:pStyle w:val="ManualNote"/>
       </w:pPr>
       <w:r>
         <w:rPr>
           <w:b/>
         </w:rPr>
-        <w:t xml:space="preserve">• </w:t>
+        <w:t xml:space="preserve">Se compare errore: </w:t>
       </w:r>
       <w:r>
-        <w:t>aprire Esplora file;</w:t>
+        <w:t>se python3.12 manca su macchina personale e Homebrew è disponibile, eseguire: brew install python@3.12</w:t>
       </w:r>
     </w:p>
     <w:p>
       <w:pPr>
-        <w:ind w:left="227" w:hanging="142"/>
+        <w:pStyle w:val="ManualNote"/>
       </w:pPr>
       <w:r>
         <w:rPr>
           <w:b/>
         </w:rPr>
-        <w:t xml:space="preserve">• </w:t>
+        <w:t xml:space="preserve">Se compare errore: </w:t>
       </w:r>
       <w:r>
-        <w:t>aprire la cartella del progetto;</w:t>
+        <w:t>se psql o pg_restore mancano su macchina personale e Homebrew è disponibile, eseguire: brew install postgresql@16</w:t>
       </w:r>
     </w:p>
     <w:p>
       <w:pPr>
-        <w:ind w:left="227" w:hanging="142"/>
+        <w:pStyle w:val="Heading1"/>
+      </w:pPr>
+      <w:r>
+        <w:t>4. Installazione su Windows</w:t>
+      </w:r>
+    </w:p>
+    <w:p>
+      <w:pPr>
+        <w:pStyle w:val="ManualStep"/>
       </w:pPr>
       <w:r>
         <w:rPr>
           <w:b/>
         </w:rPr>
-        <w:t xml:space="preserve">• </w:t>
+        <w:t xml:space="preserve">1. </w:t>
       </w:r>
       <w:r>
-        <w:t>fare clic sulla barra del percorso;</w:t>
+        <w:t>Aprire la cartella del progetto in Esplora file.</w:t>
       </w:r>
     </w:p>
     <w:p>
       <w:pPr>
-        <w:ind w:left="227" w:hanging="142"/>
+        <w:pStyle w:val="ManualStep"/>
       </w:pPr>
       <w:r>
         <w:rPr>
           <w:b/>
         </w:rPr>
-        <w:t xml:space="preserve">• </w:t>
+        <w:t xml:space="preserve">2. </w:t>
       </w:r>
       <w:r>
-        <w:t>scrivere powershell;</w:t>
+        <w:t>Fare clic nella barra del percorso in alto.</w:t>
       </w:r>
     </w:p>
     <w:p>
       <w:pPr>
-        <w:ind w:left="227" w:hanging="142"/>
+        <w:pStyle w:val="ManualStep"/>
       </w:pPr>
       <w:r>
         <w:rPr>
           <w:b/>
         </w:rPr>
-        <w:t xml:space="preserve">• </w:t>
+        <w:t xml:space="preserve">3. </w:t>
       </w:r>
       <w:r>
-        <w:t>premere Invio.</w:t>
-      </w:r>
-    </w:p>
-    <w:p>
-      <w:r>
-        <w:t>Controllare Python:</w:t>
+        <w:t>Scrivere powershell e premere Invio.</w:t>
       </w:r>
     </w:p>
     <w:p>
       <w:pPr>
-        <w:pStyle w:val="Command"/>
-        <w:shd w:fill="EFEFEF"/>
-      </w:pPr>
-      <w:r>
-        <w:t>python --version</w:t>
-      </w:r>
-    </w:p>
-    <w:p>
-      <w:pPr>
-        <w:pStyle w:val="Callout"/>
-        <w:shd w:fill="FCE4D6"/>
-      </w:pPr>
-      <w:r>
-        <w:rPr>
-          <w:b w:val="0"/>
-        </w:rPr>
-        <w:t>Risultato atteso: Python 3.12.x. Se appare "python non trovato", installare Python 3.12 o correggere il PATH. Ripetere il comando prima di continuare.</w:t>
-      </w:r>
-    </w:p>
-    <w:p>
-      <w:r>
-        <w:t>Controllare PostgreSQL:</w:t>
-      </w:r>
-    </w:p>
-    <w:p>
-      <w:pPr>
-        <w:pStyle w:val="Command"/>
-        <w:shd w:fill="EFEFEF"/>
-      </w:pPr>
-      <w:r>
-        <w:t>psql --version</w:t>
-        <w:br/>
-        <w:t>pg_restore --version</w:t>
-      </w:r>
-    </w:p>
-    <w:p>
-      <w:pPr>
-        <w:pStyle w:val="Callout"/>
-        <w:shd w:fill="FCE4D6"/>
-      </w:pPr>
-      <w:r>
-        <w:rPr>
-          <w:b w:val="0"/>
-        </w:rPr>
-        <w:t>Se appare "psql non trovato" o "pg_restore non trovato", aggiungere la cartella bin di PostgreSQL al PATH. Esempio Windows: C:\Program Files\PostgreSQL\16\bin. Chiudere e riaprire PowerShell, poi ripetere i comandi.</w:t>
-      </w:r>
-    </w:p>
-    <w:p>
-      <w:r>
-        <w:t>Avviare l’installazione:</w:t>
-      </w:r>
-    </w:p>
-    <w:p>
-      <w:pPr>
-        <w:pStyle w:val="Command"/>
-        <w:shd w:fill="EFEFEF"/>
-      </w:pPr>
-      <w:r>
-        <w:t>scripts\install_windows.bat</w:t>
-      </w:r>
-    </w:p>
-    <w:p>
-      <w:r>
-        <w:t>Durante l’installazione inserire questi dati:</w:t>
-      </w:r>
-    </w:p>
-    <w:p>
-      <w:pPr>
-        <w:ind w:left="227" w:hanging="142"/>
+        <w:pStyle w:val="ManualStep"/>
       </w:pPr>
       <w:r>
         <w:rPr>
           <w:b/>
         </w:rPr>
-        <w:t xml:space="preserve">• </w:t>
+        <w:t xml:space="preserve">4. </w:t>
       </w:r>
       <w:r>
-        <w:t>password locale da assegnare a progetto2_user;</w:t>
+        <w:t>Avviare l'installazione.</w:t>
       </w:r>
     </w:p>
     <w:p>
       <w:pPr>
-        <w:ind w:left="227" w:hanging="142"/>
+        <w:spacing w:after="60"/>
+        <w:ind w:left="227"/>
+      </w:pPr>
+      <w:r>
+        <w:rPr>
+          <w:rFonts w:ascii="Consolas" w:hAnsi="Consolas" w:eastAsia="Consolas"/>
+          <w:sz w:val="17"/>
+        </w:rPr>
+        <w:t>scripts\install_windows.bat</w:t>
+      </w:r>
+    </w:p>
+    <w:p>
+      <w:pPr>
+        <w:pStyle w:val="ManualNote"/>
       </w:pPr>
       <w:r>
         <w:rPr>
           <w:b/>
         </w:rPr>
-        <w:t xml:space="preserve">• </w:t>
+        <w:t xml:space="preserve">Se compare errore: </w:t>
       </w:r>
       <w:r>
-        <w:t>utente amministratore PostgreSQL, di solito postgres;</w:t>
+        <w:t>se compare "backup mancante", copiare progetto2_db.backup nella cartella database/generated e rilanciare lo script.</w:t>
       </w:r>
     </w:p>
     <w:p>
       <w:pPr>
-        <w:ind w:left="227" w:hanging="142"/>
+        <w:pStyle w:val="ManualNote"/>
       </w:pPr>
       <w:r>
         <w:rPr>
           <w:b/>
         </w:rPr>
-        <w:t xml:space="preserve">• </w:t>
+        <w:t xml:space="preserve">Se compare errore: </w:t>
       </w:r>
       <w:r>
-        <w:t>password dell’utente amministratore PostgreSQL;</w:t>
+        <w:t>se la password PostgreSQL non è accettata, rilanciare lo script e inserire la password dell'utente amministratore PostgreSQL, di solito postgres.</w:t>
       </w:r>
     </w:p>
     <w:p>
       <w:pPr>
-        <w:ind w:left="227" w:hanging="142"/>
+        <w:pStyle w:val="ManualNote"/>
       </w:pPr>
       <w:r>
         <w:rPr>
           <w:b/>
         </w:rPr>
-        <w:t xml:space="preserve">• </w:t>
+        <w:t xml:space="preserve">Se compare errore: </w:t>
       </w:r>
       <w:r>
-        <w:t>SI quando viene richiesta la ricreazione del database locale.</w:t>
+        <w:t>se PostgreSQL non risponde, aprire PowerShell come amministratore ed eseguire: Get-Service postgresql* ; Start-Service postgresql-x64-16</w:t>
       </w:r>
     </w:p>
     <w:p>
       <w:pPr>
-        <w:pStyle w:val="Callout"/>
-        <w:shd w:fill="FCE4D6"/>
+        <w:pStyle w:val="ManualStep"/>
       </w:pPr>
       <w:r>
         <w:rPr>
-          <w:b w:val="0"/>
+          <w:b/>
         </w:rPr>
-        <w:t>Se appare "password authentication failed", ripetere lo script e inserire la password corretta dell’utente amministratore PostgreSQL. Se appare "backup mancante", controllare database/generated/progetto2_db.backup.</w:t>
+        <w:t xml:space="preserve">5. </w:t>
       </w:r>
-    </w:p>
-    <w:p>
       <w:r>
-        <w:t>Controllare il database dopo l’installazione:</w:t>
+        <w:t>Quando lo script chiede una password per progetto2_user, scegliere una password locale e conservarla.</w:t>
       </w:r>
     </w:p>
     <w:p>
       <w:pPr>
-        <w:pStyle w:val="Command"/>
-        <w:shd w:fill="EFEFEF"/>
+        <w:pStyle w:val="ManualStep"/>
       </w:pPr>
       <w:r>
-        <w:t>python manage.py verify_import</w:t>
+        <w:rPr>
+          <w:b/>
+        </w:rPr>
+        <w:t xml:space="preserve">6. </w:t>
+      </w:r>
+      <w:r>
+        <w:t>Quando lo script chiede l'utente amministratore PostgreSQL, scrivere postgres se non è stato indicato un altro utente.</w:t>
       </w:r>
     </w:p>
     <w:p>
       <w:pPr>
-        <w:pStyle w:val="Callout"/>
-        <w:shd w:fill="E2F0D9"/>
+        <w:pStyle w:val="ManualStep"/>
       </w:pPr>
       <w:r>
         <w:rPr>
-          <w:b w:val="0"/>
+          <w:b/>
         </w:rPr>
-        <w:t>Risultato atteso: "Verifica completata: database coerente." Se la pagina risulta vuota, eseguire questo controllo prima di aprire il sito.</w:t>
+        <w:t xml:space="preserve">7. </w:t>
       </w:r>
-    </w:p>
-    <w:p>
       <w:r>
-        <w:t>Avviare l’applicazione:</w:t>
+        <w:t>Scrivere SI quando lo script chiede di ricreare il database locale.</w:t>
       </w:r>
     </w:p>
     <w:p>
       <w:pPr>
-        <w:pStyle w:val="Command"/>
-        <w:shd w:fill="EFEFEF"/>
+        <w:pStyle w:val="ManualStep"/>
       </w:pPr>
       <w:r>
+        <w:rPr>
+          <w:b/>
+        </w:rPr>
+        <w:t xml:space="preserve">8. </w:t>
+      </w:r>
+      <w:r>
+        <w:t>Avviare l'applicazione.</w:t>
+      </w:r>
+    </w:p>
+    <w:p>
+      <w:pPr>
+        <w:spacing w:after="60"/>
+        <w:ind w:left="227"/>
+      </w:pPr>
+      <w:r>
+        <w:rPr>
+          <w:rFonts w:ascii="Consolas" w:hAnsi="Consolas" w:eastAsia="Consolas"/>
+          <w:sz w:val="17"/>
+        </w:rPr>
         <w:t>scripts\start_windows.bat</w:t>
       </w:r>
     </w:p>
     <w:p>
       <w:pPr>
-        <w:pStyle w:val="Callout"/>
-        <w:shd w:fill="FCE4D6"/>
+        <w:pStyle w:val="ManualStep"/>
       </w:pPr>
       <w:r>
         <w:rPr>
-          <w:b w:val="0"/>
+          <w:b/>
         </w:rPr>
-        <w:t>Se appare "porta 8000 occupata", chiudere l’altro server aperto. In alternativa eseguire: python manage.py runserver 8001 e aprire http://127.0.0.1:8001/.</w:t>
+        <w:t xml:space="preserve">9. </w:t>
       </w:r>
-    </w:p>
-    <w:p>
       <w:r>
-        <w:t>Aprire il browser e inserire:</w:t>
+        <w:t>Aprire il browser e scrivere questo indirizzo.</w:t>
       </w:r>
     </w:p>
     <w:p>
       <w:pPr>
-        <w:pStyle w:val="Command"/>
-        <w:shd w:fill="EFEFEF"/>
+        <w:spacing w:after="60"/>
+        <w:ind w:left="227"/>
       </w:pPr>
       <w:r>
+        <w:rPr>
+          <w:rFonts w:ascii="Consolas" w:hAnsi="Consolas" w:eastAsia="Consolas"/>
+          <w:sz w:val="17"/>
+        </w:rPr>
         <w:t>http://127.0.0.1:8000/</w:t>
       </w:r>
     </w:p>
     <w:p>
+      <w:pPr>
+        <w:pStyle w:val="ManualNote"/>
+      </w:pPr>
       <w:r>
-        <w:t>Arrestare l’applicazione:</w:t>
+        <w:rPr>
+          <w:b/>
+        </w:rPr>
+        <w:t xml:space="preserve">Se compare errore: </w:t>
+      </w:r>
+      <w:r>
+        <w:t>se la porta 8000 è occupata, entrare nella cartella del progetto ed eseguire: python manage.py runserver 8001. Aprire poi http://127.0.0.1:8001/</w:t>
       </w:r>
     </w:p>
     <w:p>
       <w:pPr>
-        <w:pStyle w:val="Command"/>
-        <w:shd w:fill="EFEFEF"/>
-      </w:pPr>
-      <w:r>
-        <w:t>CTRL + C</w:t>
-      </w:r>
-    </w:p>
-    <w:p>
-      <w:pPr>
-        <w:pStyle w:val="Heading2"/>
+        <w:pStyle w:val="Heading1"/>
       </w:pPr>
       <w:r>
         <w:t>5. Installazione su macOS</w:t>
       </w:r>
     </w:p>
     <w:p>
+      <w:pPr>
+        <w:pStyle w:val="ManualStep"/>
+      </w:pPr>
       <w:r>
-        <w:t>Usare Terminale dalla cartella del progetto.</w:t>
+        <w:rPr>
+          <w:b/>
+        </w:rPr>
+        <w:t xml:space="preserve">1. </w:t>
       </w:r>
-    </w:p>
-    <w:p>
       <w:r>
-        <w:t>Entrare nella cartella del progetto:</w:t>
+        <w:t>Aprire Terminale.</w:t>
       </w:r>
     </w:p>
     <w:p>
       <w:pPr>
-        <w:pStyle w:val="Command"/>
-        <w:shd w:fill="EFEFEF"/>
+        <w:pStyle w:val="ManualStep"/>
       </w:pPr>
       <w:r>
-        <w:t>cd /percorso/della/cartella/progetto2</w:t>
+        <w:rPr>
+          <w:b/>
+        </w:rPr>
+        <w:t xml:space="preserve">2. </w:t>
+      </w:r>
+      <w:r>
+        <w:t>Entrare nella cartella del progetto. Scrivere cd, aggiungere uno spazio, trascinare la cartella progetto2 nel Terminale e premere Invio.</w:t>
       </w:r>
     </w:p>
     <w:p>
       <w:pPr>
-        <w:pStyle w:val="Callout"/>
-        <w:shd w:fill="EAF2F8"/>
+        <w:pStyle w:val="ManualStep"/>
       </w:pPr>
       <w:r>
         <w:rPr>
-          <w:b w:val="0"/>
+          <w:b/>
         </w:rPr>
-        <w:t>Metodo semplice: scrivere cd seguito da uno spazio, trascinare la cartella progetto2 dentro Terminale, premere Invio.</w:t>
+        <w:t xml:space="preserve">3. </w:t>
       </w:r>
-    </w:p>
-    <w:p>
       <w:r>
-        <w:t>Controllare Python:</w:t>
+        <w:t>Rendere eseguibili gli script.</w:t>
       </w:r>
     </w:p>
     <w:p>
       <w:pPr>
-        <w:pStyle w:val="Command"/>
-        <w:shd w:fill="EFEFEF"/>
-      </w:pPr>
-      <w:r>
-        <w:t>python3.12 --version</w:t>
-      </w:r>
-    </w:p>
-    <w:p>
-      <w:pPr>
-        <w:pStyle w:val="Callout"/>
-        <w:shd w:fill="FCE4D6"/>
+        <w:spacing w:after="60"/>
+        <w:ind w:left="227"/>
       </w:pPr>
       <w:r>
         <w:rPr>
-          <w:b w:val="0"/>
+          <w:rFonts w:ascii="Consolas" w:hAnsi="Consolas" w:eastAsia="Consolas"/>
+          <w:sz w:val="17"/>
         </w:rPr>
-        <w:t>Risultato atteso: Python 3.12.x. Se appare "command not found", installare Python 3.12 oppure correggere il comando disponibile sul Mac.</w:t>
-      </w:r>
-    </w:p>
-    <w:p>
-      <w:r>
-        <w:t>Controllare PostgreSQL:</w:t>
-      </w:r>
-    </w:p>
-    <w:p>
-      <w:pPr>
-        <w:pStyle w:val="Command"/>
-        <w:shd w:fill="EFEFEF"/>
-      </w:pPr>
-      <w:r>
-        <w:t>psql --version</w:t>
-        <w:br/>
-        <w:t>pg_restore --version</w:t>
-      </w:r>
-    </w:p>
-    <w:p>
-      <w:pPr>
-        <w:pStyle w:val="Callout"/>
-        <w:shd w:fill="FCE4D6"/>
-      </w:pPr>
-      <w:r>
-        <w:rPr>
-          <w:b w:val="0"/>
-        </w:rPr>
-        <w:t>Se i comandi non esistono, installare o selezionare PostgreSQL. Ripetere i controlli prima di continuare.</w:t>
-      </w:r>
-    </w:p>
-    <w:p>
-      <w:r>
-        <w:t>Rendere eseguibili gli script:</w:t>
-      </w:r>
-    </w:p>
-    <w:p>
-      <w:pPr>
-        <w:pStyle w:val="Command"/>
-        <w:shd w:fill="EFEFEF"/>
-      </w:pPr>
-      <w:r>
         <w:t>chmod +x scripts/install_macos.sh scripts/start_macos.sh</w:t>
       </w:r>
     </w:p>
     <w:p>
       <w:pPr>
-        <w:pStyle w:val="Callout"/>
-        <w:shd w:fill="FCE4D6"/>
-      </w:pPr>
-      <w:r>
-        <w:rPr>
-          <w:b w:val="0"/>
-        </w:rPr>
-        <w:t>Se appare "Permission denied" durante l’avvio degli script, ripetere questo comando.</w:t>
-      </w:r>
-    </w:p>
-    <w:p>
-      <w:r>
-        <w:t>Avviare l’installazione:</w:t>
-      </w:r>
-    </w:p>
-    <w:p>
-      <w:pPr>
-        <w:pStyle w:val="Command"/>
-        <w:shd w:fill="EFEFEF"/>
-      </w:pPr>
-      <w:r>
-        <w:t>./scripts/install_macos.sh</w:t>
-      </w:r>
-    </w:p>
-    <w:p>
-      <w:r>
-        <w:t>Durante l’installazione inserire questi dati:</w:t>
-      </w:r>
-    </w:p>
-    <w:p>
-      <w:pPr>
-        <w:ind w:left="227" w:hanging="142"/>
+        <w:pStyle w:val="ManualNote"/>
       </w:pPr>
       <w:r>
         <w:rPr>
           <w:b/>
         </w:rPr>
-        <w:t xml:space="preserve">• </w:t>
+        <w:t xml:space="preserve">Se compare errore: </w:t>
       </w:r>
       <w:r>
-        <w:t>password locale da assegnare a progetto2_user;</w:t>
+        <w:t>se compare "permission denied" durante l'avvio dello script, ripetere il comando chmod.</w:t>
       </w:r>
     </w:p>
     <w:p>
       <w:pPr>
-        <w:ind w:left="227" w:hanging="142"/>
+        <w:pStyle w:val="ManualStep"/>
       </w:pPr>
       <w:r>
         <w:rPr>
           <w:b/>
         </w:rPr>
-        <w:t xml:space="preserve">• </w:t>
+        <w:t xml:space="preserve">4. </w:t>
       </w:r>
       <w:r>
-        <w:t>utente amministratore PostgreSQL, di solito postgres;</w:t>
+        <w:t>Avviare l'installazione.</w:t>
       </w:r>
     </w:p>
     <w:p>
       <w:pPr>
-        <w:ind w:left="227" w:hanging="142"/>
+        <w:spacing w:after="60"/>
+        <w:ind w:left="227"/>
+      </w:pPr>
+      <w:r>
+        <w:rPr>
+          <w:rFonts w:ascii="Consolas" w:hAnsi="Consolas" w:eastAsia="Consolas"/>
+          <w:sz w:val="17"/>
+        </w:rPr>
+        <w:t>./scripts/install_macos.sh</w:t>
+      </w:r>
+    </w:p>
+    <w:p>
+      <w:pPr>
+        <w:pStyle w:val="ManualNote"/>
       </w:pPr>
       <w:r>
         <w:rPr>
           <w:b/>
         </w:rPr>
-        <w:t xml:space="preserve">• </w:t>
+        <w:t xml:space="preserve">Se compare errore: </w:t>
       </w:r>
       <w:r>
-        <w:t>password dell’utente amministratore PostgreSQL;</w:t>
+        <w:t>se compare "backup mancante", copiare progetto2_db.backup nella cartella database/generated e rilanciare lo script.</w:t>
       </w:r>
     </w:p>
     <w:p>
       <w:pPr>
-        <w:ind w:left="227" w:hanging="142"/>
+        <w:pStyle w:val="ManualNote"/>
       </w:pPr>
       <w:r>
         <w:rPr>
           <w:b/>
         </w:rPr>
-        <w:t xml:space="preserve">• </w:t>
+        <w:t xml:space="preserve">Se compare errore: </w:t>
       </w:r>
       <w:r>
-        <w:t>SI quando viene richiesta la ricreazione del database locale.</w:t>
+        <w:t>se la password PostgreSQL non è accettata, rilanciare lo script e inserire la password dell'utente amministratore PostgreSQL.</w:t>
       </w:r>
     </w:p>
     <w:p>
       <w:pPr>
-        <w:pStyle w:val="Callout"/>
-        <w:shd w:fill="FCE4D6"/>
+        <w:pStyle w:val="ManualNote"/>
       </w:pPr>
       <w:r>
         <w:rPr>
-          <w:b w:val="0"/>
+          <w:b/>
         </w:rPr>
-        <w:t>Se appare errore di autenticazione, ripetere lo script e inserire la password corretta dell’utente amministratore PostgreSQL. Se manca il backup, copiare progetto2_db.backup in database/generated/.</w:t>
+        <w:t xml:space="preserve">Se compare errore: </w:t>
       </w:r>
-    </w:p>
-    <w:p>
       <w:r>
-        <w:t>Controllare il database dopo l’installazione:</w:t>
+        <w:t>se PostgreSQL non risponde e PostgreSQL è gestito da Homebrew, eseguire: brew services start postgresql@16</w:t>
       </w:r>
     </w:p>
     <w:p>
       <w:pPr>
-        <w:pStyle w:val="Command"/>
-        <w:shd w:fill="EFEFEF"/>
+        <w:pStyle w:val="ManualStep"/>
       </w:pPr>
       <w:r>
-        <w:t>python manage.py verify_import</w:t>
+        <w:rPr>
+          <w:b/>
+        </w:rPr>
+        <w:t xml:space="preserve">5. </w:t>
+      </w:r>
+      <w:r>
+        <w:t>Quando lo script chiede una password per progetto2_user, scegliere una password locale e conservarla.</w:t>
       </w:r>
     </w:p>
     <w:p>
       <w:pPr>
-        <w:pStyle w:val="Callout"/>
-        <w:shd w:fill="E2F0D9"/>
+        <w:pStyle w:val="ManualStep"/>
       </w:pPr>
       <w:r>
         <w:rPr>
-          <w:b w:val="0"/>
+          <w:b/>
         </w:rPr>
-        <w:t>Risultato atteso: "Verifica completata: database coerente." Se Python non è riconosciuto dentro l’ambiente, usare python3.12 al posto di python.</w:t>
+        <w:t xml:space="preserve">6. </w:t>
       </w:r>
-    </w:p>
-    <w:p>
       <w:r>
-        <w:t>Avviare l’applicazione:</w:t>
+        <w:t>Scrivere SI quando lo script chiede di ricreare il database locale.</w:t>
       </w:r>
     </w:p>
     <w:p>
       <w:pPr>
-        <w:pStyle w:val="Command"/>
-        <w:shd w:fill="EFEFEF"/>
+        <w:pStyle w:val="ManualStep"/>
       </w:pPr>
       <w:r>
+        <w:rPr>
+          <w:b/>
+        </w:rPr>
+        <w:t xml:space="preserve">7. </w:t>
+      </w:r>
+      <w:r>
+        <w:t>Avviare l'applicazione.</w:t>
+      </w:r>
+    </w:p>
+    <w:p>
+      <w:pPr>
+        <w:spacing w:after="60"/>
+        <w:ind w:left="227"/>
+      </w:pPr>
+      <w:r>
+        <w:rPr>
+          <w:rFonts w:ascii="Consolas" w:hAnsi="Consolas" w:eastAsia="Consolas"/>
+          <w:sz w:val="17"/>
+        </w:rPr>
         <w:t>./scripts/start_macos.sh</w:t>
       </w:r>
     </w:p>
     <w:p>
+      <w:pPr>
+        <w:pStyle w:val="ManualStep"/>
+      </w:pPr>
       <w:r>
-        <w:t>Aprire il browser e inserire:</w:t>
+        <w:rPr>
+          <w:b/>
+        </w:rPr>
+        <w:t xml:space="preserve">8. </w:t>
+      </w:r>
+      <w:r>
+        <w:t>Aprire il browser e scrivere questo indirizzo.</w:t>
       </w:r>
     </w:p>
     <w:p>
       <w:pPr>
-        <w:pStyle w:val="Command"/>
-        <w:shd w:fill="EFEFEF"/>
+        <w:spacing w:after="60"/>
+        <w:ind w:left="227"/>
       </w:pPr>
       <w:r>
+        <w:rPr>
+          <w:rFonts w:ascii="Consolas" w:hAnsi="Consolas" w:eastAsia="Consolas"/>
+          <w:sz w:val="17"/>
+        </w:rPr>
         <w:t>http://127.0.0.1:8000/</w:t>
       </w:r>
     </w:p>
     <w:p>
+      <w:pPr>
+        <w:pStyle w:val="ManualNote"/>
+      </w:pPr>
       <w:r>
-        <w:t>Arrestare l’applicazione:</w:t>
+        <w:rPr>
+          <w:b/>
+        </w:rPr>
+        <w:t xml:space="preserve">Se compare errore: </w:t>
+      </w:r>
+      <w:r>
+        <w:t>se la porta 8000 è occupata, eseguire: python manage.py runserver 8001. Aprire poi http://127.0.0.1:8001/</w:t>
       </w:r>
     </w:p>
     <w:p>
       <w:pPr>
-        <w:pStyle w:val="Command"/>
-        <w:shd w:fill="EFEFEF"/>
+        <w:pStyle w:val="Heading1"/>
       </w:pPr>
       <w:r>
-        <w:t>CONTROL + C</w:t>
-      </w:r>
-    </w:p>
-    <w:p>
-      <w:r>
-        <w:br w:type="page"/>
-      </w:r>
-    </w:p>
-    <w:p>
-      <w:pPr>
-        <w:pStyle w:val="Heading2"/>
-      </w:pPr>
-      <w:r>
-        <w:t>6. Usare l’applicazione</w:t>
-      </w:r>
-    </w:p>
-    <w:p>
-      <w:r>
-        <w:t>Dalla barra di navigazione aprire le sezioni principali.</w:t>
+        <w:t>6. Uso dell'applicazione</w:t>
       </w:r>
     </w:p>
     <w:tbl>
       <w:tblPr>
-        <w:tblStyle w:val="TableGrid"/>
         <w:tblW w:type="auto" w:w="0"/>
         <w:jc w:val="center"/>
         <w:tblLook w:firstColumn="1" w:firstRow="1" w:lastColumn="0" w:lastRow="0" w:noHBand="0" w:noVBand="1" w:val="04A0"/>
+        <w:tblBorders>
+          <w:top w:val="single" w:sz="4" w:space="0" w:color="B8AEA6"/>
+          <w:left w:val="single" w:sz="4" w:space="0" w:color="B8AEA6"/>
+          <w:bottom w:val="single" w:sz="4" w:space="0" w:color="B8AEA6"/>
+          <w:right w:val="single" w:sz="4" w:space="0" w:color="B8AEA6"/>
+          <w:insideH w:val="single" w:sz="4" w:space="0" w:color="B8AEA6"/>
+          <w:insideV w:val="single" w:sz="4" w:space="0" w:color="B8AEA6"/>
+        </w:tblBorders>
       </w:tblPr>
       <w:tblGrid>
-        <w:gridCol w:w="5100"/>
-        <w:gridCol w:w="5100"/>
+        <w:gridCol w:w="5270"/>
+        <w:gridCol w:w="5270"/>
       </w:tblGrid>
       <w:tr>
         <w:tc>
           <w:tcPr>
-            <w:tcW w:type="dxa" w:w="5100"/>
-            <w:shd w:fill="9E9187"/>
+            <w:tcW w:type="dxa" w:w="5270"/>
+            <w:vAlign w:val="center"/>
+            <w:shd w:fill="8A7A70"/>
           </w:tcPr>
           <w:p>
+            <w:r/>
             <w:r>
               <w:rPr>
                 <w:b/>
                 <w:color w:val="FFFFFF"/>
-                <w:sz w:val="19"/>
+                <w:sz w:val="18"/>
               </w:rPr>
               <w:t>Pagina</w:t>
             </w:r>
@@ -1000,15 +1007,17 @@
         </w:tc>
         <w:tc>
           <w:tcPr>
-            <w:tcW w:type="dxa" w:w="5100"/>
-            <w:shd w:fill="9E9187"/>
+            <w:tcW w:type="dxa" w:w="5270"/>
+            <w:vAlign w:val="center"/>
+            <w:shd w:fill="8A7A70"/>
           </w:tcPr>
           <w:p>
+            <w:r/>
             <w:r>
               <w:rPr>
                 <w:b/>
                 <w:color w:val="FFFFFF"/>
-                <w:sz w:val="19"/>
+                <w:sz w:val="18"/>
               </w:rPr>
               <w:t>Operazione principale</w:t>
             </w:r>
@@ -1018,12 +1027,15 @@
       <w:tr>
         <w:tc>
           <w:tcPr>
-            <w:tcW w:type="dxa" w:w="5100"/>
+            <w:tcW w:type="dxa" w:w="5270"/>
+            <w:vAlign w:val="center"/>
           </w:tcPr>
           <w:p>
+            <w:r/>
             <w:r>
               <w:rPr>
-                <w:sz w:val="19"/>
+                <w:b/>
+                <w:sz w:val="17"/>
               </w:rPr>
               <w:t>Panoramica</w:t>
             </w:r>
@@ -1031,14 +1043,17 @@
         </w:tc>
         <w:tc>
           <w:tcPr>
-            <w:tcW w:type="dxa" w:w="5100"/>
+            <w:tcW w:type="dxa" w:w="5270"/>
+            <w:vAlign w:val="center"/>
           </w:tcPr>
           <w:p>
+            <w:r/>
             <w:r>
               <w:rPr>
-                <w:sz w:val="19"/>
+                <w:b w:val="0"/>
+                <w:sz w:val="17"/>
               </w:rPr>
-              <w:t>Leggere statistiche generali, usare ricerca rapida, aprire ricerche frequenti.</w:t>
+              <w:t>Leggere statistiche, usare ricerca rapida e aprire ricerche frequenti.</w:t>
             </w:r>
           </w:p>
         </w:tc>
@@ -1046,12 +1061,15 @@
       <w:tr>
         <w:tc>
           <w:tcPr>
-            <w:tcW w:type="dxa" w:w="5100"/>
+            <w:tcW w:type="dxa" w:w="5270"/>
+            <w:vAlign w:val="center"/>
           </w:tcPr>
           <w:p>
+            <w:r/>
             <w:r>
               <w:rPr>
-                <w:sz w:val="19"/>
+                <w:b/>
+                <w:sz w:val="17"/>
               </w:rPr>
               <w:t>Numeri telefonici</w:t>
             </w:r>
@@ -1059,14 +1077,17 @@
         </w:tc>
         <w:tc>
           <w:tcPr>
-            <w:tcW w:type="dxa" w:w="5100"/>
+            <w:tcW w:type="dxa" w:w="5270"/>
+            <w:vAlign w:val="center"/>
           </w:tcPr>
           <w:p>
+            <w:r/>
             <w:r>
               <w:rPr>
-                <w:sz w:val="19"/>
+                <w:b w:val="0"/>
+                <w:sz w:val="17"/>
               </w:rPr>
-              <w:t>Cercare numeri, filtrare per stato, piano, disponibilità, chiamate e durata minima.</w:t>
+              <w:t>Cercare numeri, applicare filtri, aprire schede, usare tabella ed esportare Excel.</w:t>
             </w:r>
           </w:p>
         </w:tc>
@@ -1074,12 +1095,15 @@
       <w:tr>
         <w:tc>
           <w:tcPr>
-            <w:tcW w:type="dxa" w:w="5100"/>
+            <w:tcW w:type="dxa" w:w="5270"/>
+            <w:vAlign w:val="center"/>
           </w:tcPr>
           <w:p>
+            <w:r/>
             <w:r>
               <w:rPr>
-                <w:sz w:val="19"/>
+                <w:b/>
+                <w:sz w:val="17"/>
               </w:rPr>
               <w:t>Chiamate</w:t>
             </w:r>
@@ -1087,14 +1111,17 @@
         </w:tc>
         <w:tc>
           <w:tcPr>
-            <w:tcW w:type="dxa" w:w="5100"/>
+            <w:tcW w:type="dxa" w:w="5270"/>
+            <w:vAlign w:val="center"/>
           </w:tcPr>
           <w:p>
+            <w:r/>
             <w:r>
               <w:rPr>
-                <w:sz w:val="19"/>
+                <w:b w:val="0"/>
+                <w:sz w:val="17"/>
               </w:rPr>
-              <w:t>Filtrare telefonate per numero, data, ora, durata, piano e addebito. Aprire le schede estese.</w:t>
+              <w:t>Filtrare chiamate per numero, data, ora, durata, piano e addebito.</w:t>
             </w:r>
           </w:p>
         </w:tc>
@@ -1102,12 +1129,15 @@
       <w:tr>
         <w:tc>
           <w:tcPr>
-            <w:tcW w:type="dxa" w:w="5100"/>
+            <w:tcW w:type="dxa" w:w="5270"/>
+            <w:vAlign w:val="center"/>
           </w:tcPr>
           <w:p>
+            <w:r/>
             <w:r>
               <w:rPr>
-                <w:sz w:val="19"/>
+                <w:b/>
+                <w:sz w:val="17"/>
               </w:rPr>
               <w:t>SIM</w:t>
             </w:r>
@@ -1115,14 +1145,17 @@
         </w:tc>
         <w:tc>
           <w:tcPr>
-            <w:tcW w:type="dxa" w:w="5100"/>
+            <w:tcW w:type="dxa" w:w="5270"/>
+            <w:vAlign w:val="center"/>
           </w:tcPr>
           <w:p>
+            <w:r/>
             <w:r>
               <w:rPr>
-                <w:sz w:val="19"/>
+                <w:b w:val="0"/>
+                <w:sz w:val="17"/>
               </w:rPr>
-              <w:t>Consultare SIM in uso, disponibili e disattivate. Gestire lo storico delle SIM disattivate.</w:t>
+              <w:t>Consultare SIM in uso, disponibili e disattivate. Registrare, modificare o eliminare SIM disattivate.</w:t>
             </w:r>
           </w:p>
         </w:tc>
@@ -1130,57 +1163,197 @@
     </w:tbl>
     <w:p>
       <w:pPr>
-        <w:pStyle w:val="Callout"/>
-        <w:shd w:fill="EAF2F8"/>
+        <w:pStyle w:val="Heading1"/>
       </w:pPr>
       <w:r>
-        <w:rPr>
-          <w:b w:val="0"/>
-        </w:rPr>
-        <w:t>I risultati si aggiornano anche durante la compilazione dei filtri. Il pulsante Cerca resta disponibile per applicare manualmente la ricerca.</w:t>
+        <w:t>7. Verifica finale</w:t>
       </w:r>
     </w:p>
     <w:p>
       <w:pPr>
-        <w:pStyle w:val="Heading2"/>
+        <w:pStyle w:val="ManualStep"/>
       </w:pPr>
       <w:r>
-        <w:t>7. Controllo finale</w:t>
+        <w:rPr>
+          <w:b/>
+        </w:rPr>
+        <w:t xml:space="preserve">1. </w:t>
       </w:r>
-    </w:p>
-    <w:p>
       <w:r>
-        <w:t>Prima della consegna o della valutazione eseguire questi controlli:</w:t>
+        <w:t>Controllare il progetto Django.</w:t>
       </w:r>
     </w:p>
     <w:p>
       <w:pPr>
-        <w:pStyle w:val="Command"/>
-        <w:shd w:fill="EFEFEF"/>
+        <w:spacing w:after="60"/>
+        <w:ind w:left="227"/>
       </w:pPr>
       <w:r>
+        <w:rPr>
+          <w:rFonts w:ascii="Consolas" w:hAnsi="Consolas" w:eastAsia="Consolas"/>
+          <w:sz w:val="17"/>
+        </w:rPr>
         <w:t>python manage.py check</w:t>
-        <w:br/>
+      </w:r>
+    </w:p>
+    <w:p>
+      <w:pPr>
+        <w:pStyle w:val="ManualNote"/>
+      </w:pPr>
+      <w:r>
+        <w:rPr>
+          <w:b/>
+        </w:rPr>
+        <w:t xml:space="preserve">Se compare errore: </w:t>
+      </w:r>
+      <w:r>
+        <w:t>il comando deve mostrare "System check identified no issues".</w:t>
+      </w:r>
+    </w:p>
+    <w:p>
+      <w:pPr>
+        <w:pStyle w:val="ManualStep"/>
+      </w:pPr>
+      <w:r>
+        <w:rPr>
+          <w:b/>
+        </w:rPr>
+        <w:t xml:space="preserve">2. </w:t>
+      </w:r>
+      <w:r>
+        <w:t>Controllare il database importato.</w:t>
+      </w:r>
+    </w:p>
+    <w:p>
+      <w:pPr>
+        <w:spacing w:after="60"/>
+        <w:ind w:left="227"/>
+      </w:pPr>
+      <w:r>
+        <w:rPr>
+          <w:rFonts w:ascii="Consolas" w:hAnsi="Consolas" w:eastAsia="Consolas"/>
+          <w:sz w:val="17"/>
+        </w:rPr>
         <w:t>python manage.py verify_import</w:t>
       </w:r>
     </w:p>
     <w:p>
       <w:pPr>
-        <w:pStyle w:val="Callout"/>
-        <w:shd w:fill="E2F0D9"/>
+        <w:pStyle w:val="ManualNote"/>
       </w:pPr>
       <w:r>
         <w:rPr>
-          <w:b w:val="0"/>
+          <w:b/>
         </w:rPr>
-        <w:t>Il secondo comando deve terminare con: "Verifica completata: database coerente." Aprire poi Panoramica, Numeri telefonici, Chiamate e SIM. Provare filtri, schede, tabelle, esportazione Excel e gestione SIM disattivate.</w:t>
+        <w:t xml:space="preserve">Se compare errore: </w:t>
+      </w:r>
+      <w:r>
+        <w:t>il comando deve terminare con "Verifica completata: database coerente".</w:t>
+      </w:r>
+    </w:p>
+    <w:p>
+      <w:pPr>
+        <w:pStyle w:val="ManualStep"/>
+      </w:pPr>
+      <w:r>
+        <w:rPr>
+          <w:b/>
+        </w:rPr>
+        <w:t xml:space="preserve">3. </w:t>
+      </w:r>
+      <w:r>
+        <w:t>Aprire Panoramica, Numeri telefonici, Chiamate e SIM.</w:t>
+      </w:r>
+    </w:p>
+    <w:p>
+      <w:pPr>
+        <w:pStyle w:val="ManualStep"/>
+      </w:pPr>
+      <w:r>
+        <w:rPr>
+          <w:b/>
+        </w:rPr>
+        <w:t xml:space="preserve">4. </w:t>
+      </w:r>
+      <w:r>
+        <w:t>Provare almeno una ricerca, una vista tabellare, una scheda e una esportazione Excel.</w:t>
+      </w:r>
+    </w:p>
+    <w:p>
+      <w:pPr>
+        <w:pStyle w:val="ManualStep"/>
+      </w:pPr>
+      <w:r>
+        <w:rPr>
+          <w:b/>
+        </w:rPr>
+        <w:t xml:space="preserve">5. </w:t>
+      </w:r>
+      <w:r>
+        <w:t>Fermare il server con CTRL + C nel terminale.</w:t>
+      </w:r>
+    </w:p>
+    <w:p>
+      <w:pPr>
+        <w:pStyle w:val="Heading1"/>
+      </w:pPr>
+      <w:r>
+        <w:t>8. File necessari nella consegna</w:t>
+      </w:r>
+    </w:p>
+    <w:p>
+      <w:pPr>
+        <w:pStyle w:val="ManualBullet"/>
+      </w:pPr>
+      <w:r>
+        <w:t>Cartella del progetto Django.</w:t>
+      </w:r>
+    </w:p>
+    <w:p>
+      <w:pPr>
+        <w:pStyle w:val="ManualBullet"/>
+      </w:pPr>
+      <w:r>
+        <w:t>requirements.txt.</w:t>
+      </w:r>
+    </w:p>
+    <w:p>
+      <w:pPr>
+        <w:pStyle w:val="ManualBullet"/>
+      </w:pPr>
+      <w:r>
+        <w:t>Cartella scripts/.</w:t>
+      </w:r>
+    </w:p>
+    <w:p>
+      <w:pPr>
+        <w:pStyle w:val="ManualBullet"/>
+      </w:pPr>
+      <w:r>
+        <w:t>File database/generated/progetto2_db.backup.</w:t>
+      </w:r>
+    </w:p>
+    <w:p>
+      <w:pPr>
+        <w:pStyle w:val="ManualBullet"/>
+      </w:pPr>
+      <w:r>
+        <w:t>Manuale utente in PDF.</w:t>
+      </w:r>
+    </w:p>
+    <w:p>
+      <w:pPr>
+        <w:pStyle w:val="ManualBullet"/>
+      </w:pPr>
+      <w:r>
+        <w:t>Documento delle scelte progettuali.</w:t>
       </w:r>
     </w:p>
     <w:sectPr>
       <w:headerReference w:type="default" r:id="rId9"/>
       <w:footerReference w:type="default" r:id="rId10"/>
       <w:pgSz w:w="12240" w:h="15840"/>
-      <w:pgMar w:top="907" w:right="1020" w:bottom="907" w:left="1020" w:header="720" w:footer="720" w:gutter="0"/>
+      <w:pgMar w:top="794" w:right="850" w:bottom="709" w:left="850" w:header="720" w:footer="720" w:gutter="0"/>
       <w:cols w:space="720"/>
       <w:docGrid w:linePitch="360"/>
     </w:sectPr>
@@ -1200,7 +1373,7 @@
         <w:color w:val="787878"/>
         <w:sz w:val="16"/>
       </w:rPr>
-      <w:t>Gestione Numeri Telefonici - Django e PostgreSQL</w:t>
+      <w:t>Gestione Numeri Telefonici - installazione locale</w:t>
     </w:r>
   </w:p>
 </w:ftr>
@@ -1215,8 +1388,8 @@
     </w:pPr>
     <w:r>
       <w:rPr>
-        <w:color w:val="646464"/>
-        <w:sz w:val="18"/>
+        <w:color w:val="787878"/>
+        <w:sz w:val="16"/>
       </w:rPr>
       <w:t>Secondo progetto Programmazione Web - Manuale utente</w:t>
     </w:r>
@@ -1588,11 +1761,11 @@
     <w:qFormat/>
     <w:rsid w:val="00FC693F"/>
     <w:pPr>
-      <w:spacing w:after="80" w:line="259" w:lineRule="auto"/>
+      <w:spacing w:after="80" w:line="252" w:lineRule="auto"/>
     </w:pPr>
     <w:rPr>
-      <w:rFonts w:ascii="Aptos" w:hAnsi="Aptos" w:eastAsia="Aptos"/>
-      <w:sz w:val="21"/>
+      <w:rFonts w:ascii="Arial" w:hAnsi="Arial" w:eastAsia="Arial"/>
+      <w:sz w:val="19"/>
     </w:rPr>
   </w:style>
   <w:style w:type="paragraph" w:styleId="Header">
@@ -1650,15 +1823,15 @@
     <w:pPr>
       <w:keepNext/>
       <w:keepLines/>
-      <w:spacing w:before="160" w:after="100"/>
+      <w:spacing w:before="480" w:after="0"/>
       <w:outlineLvl w:val="0"/>
     </w:pPr>
     <w:rPr>
-      <w:rFonts w:asciiTheme="majorHAnsi" w:eastAsiaTheme="majorEastAsia" w:hAnsiTheme="majorHAnsi" w:cstheme="majorBidi" w:ascii="Aptos Display" w:hAnsi="Aptos Display" w:eastAsia="Aptos"/>
+      <w:rFonts w:asciiTheme="majorHAnsi" w:eastAsiaTheme="majorEastAsia" w:hAnsiTheme="majorHAnsi" w:cstheme="majorBidi" w:ascii="Arial" w:hAnsi="Arial" w:eastAsia="Arial"/>
       <w:b/>
       <w:bCs/>
-      <w:color w:val="1F4E79"/>
-      <w:sz w:val="32"/>
+      <w:color w:val="2C5282"/>
+      <w:sz w:val="26"/>
       <w:szCs w:val="28"/>
     </w:rPr>
   </w:style>
@@ -1674,15 +1847,15 @@
     <w:pPr>
       <w:keepNext/>
       <w:keepLines/>
-      <w:spacing w:before="100" w:after="100"/>
+      <w:spacing w:before="200" w:after="0"/>
       <w:outlineLvl w:val="1"/>
     </w:pPr>
     <w:rPr>
-      <w:rFonts w:asciiTheme="majorHAnsi" w:eastAsiaTheme="majorEastAsia" w:hAnsiTheme="majorHAnsi" w:cstheme="majorBidi" w:ascii="Aptos" w:hAnsi="Aptos" w:eastAsia="Aptos"/>
+      <w:rFonts w:asciiTheme="majorHAnsi" w:eastAsiaTheme="majorEastAsia" w:hAnsiTheme="majorHAnsi" w:cstheme="majorBidi" w:ascii="Arial" w:hAnsi="Arial" w:eastAsia="Arial"/>
       <w:b/>
       <w:bCs/>
-      <w:color w:val="4F6128"/>
-      <w:sz w:val="25"/>
+      <w:color w:val="594D43"/>
+      <w:sz w:val="22"/>
       <w:szCs w:val="26"/>
     </w:rPr>
   </w:style>
@@ -1698,15 +1871,14 @@
     <w:pPr>
       <w:keepNext/>
       <w:keepLines/>
-      <w:spacing w:before="100" w:after="100"/>
+      <w:spacing w:before="200" w:after="0"/>
       <w:outlineLvl w:val="2"/>
     </w:pPr>
     <w:rPr>
-      <w:rFonts w:asciiTheme="majorHAnsi" w:eastAsiaTheme="majorEastAsia" w:hAnsiTheme="majorHAnsi" w:cstheme="majorBidi" w:ascii="Aptos" w:hAnsi="Aptos" w:eastAsia="Aptos"/>
+      <w:rFonts w:asciiTheme="majorHAnsi" w:eastAsiaTheme="majorEastAsia" w:hAnsiTheme="majorHAnsi" w:cstheme="majorBidi"/>
       <w:b/>
       <w:bCs/>
-      <w:color w:val="595959"/>
-      <w:sz w:val="22"/>
+      <w:color w:val="4F81BD" w:themeColor="accent1"/>
     </w:rPr>
   </w:style>
   <w:style w:type="paragraph" w:styleId="Heading4">
@@ -1944,11 +2116,12 @@
       <w:contextualSpacing/>
     </w:pPr>
     <w:rPr>
-      <w:rFonts w:asciiTheme="majorHAnsi" w:eastAsiaTheme="majorEastAsia" w:hAnsiTheme="majorHAnsi" w:cstheme="majorBidi"/>
-      <w:color w:val="17365D" w:themeColor="text2" w:themeShade="BF"/>
+      <w:rFonts w:asciiTheme="majorHAnsi" w:eastAsiaTheme="majorEastAsia" w:hAnsiTheme="majorHAnsi" w:cstheme="majorBidi" w:ascii="Arial" w:hAnsi="Arial" w:eastAsia="Arial"/>
+      <w:b/>
+      <w:color w:val="2C5282"/>
       <w:spacing w:val="5"/>
       <w:kern w:val="28"/>
-      <w:sz w:val="52"/>
+      <w:sz w:val="36"/>
       <w:szCs w:val="52"/>
     </w:rPr>
   </w:style>
@@ -13278,27 +13451,41 @@
       </w:tcPr>
     </w:tblStylePr>
   </w:style>
-  <w:style w:type="paragraph" w:customStyle="1" w:styleId="Command">
-    <w:name w:val="Command"/>
-    <w:pPr>
-      <w:spacing w:before="40" w:after="40"/>
-      <w:ind w:left="227" w:right="113"/>
+  <w:style w:type="paragraph" w:customStyle="1" w:styleId="ManualStep">
+    <w:name w:val="ManualStep"/>
+    <w:basedOn w:val="Normal"/>
+    <w:pPr>
+      <w:spacing w:after="60"/>
+      <w:ind w:left="0"/>
     </w:pPr>
     <w:rPr>
-      <w:rFonts w:ascii="Consolas" w:hAnsi="Consolas" w:eastAsia="Consolas"/>
-      <w:color w:val="1E1E1E"/>
-      <w:sz w:val="18"/>
+      <w:rFonts w:ascii="Arial" w:hAnsi="Arial" w:eastAsia="Arial"/>
+      <w:sz w:val="19"/>
     </w:rPr>
   </w:style>
-  <w:style w:type="paragraph" w:customStyle="1" w:styleId="Callout">
-    <w:name w:val="Callout"/>
-    <w:pPr>
-      <w:spacing w:before="40" w:after="80"/>
-      <w:ind w:left="142" w:right="142"/>
+  <w:style w:type="paragraph" w:customStyle="1" w:styleId="ManualBullet">
+    <w:name w:val="ManualBullet"/>
+    <w:basedOn w:val="Normal"/>
+    <w:pPr>
+      <w:spacing w:after="40"/>
+      <w:ind w:left="198" w:hanging="102"/>
     </w:pPr>
     <w:rPr>
-      <w:rFonts w:ascii="Aptos" w:hAnsi="Aptos" w:eastAsia="Aptos"/>
+      <w:rFonts w:ascii="Arial" w:hAnsi="Arial" w:eastAsia="Arial"/>
       <w:sz w:val="19"/>
+    </w:rPr>
+  </w:style>
+  <w:style w:type="paragraph" w:customStyle="1" w:styleId="ManualNote">
+    <w:name w:val="ManualNote"/>
+    <w:basedOn w:val="Normal"/>
+    <w:pPr>
+      <w:spacing w:after="60"/>
+      <w:ind w:left="227"/>
+    </w:pPr>
+    <w:rPr>
+      <w:rFonts w:ascii="Arial" w:hAnsi="Arial" w:eastAsia="Arial"/>
+      <w:color w:val="695245"/>
+      <w:sz w:val="17"/>
     </w:rPr>
   </w:style>
 </w:styles>

</xml_diff>

<commit_message>
Aggiorna il manuale utente finale
- riscritto il manuale per un utente generico non tecnico
- rimossi riferimenti a corso, professore e macchina predisposta
- aggiunta procedura dettagliata per estrarre lo ZIP su Windows e macOS
- spiegata l’apertura di PowerShell e Terminale dalla cartella corretta
- aggiunti controlli Python 3.12 e PostgreSQL con comandi operativi
- inserite soluzioni agli errori direttamente sotto i passaggi interessati
- chiarito il comportamento degli script e delle password richieste
- mantenuti PDF finale e DOCX modificabile
</commit_message>
<xml_diff>
--- a/progetto2/docs/MANUALE_UTENTE.docx
+++ b/progetto2/docs/MANUALE_UTENTE.docx
@@ -9,8 +9,8 @@
       <w:r>
         <w:rPr>
           <w:b/>
-          <w:color w:val="2C5282"/>
-          <w:sz w:val="40"/>
+          <w:color w:val="1F4E79"/>
+          <w:sz w:val="44"/>
         </w:rPr>
         <w:t>Manuale utente</w:t>
       </w:r>
@@ -22,29 +22,1413 @@
       <w:r>
         <w:rPr>
           <w:b/>
-          <w:color w:val="594D43"/>
-          <w:sz w:val="24"/>
+          <w:sz w:val="30"/>
         </w:rPr>
-        <w:t>Gestione Numeri Telefonici - secondo progetto</w:t>
+        <w:t>Gestione Numeri Telefonici</w:t>
       </w:r>
     </w:p>
     <w:p>
+      <w:pPr>
+        <w:jc w:val="center"/>
+      </w:pPr>
+      <w:r>
+        <w:rPr>
+          <w:color w:val="505050"/>
+          <w:sz w:val="22"/>
+        </w:rPr>
+        <w:t>Installazione locale, avvio e uso dell'applicazione</w:t>
+      </w:r>
+    </w:p>
+    <w:p>
+      <w:pPr>
+        <w:pStyle w:val="Heading1"/>
+      </w:pPr>
+      <w:r>
+        <w:t>1. Cosa prepara questa procedura</w:t>
+      </w:r>
+    </w:p>
+    <w:p>
+      <w:pPr>
+        <w:ind w:left="255" w:hanging="113"/>
+      </w:pPr>
       <w:r>
         <w:rPr>
           <w:b/>
         </w:rPr>
-        <w:t xml:space="preserve">Questo manuale spiega come installare e avviare in locale l'applicazione. </w:t>
+        <w:t xml:space="preserve">• </w:t>
       </w:r>
       <w:r>
-        <w:t>Seguire i passaggi nell'ordine indicato. Non usare un IDE: usare solo PowerShell su Windows o Terminale su macOS.</w:t>
+        <w:t>Prepara una copia locale dell'applicazione web Gestione Numeri Telefonici.</w:t>
       </w:r>
     </w:p>
     <w:p>
       <w:pPr>
+        <w:ind w:left="255" w:hanging="113"/>
+      </w:pPr>
+      <w:r>
+        <w:rPr>
+          <w:b/>
+        </w:rPr>
+        <w:t xml:space="preserve">• </w:t>
+      </w:r>
+      <w:r>
+        <w:t>Crea un ambiente Python isolato nella cartella .venv.</w:t>
+      </w:r>
+    </w:p>
+    <w:p>
+      <w:pPr>
+        <w:ind w:left="255" w:hanging="113"/>
+      </w:pPr>
+      <w:r>
+        <w:rPr>
+          <w:b/>
+        </w:rPr>
+        <w:t xml:space="preserve">• </w:t>
+      </w:r>
+      <w:r>
+        <w:t>Carica il database PostgreSQL dal file progetto2_db.backup.</w:t>
+      </w:r>
+    </w:p>
+    <w:p>
+      <w:pPr>
+        <w:ind w:left="255" w:hanging="113"/>
+      </w:pPr>
+      <w:r>
+        <w:rPr>
+          <w:b/>
+        </w:rPr>
+        <w:t xml:space="preserve">• </w:t>
+      </w:r>
+      <w:r>
+        <w:t>Avvia il sito nel browser all'indirizzo http://127.0.0.1:8000/.</w:t>
+      </w:r>
+    </w:p>
+    <w:p>
+      <w:pPr>
+        <w:ind w:left="255" w:hanging="113"/>
+      </w:pPr>
+      <w:r>
+        <w:rPr>
+          <w:b/>
+        </w:rPr>
+        <w:t xml:space="preserve">• </w:t>
+      </w:r>
+      <w:r>
+        <w:t>Usa solo terminale e script inclusi nel pacchetto. Non usare Visual Studio Code, Eclipse o altri IDE.</w:t>
+      </w:r>
+    </w:p>
+    <w:p>
+      <w:pPr>
+        <w:pStyle w:val="SmallNote"/>
+      </w:pPr>
+      <w:r>
+        <w:rPr>
+          <w:b/>
+        </w:rPr>
+        <w:t xml:space="preserve">Nota: </w:t>
+      </w:r>
+      <w:r>
+        <w:t>La procedura richiede pochi minuti se Python 3.12 e PostgreSQL sono già presenti nel computer.</w:t>
+      </w:r>
+    </w:p>
+    <w:p>
+      <w:pPr>
         <w:pStyle w:val="Heading1"/>
       </w:pPr>
       <w:r>
-        <w:t>1. Cosa viene preparato</w:t>
+        <w:t>2. Prima di iniziare</w:t>
+      </w:r>
+    </w:p>
+    <w:p>
+      <w:pPr>
+        <w:ind w:left="255" w:hanging="113"/>
+      </w:pPr>
+      <w:r>
+        <w:rPr>
+          <w:b/>
+        </w:rPr>
+        <w:t xml:space="preserve">• </w:t>
+      </w:r>
+      <w:r>
+        <w:t>Tenere pronto il file ZIP ricevuto per l'installazione.</w:t>
+      </w:r>
+    </w:p>
+    <w:p>
+      <w:pPr>
+        <w:ind w:left="255" w:hanging="113"/>
+      </w:pPr>
+      <w:r>
+        <w:rPr>
+          <w:b/>
+        </w:rPr>
+        <w:t xml:space="preserve">• </w:t>
+      </w:r>
+      <w:r>
+        <w:t>Usare un computer con Python 3.12 e PostgreSQL disponibili.</w:t>
+      </w:r>
+    </w:p>
+    <w:p>
+      <w:pPr>
+        <w:ind w:left="255" w:hanging="113"/>
+      </w:pPr>
+      <w:r>
+        <w:rPr>
+          <w:b/>
+        </w:rPr>
+        <w:t xml:space="preserve">• </w:t>
+      </w:r>
+      <w:r>
+        <w:t>Non spostare file o cartelle durante l'installazione.</w:t>
+      </w:r>
+    </w:p>
+    <w:p>
+      <w:pPr>
+        <w:ind w:left="255" w:hanging="113"/>
+      </w:pPr>
+      <w:r>
+        <w:rPr>
+          <w:b/>
+        </w:rPr>
+        <w:t xml:space="preserve">• </w:t>
+      </w:r>
+      <w:r>
+        <w:t>Quando il terminale chiede una password, digitare la password e premere Invio. Il terminale non mostra caratteri durante la scrittura della password.</w:t>
+      </w:r>
+    </w:p>
+    <w:p>
+      <w:pPr>
+        <w:pStyle w:val="Heading2"/>
+      </w:pPr>
+      <w:r>
+        <w:t>File necessari nella cartella del progetto</w:t>
+      </w:r>
+    </w:p>
+    <w:p>
+      <w:pPr>
+        <w:ind w:left="255" w:hanging="113"/>
+      </w:pPr>
+      <w:r>
+        <w:rPr>
+          <w:b/>
+        </w:rPr>
+        <w:t xml:space="preserve">• </w:t>
+      </w:r>
+      <w:r>
+        <w:t>manage.py</w:t>
+      </w:r>
+    </w:p>
+    <w:p>
+      <w:pPr>
+        <w:ind w:left="255" w:hanging="113"/>
+      </w:pPr>
+      <w:r>
+        <w:rPr>
+          <w:b/>
+        </w:rPr>
+        <w:t xml:space="preserve">• </w:t>
+      </w:r>
+      <w:r>
+        <w:t>requirements.txt</w:t>
+      </w:r>
+    </w:p>
+    <w:p>
+      <w:pPr>
+        <w:ind w:left="255" w:hanging="113"/>
+      </w:pPr>
+      <w:r>
+        <w:rPr>
+          <w:b/>
+        </w:rPr>
+        <w:t xml:space="preserve">• </w:t>
+      </w:r>
+      <w:r>
+        <w:t>scripts</w:t>
+      </w:r>
+    </w:p>
+    <w:p>
+      <w:pPr>
+        <w:ind w:left="255" w:hanging="113"/>
+      </w:pPr>
+      <w:r>
+        <w:rPr>
+          <w:b/>
+        </w:rPr>
+        <w:t xml:space="preserve">• </w:t>
+      </w:r>
+      <w:r>
+        <w:t>database/generated/progetto2_db.backup</w:t>
+      </w:r>
+    </w:p>
+    <w:p>
+      <w:pPr>
+        <w:ind w:left="255" w:hanging="113"/>
+      </w:pPr>
+      <w:r>
+        <w:rPr>
+          <w:b/>
+        </w:rPr>
+        <w:t xml:space="preserve">• </w:t>
+      </w:r>
+      <w:r>
+        <w:t>gestionale</w:t>
+      </w:r>
+    </w:p>
+    <w:p>
+      <w:pPr>
+        <w:ind w:left="255" w:hanging="113"/>
+      </w:pPr>
+      <w:r>
+        <w:rPr>
+          <w:b/>
+        </w:rPr>
+        <w:t xml:space="preserve">• </w:t>
+      </w:r>
+      <w:r>
+        <w:t>progettotwo</w:t>
+      </w:r>
+    </w:p>
+    <w:p>
+      <w:pPr>
+        <w:pStyle w:val="Heading1"/>
+      </w:pPr>
+      <w:r>
+        <w:t>3. Installazione su Windows</w:t>
+      </w:r>
+    </w:p>
+    <w:p>
+      <w:pPr>
+        <w:pStyle w:val="Heading2"/>
+      </w:pPr>
+      <w:r>
+        <w:t>3.1 Estrarre il file ZIP</w:t>
+      </w:r>
+    </w:p>
+    <w:p>
+      <w:pPr>
+        <w:ind w:left="340" w:hanging="198"/>
+      </w:pPr>
+      <w:r>
+        <w:t>1. Aprire la cartella Download da Esplora file.</w:t>
+      </w:r>
+    </w:p>
+    <w:p>
+      <w:pPr>
+        <w:ind w:left="340" w:hanging="198"/>
+      </w:pPr>
+      <w:r>
+        <w:t>2. Trovare il file ZIP del progetto.</w:t>
+      </w:r>
+    </w:p>
+    <w:p>
+      <w:pPr>
+        <w:ind w:left="340" w:hanging="198"/>
+      </w:pPr>
+      <w:r>
+        <w:t>3. Fare clic destro sul file ZIP.</w:t>
+      </w:r>
+    </w:p>
+    <w:p>
+      <w:pPr>
+        <w:ind w:left="340" w:hanging="198"/>
+      </w:pPr>
+      <w:r>
+        <w:t>4. Selezionare Estrai tutto.</w:t>
+      </w:r>
+    </w:p>
+    <w:p>
+      <w:pPr>
+        <w:ind w:left="340" w:hanging="198"/>
+      </w:pPr>
+      <w:r>
+        <w:t>5. Premere Estrai.</w:t>
+      </w:r>
+    </w:p>
+    <w:p>
+      <w:pPr>
+        <w:ind w:left="340" w:hanging="198"/>
+      </w:pPr>
+      <w:r>
+        <w:t>6. Aprire la cartella appena estratta.</w:t>
+      </w:r>
+    </w:p>
+    <w:p>
+      <w:pPr>
+        <w:ind w:left="340" w:hanging="198"/>
+      </w:pPr>
+      <w:r>
+        <w:t>7. Se dentro compare un'altra cartella con lo stesso nome, aprire anche quella cartella.</w:t>
+      </w:r>
+    </w:p>
+    <w:p>
+      <w:pPr>
+        <w:ind w:left="340" w:hanging="198"/>
+      </w:pPr>
+      <w:r>
+        <w:t>8. Fermarsi nella cartella in cui si vede il file manage.py.</w:t>
+      </w:r>
+    </w:p>
+    <w:p>
+      <w:pPr>
+        <w:pStyle w:val="SmallNote"/>
+      </w:pPr>
+      <w:r>
+        <w:rPr>
+          <w:b/>
+        </w:rPr>
+        <w:t xml:space="preserve">Se compare errore: </w:t>
+      </w:r>
+      <w:r>
+        <w:t>se il file manage.py non si vede, aprire la cartella interna successiva. Non avviare comandi da una cartella che non contiene manage.py.</w:t>
+      </w:r>
+    </w:p>
+    <w:p>
+      <w:pPr>
+        <w:pStyle w:val="Heading2"/>
+      </w:pPr>
+      <w:r>
+        <w:t>3.2 Aprire PowerShell nella cartella corretta</w:t>
+      </w:r>
+    </w:p>
+    <w:p>
+      <w:pPr>
+        <w:ind w:left="340" w:hanging="198"/>
+      </w:pPr>
+      <w:r>
+        <w:t>1. Fare clic in un punto vuoto della cartella in cui si vede manage.py.</w:t>
+      </w:r>
+    </w:p>
+    <w:p>
+      <w:pPr>
+        <w:ind w:left="340" w:hanging="198"/>
+      </w:pPr>
+      <w:r>
+        <w:t>2. Fare clic destro.</w:t>
+      </w:r>
+    </w:p>
+    <w:p>
+      <w:pPr>
+        <w:ind w:left="340" w:hanging="198"/>
+      </w:pPr>
+      <w:r>
+        <w:t>3. Selezionare Apri nel Terminale.</w:t>
+      </w:r>
+    </w:p>
+    <w:p>
+      <w:pPr>
+        <w:ind w:left="340" w:hanging="198"/>
+      </w:pPr>
+      <w:r>
+        <w:t>4. Se Apri nel Terminale non compare, fare clic sulla barra del percorso in alto, scrivere powershell e premere Invio.</w:t>
+      </w:r>
+    </w:p>
+    <w:p>
+      <w:pPr>
+        <w:ind w:left="340" w:hanging="198"/>
+      </w:pPr>
+      <w:r>
+        <w:t>5. Controllare la cartella con questi comandi:</w:t>
+      </w:r>
+    </w:p>
+    <w:p>
+      <w:pPr>
+        <w:pStyle w:val="CodeBlock"/>
+        <w:shd w:fill="F7F5F1"/>
+        <w:ind w:left="142" w:right="142"/>
+      </w:pPr>
+      <w:r>
+        <w:t>dir manage.py</w:t>
+        <w:br/>
+        <w:t>dir requirements.txt</w:t>
+        <w:br/>
+        <w:t>dir database\generated\progetto2_db.backup</w:t>
+      </w:r>
+    </w:p>
+    <w:p>
+      <w:pPr>
+        <w:pStyle w:val="SmallNote"/>
+      </w:pPr>
+      <w:r>
+        <w:rPr>
+          <w:b/>
+        </w:rPr>
+        <w:t xml:space="preserve">Se compare errore: </w:t>
+      </w:r>
+      <w:r>
+        <w:t>se un comando dice File non trovato, il terminale non è aperto nella cartella corretta. Chiudere PowerShell, aprire la cartella che contiene manage.py e ripetere il punto 3.2.</w:t>
+      </w:r>
+    </w:p>
+    <w:p>
+      <w:pPr>
+        <w:pStyle w:val="Heading2"/>
+      </w:pPr>
+      <w:r>
+        <w:t>3.3 Controllare Python</w:t>
+      </w:r>
+    </w:p>
+    <w:p>
+      <w:pPr>
+        <w:pStyle w:val="CodeBlock"/>
+        <w:shd w:fill="F7F5F1"/>
+        <w:ind w:left="142" w:right="142"/>
+      </w:pPr>
+      <w:r>
+        <w:t>python --version</w:t>
+      </w:r>
+    </w:p>
+    <w:p>
+      <w:pPr>
+        <w:ind w:left="340" w:hanging="198"/>
+      </w:pPr>
+      <w:r>
+        <w:t>Risultato corretto: Python 3.12.x</w:t>
+      </w:r>
+    </w:p>
+    <w:p>
+      <w:pPr>
+        <w:pStyle w:val="SmallNote"/>
+      </w:pPr>
+      <w:r>
+        <w:rPr>
+          <w:b/>
+        </w:rPr>
+        <w:t xml:space="preserve">Se compare errore: </w:t>
+      </w:r>
+      <w:r>
+        <w:t>se Python non viene trovato o la versione non è 3.12, eseguire questo comando e poi chiudere e riaprire PowerShell:</w:t>
+      </w:r>
+    </w:p>
+    <w:p>
+      <w:pPr>
+        <w:pStyle w:val="CodeBlock"/>
+        <w:shd w:fill="F7F5F1"/>
+        <w:ind w:left="142" w:right="142"/>
+      </w:pPr>
+      <w:r>
+        <w:t>winget install Python.Python.3.12</w:t>
+      </w:r>
+    </w:p>
+    <w:p>
+      <w:pPr>
+        <w:pStyle w:val="Heading2"/>
+      </w:pPr>
+      <w:r>
+        <w:t>3.4 Controllare PostgreSQL</w:t>
+      </w:r>
+    </w:p>
+    <w:p>
+      <w:pPr>
+        <w:pStyle w:val="CodeBlock"/>
+        <w:shd w:fill="F7F5F1"/>
+        <w:ind w:left="142" w:right="142"/>
+      </w:pPr>
+      <w:r>
+        <w:t>psql --version</w:t>
+        <w:br/>
+        <w:t>pg_restore --version</w:t>
+      </w:r>
+    </w:p>
+    <w:p>
+      <w:pPr>
+        <w:ind w:left="340" w:hanging="198"/>
+      </w:pPr>
+      <w:r>
+        <w:t>Risultato corretto: entrambi i comandi mostrano una versione di PostgreSQL.</w:t>
+      </w:r>
+    </w:p>
+    <w:p>
+      <w:pPr>
+        <w:pStyle w:val="SmallNote"/>
+      </w:pPr>
+      <w:r>
+        <w:rPr>
+          <w:b/>
+        </w:rPr>
+        <w:t xml:space="preserve">Se compare errore: </w:t>
+      </w:r>
+      <w:r>
+        <w:t>se psql o pg_restore non vengono trovati, provare ad aggiungere PostgreSQL al terminale corrente:</w:t>
+      </w:r>
+    </w:p>
+    <w:p>
+      <w:pPr>
+        <w:pStyle w:val="CodeBlock"/>
+        <w:shd w:fill="F7F5F1"/>
+        <w:ind w:left="142" w:right="142"/>
+      </w:pPr>
+      <w:r>
+        <w:t>$env:Path += ";C:\Program Files\PostgreSQL\16\bin"</w:t>
+        <w:br/>
+        <w:t>psql --version</w:t>
+        <w:br/>
+        <w:t>pg_restore --version</w:t>
+      </w:r>
+    </w:p>
+    <w:p>
+      <w:pPr>
+        <w:pStyle w:val="SmallNote"/>
+      </w:pPr>
+      <w:r>
+        <w:rPr>
+          <w:b/>
+        </w:rPr>
+        <w:t xml:space="preserve">Se compare errore: </w:t>
+      </w:r>
+      <w:r>
+        <w:t>se la cartella PostgreSQL non esiste, installare PostgreSQL e poi riaprire PowerShell:</w:t>
+      </w:r>
+    </w:p>
+    <w:p>
+      <w:pPr>
+        <w:pStyle w:val="CodeBlock"/>
+        <w:shd w:fill="F7F5F1"/>
+        <w:ind w:left="142" w:right="142"/>
+      </w:pPr>
+      <w:r>
+        <w:t>winget install PostgreSQL.PostgreSQL.16</w:t>
+      </w:r>
+    </w:p>
+    <w:p>
+      <w:pPr>
+        <w:pStyle w:val="Heading2"/>
+      </w:pPr>
+      <w:r>
+        <w:t>3.5 Avviare l'installazione</w:t>
+      </w:r>
+    </w:p>
+    <w:p>
+      <w:pPr>
+        <w:pStyle w:val="CodeBlock"/>
+        <w:shd w:fill="F7F5F1"/>
+        <w:ind w:left="142" w:right="142"/>
+      </w:pPr>
+      <w:r>
+        <w:t>scripts\install_windows.bat</w:t>
+      </w:r>
+    </w:p>
+    <w:p>
+      <w:pPr>
+        <w:ind w:left="340" w:hanging="198"/>
+      </w:pPr>
+      <w:r>
+        <w:t>Durante l'installazione lasciare i valori proposti premendo Invio, quando non serve cambiarli.</w:t>
+      </w:r>
+    </w:p>
+    <w:p>
+      <w:pPr>
+        <w:ind w:left="340" w:hanging="198"/>
+      </w:pPr>
+      <w:r>
+        <w:t>Alla richiesta Password utente applicativo PostgreSQL, scegliere una password locale. Annotarla.</w:t>
+      </w:r>
+    </w:p>
+    <w:p>
+      <w:pPr>
+        <w:ind w:left="340" w:hanging="198"/>
+      </w:pPr>
+      <w:r>
+        <w:t>Alla richiesta Utente amministratore PostgreSQL, usare postgres se non è stato scelto un altro nome.</w:t>
+      </w:r>
+    </w:p>
+    <w:p>
+      <w:pPr>
+        <w:ind w:left="340" w:hanging="198"/>
+      </w:pPr>
+      <w:r>
+        <w:t>Alla richiesta Password utente amministratore PostgreSQL, scrivere la password dell'installazione PostgreSQL presente nel computer.</w:t>
+      </w:r>
+    </w:p>
+    <w:p>
+      <w:pPr>
+        <w:ind w:left="340" w:hanging="198"/>
+      </w:pPr>
+      <w:r>
+        <w:t>Quando compare la richiesta di conferma, scrivere SI e premere Invio.</w:t>
+      </w:r>
+    </w:p>
+    <w:p>
+      <w:pPr>
+        <w:pStyle w:val="SmallNote"/>
+      </w:pPr>
+      <w:r>
+        <w:rPr>
+          <w:b/>
+        </w:rPr>
+        <w:t xml:space="preserve">Se compare errore: </w:t>
+      </w:r>
+      <w:r>
+        <w:t>se compare Backup non trovato, copiare progetto2_db.backup nella cartella database/generated e ripetere il comando scripts\install_windows.bat.</w:t>
+      </w:r>
+    </w:p>
+    <w:p>
+      <w:pPr>
+        <w:pStyle w:val="SmallNote"/>
+      </w:pPr>
+      <w:r>
+        <w:rPr>
+          <w:b/>
+        </w:rPr>
+        <w:t xml:space="preserve">Se compare errore: </w:t>
+      </w:r>
+      <w:r>
+        <w:t>se compare password errata o autenticazione fallita, ripetere il comando e inserire la password corretta dell'utente amministratore PostgreSQL.</w:t>
+      </w:r>
+    </w:p>
+    <w:p>
+      <w:pPr>
+        <w:pStyle w:val="SmallNote"/>
+      </w:pPr>
+      <w:r>
+        <w:rPr>
+          <w:b/>
+        </w:rPr>
+        <w:t xml:space="preserve">Se compare errore: </w:t>
+      </w:r>
+      <w:r>
+        <w:t>se compare Python 3.12 non disponibile, tornare al punto 3.3.</w:t>
+      </w:r>
+    </w:p>
+    <w:p>
+      <w:pPr>
+        <w:pStyle w:val="SmallNote"/>
+      </w:pPr>
+      <w:r>
+        <w:rPr>
+          <w:b/>
+        </w:rPr>
+        <w:t xml:space="preserve">Se compare errore: </w:t>
+      </w:r>
+      <w:r>
+        <w:t>se compare pg_restore non trovato, tornare al punto 3.4.</w:t>
+      </w:r>
+    </w:p>
+    <w:p>
+      <w:pPr>
+        <w:pStyle w:val="Heading2"/>
+      </w:pPr>
+      <w:r>
+        <w:t>3.6 Avviare il sito</w:t>
+      </w:r>
+    </w:p>
+    <w:p>
+      <w:pPr>
+        <w:pStyle w:val="CodeBlock"/>
+        <w:shd w:fill="F7F5F1"/>
+        <w:ind w:left="142" w:right="142"/>
+      </w:pPr>
+      <w:r>
+        <w:t>scripts\start_windows.bat</w:t>
+      </w:r>
+    </w:p>
+    <w:p>
+      <w:pPr>
+        <w:ind w:left="340" w:hanging="198"/>
+      </w:pPr>
+      <w:r>
+        <w:t>Aprire il browser.</w:t>
+      </w:r>
+    </w:p>
+    <w:p>
+      <w:pPr>
+        <w:ind w:left="340" w:hanging="198"/>
+      </w:pPr>
+      <w:r>
+        <w:t>Scrivere questo indirizzo nella barra degli indirizzi:</w:t>
+      </w:r>
+    </w:p>
+    <w:p>
+      <w:pPr>
+        <w:pStyle w:val="CodeBlock"/>
+        <w:shd w:fill="F7F5F1"/>
+        <w:ind w:left="142" w:right="142"/>
+      </w:pPr>
+      <w:r>
+        <w:t>http://127.0.0.1:8000/</w:t>
+      </w:r>
+    </w:p>
+    <w:p>
+      <w:pPr>
+        <w:pStyle w:val="SmallNote"/>
+      </w:pPr>
+      <w:r>
+        <w:rPr>
+          <w:b/>
+        </w:rPr>
+        <w:t xml:space="preserve">Se compare errore: </w:t>
+      </w:r>
+      <w:r>
+        <w:t>se compare Porta 8000 già in uso, avviare il sito su un'altra porta:</w:t>
+      </w:r>
+    </w:p>
+    <w:p>
+      <w:pPr>
+        <w:pStyle w:val="CodeBlock"/>
+        <w:shd w:fill="F7F5F1"/>
+        <w:ind w:left="142" w:right="142"/>
+      </w:pPr>
+      <w:r>
+        <w:t>.venv\Scripts\python.exe manage.py runserver 8001</w:t>
+      </w:r>
+    </w:p>
+    <w:p>
+      <w:pPr>
+        <w:ind w:left="340" w:hanging="198"/>
+      </w:pPr>
+      <w:r>
+        <w:t>In questo caso aprire http://127.0.0.1:8001/.</w:t>
+      </w:r>
+    </w:p>
+    <w:p>
+      <w:pPr>
+        <w:ind w:left="340" w:hanging="198"/>
+      </w:pPr>
+      <w:r>
+        <w:t>Per fermare il sito, tornare in PowerShell e premere CTRL + C.</w:t>
+      </w:r>
+    </w:p>
+    <w:p>
+      <w:pPr>
+        <w:pStyle w:val="Heading1"/>
+      </w:pPr>
+      <w:r>
+        <w:t>4. Installazione su macOS</w:t>
+      </w:r>
+    </w:p>
+    <w:p>
+      <w:pPr>
+        <w:pStyle w:val="Heading2"/>
+      </w:pPr>
+      <w:r>
+        <w:t>4.1 Estrarre il file ZIP</w:t>
+      </w:r>
+    </w:p>
+    <w:p>
+      <w:pPr>
+        <w:ind w:left="340" w:hanging="198"/>
+      </w:pPr>
+      <w:r>
+        <w:t>1. Aprire la cartella Download dal Finder.</w:t>
+      </w:r>
+    </w:p>
+    <w:p>
+      <w:pPr>
+        <w:ind w:left="340" w:hanging="198"/>
+      </w:pPr>
+      <w:r>
+        <w:t>2. Fare doppio clic sul file ZIP del progetto.</w:t>
+      </w:r>
+    </w:p>
+    <w:p>
+      <w:pPr>
+        <w:ind w:left="340" w:hanging="198"/>
+      </w:pPr>
+      <w:r>
+        <w:t>3. Aprire la cartella estratta.</w:t>
+      </w:r>
+    </w:p>
+    <w:p>
+      <w:pPr>
+        <w:ind w:left="340" w:hanging="198"/>
+      </w:pPr>
+      <w:r>
+        <w:t>4. Se dentro compare un'altra cartella con lo stesso nome, aprire anche quella cartella.</w:t>
+      </w:r>
+    </w:p>
+    <w:p>
+      <w:pPr>
+        <w:ind w:left="340" w:hanging="198"/>
+      </w:pPr>
+      <w:r>
+        <w:t>5. Fermarsi nella cartella in cui si vede il file manage.py.</w:t>
+      </w:r>
+    </w:p>
+    <w:p>
+      <w:pPr>
+        <w:pStyle w:val="SmallNote"/>
+      </w:pPr>
+      <w:r>
+        <w:rPr>
+          <w:b/>
+        </w:rPr>
+        <w:t xml:space="preserve">Se compare errore: </w:t>
+      </w:r>
+      <w:r>
+        <w:t>se il file manage.py non si vede, aprire la cartella interna successiva. Non avviare comandi da una cartella che non contiene manage.py.</w:t>
+      </w:r>
+    </w:p>
+    <w:p>
+      <w:pPr>
+        <w:pStyle w:val="Heading2"/>
+      </w:pPr>
+      <w:r>
+        <w:t>4.2 Aprire Terminale nella cartella corretta</w:t>
+      </w:r>
+    </w:p>
+    <w:p>
+      <w:pPr>
+        <w:ind w:left="340" w:hanging="198"/>
+      </w:pPr>
+      <w:r>
+        <w:t>1. Premere Command + Spazio.</w:t>
+      </w:r>
+    </w:p>
+    <w:p>
+      <w:pPr>
+        <w:ind w:left="340" w:hanging="198"/>
+      </w:pPr>
+      <w:r>
+        <w:t>2. Scrivere Terminale.</w:t>
+      </w:r>
+    </w:p>
+    <w:p>
+      <w:pPr>
+        <w:ind w:left="340" w:hanging="198"/>
+      </w:pPr>
+      <w:r>
+        <w:t>3. Premere Invio.</w:t>
+      </w:r>
+    </w:p>
+    <w:p>
+      <w:pPr>
+        <w:ind w:left="340" w:hanging="198"/>
+      </w:pPr>
+      <w:r>
+        <w:t>4. Scrivere cd seguito da uno spazio, senza premere Invio:</w:t>
+      </w:r>
+    </w:p>
+    <w:p>
+      <w:pPr>
+        <w:pStyle w:val="CodeBlock"/>
+        <w:shd w:fill="F7F5F1"/>
+        <w:ind w:left="142" w:right="142"/>
+      </w:pPr>
+      <w:r>
+        <w:t xml:space="preserve">cd </w:t>
+      </w:r>
+    </w:p>
+    <w:p>
+      <w:pPr>
+        <w:ind w:left="340" w:hanging="198"/>
+      </w:pPr>
+      <w:r>
+        <w:t>5. Trascinare dentro la finestra del Terminale la cartella in cui si vede manage.py.</w:t>
+      </w:r>
+    </w:p>
+    <w:p>
+      <w:pPr>
+        <w:ind w:left="340" w:hanging="198"/>
+      </w:pPr>
+      <w:r>
+        <w:t>6. Premere Invio.</w:t>
+      </w:r>
+    </w:p>
+    <w:p>
+      <w:pPr>
+        <w:ind w:left="340" w:hanging="198"/>
+      </w:pPr>
+      <w:r>
+        <w:t>7. Controllare la cartella con questi comandi:</w:t>
+      </w:r>
+    </w:p>
+    <w:p>
+      <w:pPr>
+        <w:pStyle w:val="CodeBlock"/>
+        <w:shd w:fill="F7F5F1"/>
+        <w:ind w:left="142" w:right="142"/>
+      </w:pPr>
+      <w:r>
+        <w:t>ls manage.py</w:t>
+        <w:br/>
+        <w:t>ls requirements.txt</w:t>
+        <w:br/>
+        <w:t>ls database/generated/progetto2_db.backup</w:t>
+      </w:r>
+    </w:p>
+    <w:p>
+      <w:pPr>
+        <w:pStyle w:val="SmallNote"/>
+      </w:pPr>
+      <w:r>
+        <w:rPr>
+          <w:b/>
+        </w:rPr>
+        <w:t xml:space="preserve">Se compare errore: </w:t>
+      </w:r>
+      <w:r>
+        <w:t>se un comando dice No such file or directory, il Terminale non è nella cartella corretta. Ripetere il punto 4.2 trascinando la cartella che contiene manage.py.</w:t>
+      </w:r>
+    </w:p>
+    <w:p>
+      <w:pPr>
+        <w:pStyle w:val="Heading2"/>
+      </w:pPr>
+      <w:r>
+        <w:t>4.3 Controllare Python</w:t>
+      </w:r>
+    </w:p>
+    <w:p>
+      <w:pPr>
+        <w:pStyle w:val="CodeBlock"/>
+        <w:shd w:fill="F7F5F1"/>
+        <w:ind w:left="142" w:right="142"/>
+      </w:pPr>
+      <w:r>
+        <w:t>python3.12 --version</w:t>
+      </w:r>
+    </w:p>
+    <w:p>
+      <w:pPr>
+        <w:ind w:left="340" w:hanging="198"/>
+      </w:pPr>
+      <w:r>
+        <w:t>Risultato corretto: Python 3.12.x</w:t>
+      </w:r>
+    </w:p>
+    <w:p>
+      <w:pPr>
+        <w:pStyle w:val="SmallNote"/>
+      </w:pPr>
+      <w:r>
+        <w:rPr>
+          <w:b/>
+        </w:rPr>
+        <w:t xml:space="preserve">Se compare errore: </w:t>
+      </w:r>
+      <w:r>
+        <w:t>se python3.12 non viene trovato, provare a controllare python3:</w:t>
+      </w:r>
+    </w:p>
+    <w:p>
+      <w:pPr>
+        <w:pStyle w:val="CodeBlock"/>
+        <w:shd w:fill="F7F5F1"/>
+        <w:ind w:left="142" w:right="142"/>
+      </w:pPr>
+      <w:r>
+        <w:t>python3 --version</w:t>
+      </w:r>
+    </w:p>
+    <w:p>
+      <w:pPr>
+        <w:pStyle w:val="SmallNote"/>
+      </w:pPr>
+      <w:r>
+        <w:rPr>
+          <w:b/>
+        </w:rPr>
+        <w:t xml:space="preserve">Se compare errore: </w:t>
+      </w:r>
+      <w:r>
+        <w:t>se Python 3.12 non è disponibile e Homebrew è presente, installare Python 3.12 con:</w:t>
+      </w:r>
+    </w:p>
+    <w:p>
+      <w:pPr>
+        <w:pStyle w:val="CodeBlock"/>
+        <w:shd w:fill="F7F5F1"/>
+        <w:ind w:left="142" w:right="142"/>
+      </w:pPr>
+      <w:r>
+        <w:t>brew install python@3.12</w:t>
+      </w:r>
+    </w:p>
+    <w:p>
+      <w:pPr>
+        <w:pStyle w:val="Heading2"/>
+      </w:pPr>
+      <w:r>
+        <w:t>4.4 Controllare PostgreSQL</w:t>
+      </w:r>
+    </w:p>
+    <w:p>
+      <w:pPr>
+        <w:pStyle w:val="CodeBlock"/>
+        <w:shd w:fill="F7F5F1"/>
+        <w:ind w:left="142" w:right="142"/>
+      </w:pPr>
+      <w:r>
+        <w:t>psql --version</w:t>
+        <w:br/>
+        <w:t>pg_restore --version</w:t>
+      </w:r>
+    </w:p>
+    <w:p>
+      <w:pPr>
+        <w:ind w:left="340" w:hanging="198"/>
+      </w:pPr>
+      <w:r>
+        <w:t>Risultato corretto: entrambi i comandi mostrano una versione di PostgreSQL.</w:t>
+      </w:r>
+    </w:p>
+    <w:p>
+      <w:pPr>
+        <w:pStyle w:val="SmallNote"/>
+      </w:pPr>
+      <w:r>
+        <w:rPr>
+          <w:b/>
+        </w:rPr>
+        <w:t xml:space="preserve">Se compare errore: </w:t>
+      </w:r>
+      <w:r>
+        <w:t>se psql o pg_restore non vengono trovati, provare prima questo comando:</w:t>
+      </w:r>
+    </w:p>
+    <w:p>
+      <w:pPr>
+        <w:pStyle w:val="CodeBlock"/>
+        <w:shd w:fill="F7F5F1"/>
+        <w:ind w:left="142" w:right="142"/>
+      </w:pPr>
+      <w:r>
+        <w:t>export PATH="/opt/homebrew/opt/postgresql@16/bin:$PATH"</w:t>
+        <w:br/>
+        <w:t>psql --version</w:t>
+        <w:br/>
+        <w:t>pg_restore --version</w:t>
+      </w:r>
+    </w:p>
+    <w:p>
+      <w:pPr>
+        <w:pStyle w:val="SmallNote"/>
+      </w:pPr>
+      <w:r>
+        <w:rPr>
+          <w:b/>
+        </w:rPr>
+        <w:t xml:space="preserve">Se compare errore: </w:t>
+      </w:r>
+      <w:r>
+        <w:t>se ancora non funziona, provare questo comando:</w:t>
+      </w:r>
+    </w:p>
+    <w:p>
+      <w:pPr>
+        <w:pStyle w:val="CodeBlock"/>
+        <w:shd w:fill="F7F5F1"/>
+        <w:ind w:left="142" w:right="142"/>
+      </w:pPr>
+      <w:r>
+        <w:t>export PATH="/usr/local/opt/postgresql@16/bin:$PATH"</w:t>
+        <w:br/>
+        <w:t>psql --version</w:t>
+        <w:br/>
+        <w:t>pg_restore --version</w:t>
+      </w:r>
+    </w:p>
+    <w:p>
+      <w:pPr>
+        <w:pStyle w:val="SmallNote"/>
+      </w:pPr>
+      <w:r>
+        <w:rPr>
+          <w:b/>
+        </w:rPr>
+        <w:t xml:space="preserve">Se compare errore: </w:t>
+      </w:r>
+      <w:r>
+        <w:t>se PostgreSQL non è disponibile e Homebrew è presente, installare PostgreSQL con:</w:t>
+      </w:r>
+    </w:p>
+    <w:p>
+      <w:pPr>
+        <w:pStyle w:val="CodeBlock"/>
+        <w:shd w:fill="F7F5F1"/>
+        <w:ind w:left="142" w:right="142"/>
+      </w:pPr>
+      <w:r>
+        <w:t>brew install postgresql@16</w:t>
+      </w:r>
+    </w:p>
+    <w:p>
+      <w:pPr>
+        <w:pStyle w:val="Heading2"/>
+      </w:pPr>
+      <w:r>
+        <w:t>4.5 Rendere eseguibili gli script</w:t>
+      </w:r>
+    </w:p>
+    <w:p>
+      <w:pPr>
+        <w:pStyle w:val="CodeBlock"/>
+        <w:shd w:fill="F7F5F1"/>
+        <w:ind w:left="142" w:right="142"/>
+      </w:pPr>
+      <w:r>
+        <w:t>chmod +x scripts/install_macos.sh scripts/start_macos.sh</w:t>
+      </w:r>
+    </w:p>
+    <w:p>
+      <w:pPr>
+        <w:pStyle w:val="Heading2"/>
+      </w:pPr>
+      <w:r>
+        <w:t>4.6 Avviare l'installazione</w:t>
+      </w:r>
+    </w:p>
+    <w:p>
+      <w:pPr>
+        <w:pStyle w:val="CodeBlock"/>
+        <w:shd w:fill="F7F5F1"/>
+        <w:ind w:left="142" w:right="142"/>
+      </w:pPr>
+      <w:r>
+        <w:t>./scripts/install_macos.sh</w:t>
+      </w:r>
+    </w:p>
+    <w:p>
+      <w:pPr>
+        <w:ind w:left="340" w:hanging="198"/>
+      </w:pPr>
+      <w:r>
+        <w:t>Durante l'installazione lasciare i valori proposti premendo Invio, quando non serve cambiarli.</w:t>
+      </w:r>
+    </w:p>
+    <w:p>
+      <w:pPr>
+        <w:ind w:left="340" w:hanging="198"/>
+      </w:pPr>
+      <w:r>
+        <w:t>Alla richiesta Password utente applicativo PostgreSQL, scegliere una password locale. Annotarla.</w:t>
+      </w:r>
+    </w:p>
+    <w:p>
+      <w:pPr>
+        <w:ind w:left="340" w:hanging="198"/>
+      </w:pPr>
+      <w:r>
+        <w:t>Alla richiesta Utente amministratore PostgreSQL, usare postgres se non è stato scelto un altro nome.</w:t>
+      </w:r>
+    </w:p>
+    <w:p>
+      <w:pPr>
+        <w:ind w:left="340" w:hanging="198"/>
+      </w:pPr>
+      <w:r>
+        <w:t>Alla richiesta Password utente amministratore PostgreSQL, scrivere la password dell'installazione PostgreSQL presente nel computer.</w:t>
+      </w:r>
+    </w:p>
+    <w:p>
+      <w:pPr>
+        <w:ind w:left="340" w:hanging="198"/>
+      </w:pPr>
+      <w:r>
+        <w:t>Quando compare la richiesta di conferma, scrivere SI e premere Invio.</w:t>
+      </w:r>
+    </w:p>
+    <w:p>
+      <w:pPr>
+        <w:pStyle w:val="SmallNote"/>
+      </w:pPr>
+      <w:r>
+        <w:rPr>
+          <w:b/>
+        </w:rPr>
+        <w:t xml:space="preserve">Se compare errore: </w:t>
+      </w:r>
+      <w:r>
+        <w:t>se compare Backup non trovato, copiare progetto2_db.backup nella cartella database/generated e ripetere ./scripts/install_macos.sh.</w:t>
+      </w:r>
+    </w:p>
+    <w:p>
+      <w:pPr>
+        <w:pStyle w:val="SmallNote"/>
+      </w:pPr>
+      <w:r>
+        <w:rPr>
+          <w:b/>
+        </w:rPr>
+        <w:t xml:space="preserve">Se compare errore: </w:t>
+      </w:r>
+      <w:r>
+        <w:t>se compare autenticazione fallita, ripetere il comando e inserire la password corretta dell'utente amministratore PostgreSQL.</w:t>
+      </w:r>
+    </w:p>
+    <w:p>
+      <w:pPr>
+        <w:pStyle w:val="Heading2"/>
+      </w:pPr>
+      <w:r>
+        <w:t>4.7 Avviare il sito</w:t>
+      </w:r>
+    </w:p>
+    <w:p>
+      <w:pPr>
+        <w:pStyle w:val="CodeBlock"/>
+        <w:shd w:fill="F7F5F1"/>
+        <w:ind w:left="142" w:right="142"/>
+      </w:pPr>
+      <w:r>
+        <w:t>./scripts/start_macos.sh</w:t>
+      </w:r>
+    </w:p>
+    <w:p>
+      <w:pPr>
+        <w:ind w:left="340" w:hanging="198"/>
+      </w:pPr>
+      <w:r>
+        <w:t>Aprire il browser.</w:t>
+      </w:r>
+    </w:p>
+    <w:p>
+      <w:pPr>
+        <w:ind w:left="340" w:hanging="198"/>
+      </w:pPr>
+      <w:r>
+        <w:t>Scrivere questo indirizzo nella barra degli indirizzi:</w:t>
+      </w:r>
+    </w:p>
+    <w:p>
+      <w:pPr>
+        <w:pStyle w:val="CodeBlock"/>
+        <w:shd w:fill="F7F5F1"/>
+        <w:ind w:left="142" w:right="142"/>
+      </w:pPr>
+      <w:r>
+        <w:t>http://127.0.0.1:8000/</w:t>
+      </w:r>
+    </w:p>
+    <w:p>
+      <w:pPr>
+        <w:pStyle w:val="SmallNote"/>
+      </w:pPr>
+      <w:r>
+        <w:rPr>
+          <w:b/>
+        </w:rPr>
+        <w:t xml:space="preserve">Se compare errore: </w:t>
+      </w:r>
+      <w:r>
+        <w:t>se compare Porta 8000 già in uso, avviare il sito su un'altra porta:</w:t>
+      </w:r>
+    </w:p>
+    <w:p>
+      <w:pPr>
+        <w:pStyle w:val="CodeBlock"/>
+        <w:shd w:fill="F7F5F1"/>
+        <w:ind w:left="142" w:right="142"/>
+      </w:pPr>
+      <w:r>
+        <w:t>.venv/bin/python manage.py runserver 8001</w:t>
+      </w:r>
+    </w:p>
+    <w:p>
+      <w:pPr>
+        <w:ind w:left="340" w:hanging="198"/>
+      </w:pPr>
+      <w:r>
+        <w:t>In questo caso aprire http://127.0.0.1:8001/.</w:t>
+      </w:r>
+    </w:p>
+    <w:p>
+      <w:pPr>
+        <w:ind w:left="340" w:hanging="198"/>
+      </w:pPr>
+      <w:r>
+        <w:t>Per fermare il sito, tornare nel Terminale e premere CTRL + C.</w:t>
+      </w:r>
+    </w:p>
+    <w:p>
+      <w:pPr>
+        <w:pStyle w:val="Heading1"/>
+      </w:pPr>
+      <w:r>
+        <w:t>5. Controllo finale</w:t>
+      </w:r>
+    </w:p>
+    <w:p>
+      <w:pPr>
+        <w:ind w:left="340" w:hanging="198"/>
+      </w:pPr>
+      <w:r>
+        <w:t>1. Aprire la pagina Panoramica.</w:t>
+      </w:r>
+    </w:p>
+    <w:p>
+      <w:pPr>
+        <w:ind w:left="340" w:hanging="198"/>
+      </w:pPr>
+      <w:r>
+        <w:t>2. Aprire Numeri telefonici.</w:t>
+      </w:r>
+    </w:p>
+    <w:p>
+      <w:pPr>
+        <w:ind w:left="340" w:hanging="198"/>
+      </w:pPr>
+      <w:r>
+        <w:t>3. Aprire Chiamate.</w:t>
+      </w:r>
+    </w:p>
+    <w:p>
+      <w:pPr>
+        <w:ind w:left="340" w:hanging="198"/>
+      </w:pPr>
+      <w:r>
+        <w:t>4. Aprire SIM.</w:t>
+      </w:r>
+    </w:p>
+    <w:p>
+      <w:pPr>
+        <w:ind w:left="340" w:hanging="198"/>
+      </w:pPr>
+      <w:r>
+        <w:t>5. Usare una ricerca o un filtro.</w:t>
+      </w:r>
+    </w:p>
+    <w:p>
+      <w:pPr>
+        <w:ind w:left="340" w:hanging="198"/>
+      </w:pPr>
+      <w:r>
+        <w:t>6. Verificare che compaiano dati nelle pagine.</w:t>
+      </w:r>
+    </w:p>
+    <w:p>
+      <w:pPr>
+        <w:ind w:left="340" w:hanging="198"/>
+      </w:pPr>
+      <w:r>
+        <w:t>7. Provare Esporta in Excel in almeno una pagina.</w:t>
+      </w:r>
+    </w:p>
+    <w:p>
+      <w:pPr>
+        <w:pStyle w:val="SmallNote"/>
+      </w:pPr>
+      <w:r>
+        <w:rPr>
+          <w:b/>
+        </w:rPr>
+        <w:t xml:space="preserve">Se compare errore: </w:t>
+      </w:r>
+      <w:r>
+        <w:t>se le pagine sono vuote, controllare il database con questo comando:</w:t>
+      </w:r>
+    </w:p>
+    <w:p>
+      <w:pPr>
+        <w:pStyle w:val="CodeBlock"/>
+        <w:shd w:fill="F7F5F1"/>
+        <w:ind w:left="142" w:right="142"/>
+      </w:pPr>
+      <w:r>
+        <w:t>python manage.py verify_import</w:t>
+      </w:r>
+    </w:p>
+    <w:p>
+      <w:pPr>
+        <w:ind w:left="340" w:hanging="198"/>
+      </w:pPr>
+      <w:r>
+        <w:t>Risultato corretto: Verifica completata: database coerente.</w:t>
+      </w:r>
+    </w:p>
+    <w:p>
+      <w:pPr>
+        <w:pStyle w:val="Heading1"/>
+      </w:pPr>
+      <w:r>
+        <w:t>6. Uso rapido dell'applicazione</w:t>
       </w:r>
     </w:p>
     <w:tbl>
@@ -53,53 +1437,47 @@
         <w:tblW w:type="auto" w:w="0"/>
         <w:jc w:val="center"/>
         <w:tblLook w:firstColumn="1" w:firstRow="1" w:lastColumn="0" w:lastRow="0" w:noHBand="0" w:noVBand="1" w:val="04A0"/>
-        <w:tblBorders>
-          <w:top w:val="single" w:sz="4" w:space="0" w:color="B8AEA6"/>
-          <w:left w:val="single" w:sz="4" w:space="0" w:color="B8AEA6"/>
-          <w:bottom w:val="single" w:sz="4" w:space="0" w:color="B8AEA6"/>
-          <w:right w:val="single" w:sz="4" w:space="0" w:color="B8AEA6"/>
-          <w:insideH w:val="single" w:sz="4" w:space="0" w:color="B8AEA6"/>
-          <w:insideV w:val="single" w:sz="4" w:space="0" w:color="B8AEA6"/>
-        </w:tblBorders>
       </w:tblPr>
       <w:tblGrid>
-        <w:gridCol w:w="5270"/>
-        <w:gridCol w:w="5270"/>
+        <w:gridCol w:w="5156"/>
+        <w:gridCol w:w="5156"/>
       </w:tblGrid>
       <w:tr>
         <w:tc>
           <w:tcPr>
-            <w:tcW w:type="dxa" w:w="5270"/>
-            <w:vAlign w:val="center"/>
-            <w:shd w:fill="8A7A70"/>
+            <w:tcW w:type="dxa" w:w="5156"/>
+            <w:shd w:fill="9E9187"/>
+            <w:vAlign w:val="top"/>
           </w:tcPr>
           <w:p>
+            <w:pPr>
+              <w:spacing w:after="0"/>
+            </w:pPr>
             <w:r/>
             <w:r>
               <w:rPr>
                 <w:b/>
-                <w:color w:val="FFFFFF"/>
-                <w:sz w:val="18"/>
               </w:rPr>
-              <w:t>Elemento</w:t>
+              <w:t>Pagina</w:t>
             </w:r>
           </w:p>
         </w:tc>
         <w:tc>
           <w:tcPr>
-            <w:tcW w:type="dxa" w:w="5270"/>
-            <w:vAlign w:val="center"/>
-            <w:shd w:fill="8A7A70"/>
+            <w:tcW w:type="dxa" w:w="5156"/>
+            <w:shd w:fill="9E9187"/>
+            <w:vAlign w:val="top"/>
           </w:tcPr>
           <w:p>
+            <w:pPr>
+              <w:spacing w:after="0"/>
+            </w:pPr>
             <w:r/>
             <w:r>
               <w:rPr>
-                <w:b/>
-                <w:color w:val="FFFFFF"/>
-                <w:sz w:val="18"/>
+                <w:b w:val="0"/>
               </w:rPr>
-              <w:t>Funzione</w:t>
+              <w:t>Uso</w:t>
             </w:r>
           </w:p>
         </w:tc>
@@ -107,33 +1485,37 @@
       <w:tr>
         <w:tc>
           <w:tcPr>
-            <w:tcW w:type="dxa" w:w="5270"/>
-            <w:vAlign w:val="center"/>
+            <w:tcW w:type="dxa" w:w="5156"/>
+            <w:vAlign w:val="top"/>
           </w:tcPr>
           <w:p>
+            <w:pPr>
+              <w:spacing w:after="0"/>
+            </w:pPr>
             <w:r/>
             <w:r>
               <w:rPr>
                 <w:b/>
-                <w:sz w:val="17"/>
               </w:rPr>
-              <w:t>Applicazione Django</w:t>
+              <w:t>Panoramica</w:t>
             </w:r>
           </w:p>
         </w:tc>
         <w:tc>
           <w:tcPr>
-            <w:tcW w:type="dxa" w:w="5270"/>
-            <w:vAlign w:val="center"/>
+            <w:tcW w:type="dxa" w:w="5156"/>
+            <w:vAlign w:val="top"/>
           </w:tcPr>
           <w:p>
+            <w:pPr>
+              <w:spacing w:after="0"/>
+            </w:pPr>
             <w:r/>
             <w:r>
               <w:rPr>
                 <w:b w:val="0"/>
-                <w:sz w:val="17"/>
               </w:rPr>
-              <w:t>Mostra numeri telefonici, SIM, chiamate, filtri, schede, tabelle ed esportazioni.</w:t>
+              <w:t>Leggere statistiche generali, usare la ricerca rapida e aprire ricerche frequenti.</w:t>
             </w:r>
           </w:p>
         </w:tc>
@@ -141,33 +1523,37 @@
       <w:tr>
         <w:tc>
           <w:tcPr>
-            <w:tcW w:type="dxa" w:w="5270"/>
-            <w:vAlign w:val="center"/>
+            <w:tcW w:type="dxa" w:w="5156"/>
+            <w:vAlign w:val="top"/>
           </w:tcPr>
           <w:p>
+            <w:pPr>
+              <w:spacing w:after="0"/>
+            </w:pPr>
             <w:r/>
             <w:r>
               <w:rPr>
                 <w:b/>
-                <w:sz w:val="17"/>
               </w:rPr>
-              <w:t>Ambiente .venv</w:t>
+              <w:t>Numeri telefonici</w:t>
             </w:r>
           </w:p>
         </w:tc>
         <w:tc>
           <w:tcPr>
-            <w:tcW w:type="dxa" w:w="5270"/>
-            <w:vAlign w:val="center"/>
+            <w:tcW w:type="dxa" w:w="5156"/>
+            <w:vAlign w:val="top"/>
           </w:tcPr>
           <w:p>
+            <w:pPr>
+              <w:spacing w:after="0"/>
+            </w:pPr>
             <w:r/>
             <w:r>
               <w:rPr>
                 <w:b w:val="0"/>
-                <w:sz w:val="17"/>
               </w:rPr>
-              <w:t>Contiene le librerie Python del progetto senza modificare il sistema.</w:t>
+              <w:t>Cercare numeri, filtrare per stato, piano, disponibilità, chiamate e durata minima.</w:t>
             </w:r>
           </w:p>
         </w:tc>
@@ -175,33 +1561,37 @@
       <w:tr>
         <w:tc>
           <w:tcPr>
-            <w:tcW w:type="dxa" w:w="5270"/>
-            <w:vAlign w:val="center"/>
+            <w:tcW w:type="dxa" w:w="5156"/>
+            <w:vAlign w:val="top"/>
           </w:tcPr>
           <w:p>
+            <w:pPr>
+              <w:spacing w:after="0"/>
+            </w:pPr>
             <w:r/>
             <w:r>
               <w:rPr>
                 <w:b/>
-                <w:sz w:val="17"/>
               </w:rPr>
-              <w:t>Database PostgreSQL locale</w:t>
+              <w:t>Chiamate</w:t>
             </w:r>
           </w:p>
         </w:tc>
         <w:tc>
           <w:tcPr>
-            <w:tcW w:type="dxa" w:w="5270"/>
-            <w:vAlign w:val="center"/>
+            <w:tcW w:type="dxa" w:w="5156"/>
+            <w:vAlign w:val="top"/>
           </w:tcPr>
           <w:p>
+            <w:pPr>
+              <w:spacing w:after="0"/>
+            </w:pPr>
             <w:r/>
             <w:r>
               <w:rPr>
                 <w:b w:val="0"/>
-                <w:sz w:val="17"/>
               </w:rPr>
-              <w:t>Contiene i dati dimostrativi e le statistiche usate dall'applicazione.</w:t>
+              <w:t>Filtrare chiamate per numero, data, ora, durata, piano e addebito. Aprire schede estese.</w:t>
             </w:r>
           </w:p>
         </w:tc>
@@ -209,935 +1599,17 @@
       <w:tr>
         <w:tc>
           <w:tcPr>
-            <w:tcW w:type="dxa" w:w="5270"/>
-            <w:vAlign w:val="center"/>
+            <w:tcW w:type="dxa" w:w="5156"/>
+            <w:vAlign w:val="top"/>
           </w:tcPr>
           <w:p>
+            <w:pPr>
+              <w:spacing w:after="0"/>
+            </w:pPr>
             <w:r/>
             <w:r>
               <w:rPr>
                 <w:b/>
-                <w:sz w:val="17"/>
-              </w:rPr>
-              <w:t>Backup progetto2_db.backup</w:t>
-            </w:r>
-          </w:p>
-        </w:tc>
-        <w:tc>
-          <w:tcPr>
-            <w:tcW w:type="dxa" w:w="5270"/>
-            <w:vAlign w:val="center"/>
-          </w:tcPr>
-          <w:p>
-            <w:r/>
-            <w:r>
-              <w:rPr>
-                <w:b w:val="0"/>
-                <w:sz w:val="17"/>
-              </w:rPr>
-              <w:t>Carica il database in modo rapido. Il ripristino richiede meno di un minuto nei test.</w:t>
-            </w:r>
-          </w:p>
-        </w:tc>
-      </w:tr>
-    </w:tbl>
-    <w:p>
-      <w:pPr>
-        <w:pStyle w:val="Heading1"/>
-      </w:pPr>
-      <w:r>
-        <w:t>2. Prima di iniziare</w:t>
-      </w:r>
-    </w:p>
-    <w:p>
-      <w:pPr>
-        <w:pStyle w:val="ManualBullet"/>
-      </w:pPr>
-      <w:r>
-        <w:t>Estrarre lo ZIP del progetto in una cartella locale, per esempio Desktop o Documenti.</w:t>
-      </w:r>
-    </w:p>
-    <w:p>
-      <w:pPr>
-        <w:pStyle w:val="ManualBullet"/>
-      </w:pPr>
-      <w:r>
-        <w:t>Non rinominare le cartelle interne del progetto.</w:t>
-      </w:r>
-    </w:p>
-    <w:p>
-      <w:pPr>
-        <w:pStyle w:val="ManualBullet"/>
-      </w:pPr>
-      <w:r>
-        <w:t>Controllare che esista il file database/generated/progetto2_db.backup.</w:t>
-      </w:r>
-    </w:p>
-    <w:p>
-      <w:pPr>
-        <w:pStyle w:val="ManualBullet"/>
-      </w:pPr>
-      <w:r>
-        <w:t>Usare la macchina predisposta dal corso. Python 3.12 e PostgreSQL sono già previsti sulla macchina ospite.</w:t>
-      </w:r>
-    </w:p>
-    <w:p>
-      <w:pPr>
-        <w:pStyle w:val="ManualBullet"/>
-      </w:pPr>
-      <w:r>
-        <w:t>Non installare software aggiuntivo se i controlli iniziali sono corretti.</w:t>
-      </w:r>
-    </w:p>
-    <w:p>
-      <w:pPr>
-        <w:pStyle w:val="Heading1"/>
-      </w:pPr>
-      <w:r>
-        <w:t>3. Controllare Python e PostgreSQL</w:t>
-      </w:r>
-    </w:p>
-    <w:p>
-      <w:pPr>
-        <w:pStyle w:val="ManualStep"/>
-      </w:pPr>
-      <w:r>
-        <w:rPr>
-          <w:b/>
-        </w:rPr>
-        <w:t xml:space="preserve">1. </w:t>
-      </w:r>
-      <w:r>
-        <w:t>Aprire PowerShell su Windows o Terminale su macOS.</w:t>
-      </w:r>
-    </w:p>
-    <w:p>
-      <w:pPr>
-        <w:pStyle w:val="ManualStep"/>
-      </w:pPr>
-      <w:r>
-        <w:rPr>
-          <w:b/>
-        </w:rPr>
-        <w:t xml:space="preserve">2. </w:t>
-      </w:r>
-      <w:r>
-        <w:t>Eseguire i controlli della piattaforma usata.</w:t>
-      </w:r>
-    </w:p>
-    <w:p>
-      <w:pPr>
-        <w:pStyle w:val="Heading2"/>
-      </w:pPr>
-      <w:r>
-        <w:t>Windows</w:t>
-      </w:r>
-    </w:p>
-    <w:p>
-      <w:pPr>
-        <w:spacing w:after="60"/>
-        <w:ind w:left="227"/>
-      </w:pPr>
-      <w:r>
-        <w:rPr>
-          <w:rFonts w:ascii="Consolas" w:hAnsi="Consolas" w:eastAsia="Consolas"/>
-          <w:sz w:val="17"/>
-        </w:rPr>
-        <w:t>python --version</w:t>
-      </w:r>
-    </w:p>
-    <w:p>
-      <w:pPr>
-        <w:spacing w:after="60"/>
-        <w:ind w:left="227"/>
-      </w:pPr>
-      <w:r>
-        <w:rPr>
-          <w:rFonts w:ascii="Consolas" w:hAnsi="Consolas" w:eastAsia="Consolas"/>
-          <w:sz w:val="17"/>
-        </w:rPr>
-        <w:t>psql --version</w:t>
-      </w:r>
-    </w:p>
-    <w:p>
-      <w:pPr>
-        <w:spacing w:after="60"/>
-        <w:ind w:left="227"/>
-      </w:pPr>
-      <w:r>
-        <w:rPr>
-          <w:rFonts w:ascii="Consolas" w:hAnsi="Consolas" w:eastAsia="Consolas"/>
-          <w:sz w:val="17"/>
-        </w:rPr>
-        <w:t>pg_restore --version</w:t>
-      </w:r>
-    </w:p>
-    <w:p>
-      <w:pPr>
-        <w:pStyle w:val="ManualNote"/>
-      </w:pPr>
-      <w:r>
-        <w:rPr>
-          <w:b/>
-        </w:rPr>
-        <w:t xml:space="preserve">Se compare errore: </w:t>
-      </w:r>
-      <w:r>
-        <w:t>se python non indica 3.12, provare py -3.12 --version. Se Python 3.12 manca, installarlo solo su macchina non predisposta con: winget install -e --id Python.Python.3.12</w:t>
-      </w:r>
-    </w:p>
-    <w:p>
-      <w:pPr>
-        <w:pStyle w:val="ManualNote"/>
-      </w:pPr>
-      <w:r>
-        <w:rPr>
-          <w:b/>
-        </w:rPr>
-        <w:t xml:space="preserve">Se compare errore: </w:t>
-      </w:r>
-      <w:r>
-        <w:t>se psql o pg_restore non sono riconosciuti, aggiungere PostgreSQL al PATH e riprovare: $env:Path += ";C:\Program Files\PostgreSQL\16\bin"</w:t>
-      </w:r>
-    </w:p>
-    <w:p>
-      <w:pPr>
-        <w:pStyle w:val="ManualNote"/>
-      </w:pPr>
-      <w:r>
-        <w:rPr>
-          <w:b/>
-        </w:rPr>
-        <w:t xml:space="preserve">Se compare errore: </w:t>
-      </w:r>
-      <w:r>
-        <w:t>se PostgreSQL manca su macchina personale, installare PostgreSQL 16 prima di continuare. Sulla macchina del corso questa installazione non dovrebbe servire.</w:t>
-      </w:r>
-    </w:p>
-    <w:p>
-      <w:pPr>
-        <w:pStyle w:val="Heading2"/>
-      </w:pPr>
-      <w:r>
-        <w:t>macOS</w:t>
-      </w:r>
-    </w:p>
-    <w:p>
-      <w:pPr>
-        <w:spacing w:after="60"/>
-        <w:ind w:left="227"/>
-      </w:pPr>
-      <w:r>
-        <w:rPr>
-          <w:rFonts w:ascii="Consolas" w:hAnsi="Consolas" w:eastAsia="Consolas"/>
-          <w:sz w:val="17"/>
-        </w:rPr>
-        <w:t>python3.12 --version</w:t>
-      </w:r>
-    </w:p>
-    <w:p>
-      <w:pPr>
-        <w:spacing w:after="60"/>
-        <w:ind w:left="227"/>
-      </w:pPr>
-      <w:r>
-        <w:rPr>
-          <w:rFonts w:ascii="Consolas" w:hAnsi="Consolas" w:eastAsia="Consolas"/>
-          <w:sz w:val="17"/>
-        </w:rPr>
-        <w:t>psql --version</w:t>
-      </w:r>
-    </w:p>
-    <w:p>
-      <w:pPr>
-        <w:spacing w:after="60"/>
-        <w:ind w:left="227"/>
-      </w:pPr>
-      <w:r>
-        <w:rPr>
-          <w:rFonts w:ascii="Consolas" w:hAnsi="Consolas" w:eastAsia="Consolas"/>
-          <w:sz w:val="17"/>
-        </w:rPr>
-        <w:t>pg_restore --version</w:t>
-      </w:r>
-    </w:p>
-    <w:p>
-      <w:pPr>
-        <w:pStyle w:val="ManualNote"/>
-      </w:pPr>
-      <w:r>
-        <w:rPr>
-          <w:b/>
-        </w:rPr>
-        <w:t xml:space="preserve">Se compare errore: </w:t>
-      </w:r>
-      <w:r>
-        <w:t>se python3.12 manca su macchina personale e Homebrew è disponibile, eseguire: brew install python@3.12</w:t>
-      </w:r>
-    </w:p>
-    <w:p>
-      <w:pPr>
-        <w:pStyle w:val="ManualNote"/>
-      </w:pPr>
-      <w:r>
-        <w:rPr>
-          <w:b/>
-        </w:rPr>
-        <w:t xml:space="preserve">Se compare errore: </w:t>
-      </w:r>
-      <w:r>
-        <w:t>se psql o pg_restore mancano su macchina personale e Homebrew è disponibile, eseguire: brew install postgresql@16</w:t>
-      </w:r>
-    </w:p>
-    <w:p>
-      <w:pPr>
-        <w:pStyle w:val="Heading1"/>
-      </w:pPr>
-      <w:r>
-        <w:t>4. Installazione su Windows</w:t>
-      </w:r>
-    </w:p>
-    <w:p>
-      <w:pPr>
-        <w:pStyle w:val="ManualStep"/>
-      </w:pPr>
-      <w:r>
-        <w:rPr>
-          <w:b/>
-        </w:rPr>
-        <w:t xml:space="preserve">1. </w:t>
-      </w:r>
-      <w:r>
-        <w:t>Aprire la cartella del progetto in Esplora file.</w:t>
-      </w:r>
-    </w:p>
-    <w:p>
-      <w:pPr>
-        <w:pStyle w:val="ManualStep"/>
-      </w:pPr>
-      <w:r>
-        <w:rPr>
-          <w:b/>
-        </w:rPr>
-        <w:t xml:space="preserve">2. </w:t>
-      </w:r>
-      <w:r>
-        <w:t>Fare clic nella barra del percorso in alto.</w:t>
-      </w:r>
-    </w:p>
-    <w:p>
-      <w:pPr>
-        <w:pStyle w:val="ManualStep"/>
-      </w:pPr>
-      <w:r>
-        <w:rPr>
-          <w:b/>
-        </w:rPr>
-        <w:t xml:space="preserve">3. </w:t>
-      </w:r>
-      <w:r>
-        <w:t>Scrivere powershell e premere Invio.</w:t>
-      </w:r>
-    </w:p>
-    <w:p>
-      <w:pPr>
-        <w:pStyle w:val="ManualStep"/>
-      </w:pPr>
-      <w:r>
-        <w:rPr>
-          <w:b/>
-        </w:rPr>
-        <w:t xml:space="preserve">4. </w:t>
-      </w:r>
-      <w:r>
-        <w:t>Avviare l'installazione.</w:t>
-      </w:r>
-    </w:p>
-    <w:p>
-      <w:pPr>
-        <w:spacing w:after="60"/>
-        <w:ind w:left="227"/>
-      </w:pPr>
-      <w:r>
-        <w:rPr>
-          <w:rFonts w:ascii="Consolas" w:hAnsi="Consolas" w:eastAsia="Consolas"/>
-          <w:sz w:val="17"/>
-        </w:rPr>
-        <w:t>scripts\install_windows.bat</w:t>
-      </w:r>
-    </w:p>
-    <w:p>
-      <w:pPr>
-        <w:pStyle w:val="ManualNote"/>
-      </w:pPr>
-      <w:r>
-        <w:rPr>
-          <w:b/>
-        </w:rPr>
-        <w:t xml:space="preserve">Se compare errore: </w:t>
-      </w:r>
-      <w:r>
-        <w:t>se compare "backup mancante", copiare progetto2_db.backup nella cartella database/generated e rilanciare lo script.</w:t>
-      </w:r>
-    </w:p>
-    <w:p>
-      <w:pPr>
-        <w:pStyle w:val="ManualNote"/>
-      </w:pPr>
-      <w:r>
-        <w:rPr>
-          <w:b/>
-        </w:rPr>
-        <w:t xml:space="preserve">Se compare errore: </w:t>
-      </w:r>
-      <w:r>
-        <w:t>se la password PostgreSQL non è accettata, rilanciare lo script e inserire la password dell'utente amministratore PostgreSQL, di solito postgres.</w:t>
-      </w:r>
-    </w:p>
-    <w:p>
-      <w:pPr>
-        <w:pStyle w:val="ManualNote"/>
-      </w:pPr>
-      <w:r>
-        <w:rPr>
-          <w:b/>
-        </w:rPr>
-        <w:t xml:space="preserve">Se compare errore: </w:t>
-      </w:r>
-      <w:r>
-        <w:t>se PostgreSQL non risponde, aprire PowerShell come amministratore ed eseguire: Get-Service postgresql* ; Start-Service postgresql-x64-16</w:t>
-      </w:r>
-    </w:p>
-    <w:p>
-      <w:pPr>
-        <w:pStyle w:val="ManualStep"/>
-      </w:pPr>
-      <w:r>
-        <w:rPr>
-          <w:b/>
-        </w:rPr>
-        <w:t xml:space="preserve">5. </w:t>
-      </w:r>
-      <w:r>
-        <w:t>Quando lo script chiede una password per progetto2_user, scegliere una password locale e conservarla.</w:t>
-      </w:r>
-    </w:p>
-    <w:p>
-      <w:pPr>
-        <w:pStyle w:val="ManualStep"/>
-      </w:pPr>
-      <w:r>
-        <w:rPr>
-          <w:b/>
-        </w:rPr>
-        <w:t xml:space="preserve">6. </w:t>
-      </w:r>
-      <w:r>
-        <w:t>Quando lo script chiede l'utente amministratore PostgreSQL, scrivere postgres se non è stato indicato un altro utente.</w:t>
-      </w:r>
-    </w:p>
-    <w:p>
-      <w:pPr>
-        <w:pStyle w:val="ManualStep"/>
-      </w:pPr>
-      <w:r>
-        <w:rPr>
-          <w:b/>
-        </w:rPr>
-        <w:t xml:space="preserve">7. </w:t>
-      </w:r>
-      <w:r>
-        <w:t>Scrivere SI quando lo script chiede di ricreare il database locale.</w:t>
-      </w:r>
-    </w:p>
-    <w:p>
-      <w:pPr>
-        <w:pStyle w:val="ManualStep"/>
-      </w:pPr>
-      <w:r>
-        <w:rPr>
-          <w:b/>
-        </w:rPr>
-        <w:t xml:space="preserve">8. </w:t>
-      </w:r>
-      <w:r>
-        <w:t>Avviare l'applicazione.</w:t>
-      </w:r>
-    </w:p>
-    <w:p>
-      <w:pPr>
-        <w:spacing w:after="60"/>
-        <w:ind w:left="227"/>
-      </w:pPr>
-      <w:r>
-        <w:rPr>
-          <w:rFonts w:ascii="Consolas" w:hAnsi="Consolas" w:eastAsia="Consolas"/>
-          <w:sz w:val="17"/>
-        </w:rPr>
-        <w:t>scripts\start_windows.bat</w:t>
-      </w:r>
-    </w:p>
-    <w:p>
-      <w:pPr>
-        <w:pStyle w:val="ManualStep"/>
-      </w:pPr>
-      <w:r>
-        <w:rPr>
-          <w:b/>
-        </w:rPr>
-        <w:t xml:space="preserve">9. </w:t>
-      </w:r>
-      <w:r>
-        <w:t>Aprire il browser e scrivere questo indirizzo.</w:t>
-      </w:r>
-    </w:p>
-    <w:p>
-      <w:pPr>
-        <w:spacing w:after="60"/>
-        <w:ind w:left="227"/>
-      </w:pPr>
-      <w:r>
-        <w:rPr>
-          <w:rFonts w:ascii="Consolas" w:hAnsi="Consolas" w:eastAsia="Consolas"/>
-          <w:sz w:val="17"/>
-        </w:rPr>
-        <w:t>http://127.0.0.1:8000/</w:t>
-      </w:r>
-    </w:p>
-    <w:p>
-      <w:pPr>
-        <w:pStyle w:val="ManualNote"/>
-      </w:pPr>
-      <w:r>
-        <w:rPr>
-          <w:b/>
-        </w:rPr>
-        <w:t xml:space="preserve">Se compare errore: </w:t>
-      </w:r>
-      <w:r>
-        <w:t>se la porta 8000 è occupata, entrare nella cartella del progetto ed eseguire: python manage.py runserver 8001. Aprire poi http://127.0.0.1:8001/</w:t>
-      </w:r>
-    </w:p>
-    <w:p>
-      <w:pPr>
-        <w:pStyle w:val="Heading1"/>
-      </w:pPr>
-      <w:r>
-        <w:t>5. Installazione su macOS</w:t>
-      </w:r>
-    </w:p>
-    <w:p>
-      <w:pPr>
-        <w:pStyle w:val="ManualStep"/>
-      </w:pPr>
-      <w:r>
-        <w:rPr>
-          <w:b/>
-        </w:rPr>
-        <w:t xml:space="preserve">1. </w:t>
-      </w:r>
-      <w:r>
-        <w:t>Aprire Terminale.</w:t>
-      </w:r>
-    </w:p>
-    <w:p>
-      <w:pPr>
-        <w:pStyle w:val="ManualStep"/>
-      </w:pPr>
-      <w:r>
-        <w:rPr>
-          <w:b/>
-        </w:rPr>
-        <w:t xml:space="preserve">2. </w:t>
-      </w:r>
-      <w:r>
-        <w:t>Entrare nella cartella del progetto. Scrivere cd, aggiungere uno spazio, trascinare la cartella progetto2 nel Terminale e premere Invio.</w:t>
-      </w:r>
-    </w:p>
-    <w:p>
-      <w:pPr>
-        <w:pStyle w:val="ManualStep"/>
-      </w:pPr>
-      <w:r>
-        <w:rPr>
-          <w:b/>
-        </w:rPr>
-        <w:t xml:space="preserve">3. </w:t>
-      </w:r>
-      <w:r>
-        <w:t>Rendere eseguibili gli script.</w:t>
-      </w:r>
-    </w:p>
-    <w:p>
-      <w:pPr>
-        <w:spacing w:after="60"/>
-        <w:ind w:left="227"/>
-      </w:pPr>
-      <w:r>
-        <w:rPr>
-          <w:rFonts w:ascii="Consolas" w:hAnsi="Consolas" w:eastAsia="Consolas"/>
-          <w:sz w:val="17"/>
-        </w:rPr>
-        <w:t>chmod +x scripts/install_macos.sh scripts/start_macos.sh</w:t>
-      </w:r>
-    </w:p>
-    <w:p>
-      <w:pPr>
-        <w:pStyle w:val="ManualNote"/>
-      </w:pPr>
-      <w:r>
-        <w:rPr>
-          <w:b/>
-        </w:rPr>
-        <w:t xml:space="preserve">Se compare errore: </w:t>
-      </w:r>
-      <w:r>
-        <w:t>se compare "permission denied" durante l'avvio dello script, ripetere il comando chmod.</w:t>
-      </w:r>
-    </w:p>
-    <w:p>
-      <w:pPr>
-        <w:pStyle w:val="ManualStep"/>
-      </w:pPr>
-      <w:r>
-        <w:rPr>
-          <w:b/>
-        </w:rPr>
-        <w:t xml:space="preserve">4. </w:t>
-      </w:r>
-      <w:r>
-        <w:t>Avviare l'installazione.</w:t>
-      </w:r>
-    </w:p>
-    <w:p>
-      <w:pPr>
-        <w:spacing w:after="60"/>
-        <w:ind w:left="227"/>
-      </w:pPr>
-      <w:r>
-        <w:rPr>
-          <w:rFonts w:ascii="Consolas" w:hAnsi="Consolas" w:eastAsia="Consolas"/>
-          <w:sz w:val="17"/>
-        </w:rPr>
-        <w:t>./scripts/install_macos.sh</w:t>
-      </w:r>
-    </w:p>
-    <w:p>
-      <w:pPr>
-        <w:pStyle w:val="ManualNote"/>
-      </w:pPr>
-      <w:r>
-        <w:rPr>
-          <w:b/>
-        </w:rPr>
-        <w:t xml:space="preserve">Se compare errore: </w:t>
-      </w:r>
-      <w:r>
-        <w:t>se compare "backup mancante", copiare progetto2_db.backup nella cartella database/generated e rilanciare lo script.</w:t>
-      </w:r>
-    </w:p>
-    <w:p>
-      <w:pPr>
-        <w:pStyle w:val="ManualNote"/>
-      </w:pPr>
-      <w:r>
-        <w:rPr>
-          <w:b/>
-        </w:rPr>
-        <w:t xml:space="preserve">Se compare errore: </w:t>
-      </w:r>
-      <w:r>
-        <w:t>se la password PostgreSQL non è accettata, rilanciare lo script e inserire la password dell'utente amministratore PostgreSQL.</w:t>
-      </w:r>
-    </w:p>
-    <w:p>
-      <w:pPr>
-        <w:pStyle w:val="ManualNote"/>
-      </w:pPr>
-      <w:r>
-        <w:rPr>
-          <w:b/>
-        </w:rPr>
-        <w:t xml:space="preserve">Se compare errore: </w:t>
-      </w:r>
-      <w:r>
-        <w:t>se PostgreSQL non risponde e PostgreSQL è gestito da Homebrew, eseguire: brew services start postgresql@16</w:t>
-      </w:r>
-    </w:p>
-    <w:p>
-      <w:pPr>
-        <w:pStyle w:val="ManualStep"/>
-      </w:pPr>
-      <w:r>
-        <w:rPr>
-          <w:b/>
-        </w:rPr>
-        <w:t xml:space="preserve">5. </w:t>
-      </w:r>
-      <w:r>
-        <w:t>Quando lo script chiede una password per progetto2_user, scegliere una password locale e conservarla.</w:t>
-      </w:r>
-    </w:p>
-    <w:p>
-      <w:pPr>
-        <w:pStyle w:val="ManualStep"/>
-      </w:pPr>
-      <w:r>
-        <w:rPr>
-          <w:b/>
-        </w:rPr>
-        <w:t xml:space="preserve">6. </w:t>
-      </w:r>
-      <w:r>
-        <w:t>Scrivere SI quando lo script chiede di ricreare il database locale.</w:t>
-      </w:r>
-    </w:p>
-    <w:p>
-      <w:pPr>
-        <w:pStyle w:val="ManualStep"/>
-      </w:pPr>
-      <w:r>
-        <w:rPr>
-          <w:b/>
-        </w:rPr>
-        <w:t xml:space="preserve">7. </w:t>
-      </w:r>
-      <w:r>
-        <w:t>Avviare l'applicazione.</w:t>
-      </w:r>
-    </w:p>
-    <w:p>
-      <w:pPr>
-        <w:spacing w:after="60"/>
-        <w:ind w:left="227"/>
-      </w:pPr>
-      <w:r>
-        <w:rPr>
-          <w:rFonts w:ascii="Consolas" w:hAnsi="Consolas" w:eastAsia="Consolas"/>
-          <w:sz w:val="17"/>
-        </w:rPr>
-        <w:t>./scripts/start_macos.sh</w:t>
-      </w:r>
-    </w:p>
-    <w:p>
-      <w:pPr>
-        <w:pStyle w:val="ManualStep"/>
-      </w:pPr>
-      <w:r>
-        <w:rPr>
-          <w:b/>
-        </w:rPr>
-        <w:t xml:space="preserve">8. </w:t>
-      </w:r>
-      <w:r>
-        <w:t>Aprire il browser e scrivere questo indirizzo.</w:t>
-      </w:r>
-    </w:p>
-    <w:p>
-      <w:pPr>
-        <w:spacing w:after="60"/>
-        <w:ind w:left="227"/>
-      </w:pPr>
-      <w:r>
-        <w:rPr>
-          <w:rFonts w:ascii="Consolas" w:hAnsi="Consolas" w:eastAsia="Consolas"/>
-          <w:sz w:val="17"/>
-        </w:rPr>
-        <w:t>http://127.0.0.1:8000/</w:t>
-      </w:r>
-    </w:p>
-    <w:p>
-      <w:pPr>
-        <w:pStyle w:val="ManualNote"/>
-      </w:pPr>
-      <w:r>
-        <w:rPr>
-          <w:b/>
-        </w:rPr>
-        <w:t xml:space="preserve">Se compare errore: </w:t>
-      </w:r>
-      <w:r>
-        <w:t>se la porta 8000 è occupata, eseguire: python manage.py runserver 8001. Aprire poi http://127.0.0.1:8001/</w:t>
-      </w:r>
-    </w:p>
-    <w:p>
-      <w:pPr>
-        <w:pStyle w:val="Heading1"/>
-      </w:pPr>
-      <w:r>
-        <w:t>6. Uso dell'applicazione</w:t>
-      </w:r>
-    </w:p>
-    <w:tbl>
-      <w:tblPr>
-        <w:tblW w:type="auto" w:w="0"/>
-        <w:jc w:val="center"/>
-        <w:tblLook w:firstColumn="1" w:firstRow="1" w:lastColumn="0" w:lastRow="0" w:noHBand="0" w:noVBand="1" w:val="04A0"/>
-        <w:tblBorders>
-          <w:top w:val="single" w:sz="4" w:space="0" w:color="B8AEA6"/>
-          <w:left w:val="single" w:sz="4" w:space="0" w:color="B8AEA6"/>
-          <w:bottom w:val="single" w:sz="4" w:space="0" w:color="B8AEA6"/>
-          <w:right w:val="single" w:sz="4" w:space="0" w:color="B8AEA6"/>
-          <w:insideH w:val="single" w:sz="4" w:space="0" w:color="B8AEA6"/>
-          <w:insideV w:val="single" w:sz="4" w:space="0" w:color="B8AEA6"/>
-        </w:tblBorders>
-      </w:tblPr>
-      <w:tblGrid>
-        <w:gridCol w:w="5270"/>
-        <w:gridCol w:w="5270"/>
-      </w:tblGrid>
-      <w:tr>
-        <w:tc>
-          <w:tcPr>
-            <w:tcW w:type="dxa" w:w="5270"/>
-            <w:vAlign w:val="center"/>
-            <w:shd w:fill="8A7A70"/>
-          </w:tcPr>
-          <w:p>
-            <w:r/>
-            <w:r>
-              <w:rPr>
-                <w:b/>
-                <w:color w:val="FFFFFF"/>
-                <w:sz w:val="18"/>
-              </w:rPr>
-              <w:t>Pagina</w:t>
-            </w:r>
-          </w:p>
-        </w:tc>
-        <w:tc>
-          <w:tcPr>
-            <w:tcW w:type="dxa" w:w="5270"/>
-            <w:vAlign w:val="center"/>
-            <w:shd w:fill="8A7A70"/>
-          </w:tcPr>
-          <w:p>
-            <w:r/>
-            <w:r>
-              <w:rPr>
-                <w:b/>
-                <w:color w:val="FFFFFF"/>
-                <w:sz w:val="18"/>
-              </w:rPr>
-              <w:t>Operazione principale</w:t>
-            </w:r>
-          </w:p>
-        </w:tc>
-      </w:tr>
-      <w:tr>
-        <w:tc>
-          <w:tcPr>
-            <w:tcW w:type="dxa" w:w="5270"/>
-            <w:vAlign w:val="center"/>
-          </w:tcPr>
-          <w:p>
-            <w:r/>
-            <w:r>
-              <w:rPr>
-                <w:b/>
-                <w:sz w:val="17"/>
-              </w:rPr>
-              <w:t>Panoramica</w:t>
-            </w:r>
-          </w:p>
-        </w:tc>
-        <w:tc>
-          <w:tcPr>
-            <w:tcW w:type="dxa" w:w="5270"/>
-            <w:vAlign w:val="center"/>
-          </w:tcPr>
-          <w:p>
-            <w:r/>
-            <w:r>
-              <w:rPr>
-                <w:b w:val="0"/>
-                <w:sz w:val="17"/>
-              </w:rPr>
-              <w:t>Leggere statistiche, usare ricerca rapida e aprire ricerche frequenti.</w:t>
-            </w:r>
-          </w:p>
-        </w:tc>
-      </w:tr>
-      <w:tr>
-        <w:tc>
-          <w:tcPr>
-            <w:tcW w:type="dxa" w:w="5270"/>
-            <w:vAlign w:val="center"/>
-          </w:tcPr>
-          <w:p>
-            <w:r/>
-            <w:r>
-              <w:rPr>
-                <w:b/>
-                <w:sz w:val="17"/>
-              </w:rPr>
-              <w:t>Numeri telefonici</w:t>
-            </w:r>
-          </w:p>
-        </w:tc>
-        <w:tc>
-          <w:tcPr>
-            <w:tcW w:type="dxa" w:w="5270"/>
-            <w:vAlign w:val="center"/>
-          </w:tcPr>
-          <w:p>
-            <w:r/>
-            <w:r>
-              <w:rPr>
-                <w:b w:val="0"/>
-                <w:sz w:val="17"/>
-              </w:rPr>
-              <w:t>Cercare numeri, applicare filtri, aprire schede, usare tabella ed esportare Excel.</w:t>
-            </w:r>
-          </w:p>
-        </w:tc>
-      </w:tr>
-      <w:tr>
-        <w:tc>
-          <w:tcPr>
-            <w:tcW w:type="dxa" w:w="5270"/>
-            <w:vAlign w:val="center"/>
-          </w:tcPr>
-          <w:p>
-            <w:r/>
-            <w:r>
-              <w:rPr>
-                <w:b/>
-                <w:sz w:val="17"/>
-              </w:rPr>
-              <w:t>Chiamate</w:t>
-            </w:r>
-          </w:p>
-        </w:tc>
-        <w:tc>
-          <w:tcPr>
-            <w:tcW w:type="dxa" w:w="5270"/>
-            <w:vAlign w:val="center"/>
-          </w:tcPr>
-          <w:p>
-            <w:r/>
-            <w:r>
-              <w:rPr>
-                <w:b w:val="0"/>
-                <w:sz w:val="17"/>
-              </w:rPr>
-              <w:t>Filtrare chiamate per numero, data, ora, durata, piano e addebito.</w:t>
-            </w:r>
-          </w:p>
-        </w:tc>
-      </w:tr>
-      <w:tr>
-        <w:tc>
-          <w:tcPr>
-            <w:tcW w:type="dxa" w:w="5270"/>
-            <w:vAlign w:val="center"/>
-          </w:tcPr>
-          <w:p>
-            <w:r/>
-            <w:r>
-              <w:rPr>
-                <w:b/>
-                <w:sz w:val="17"/>
               </w:rPr>
               <w:t>SIM</w:t>
             </w:r>
@@ -1145,17 +1617,19 @@
         </w:tc>
         <w:tc>
           <w:tcPr>
-            <w:tcW w:type="dxa" w:w="5270"/>
-            <w:vAlign w:val="center"/>
+            <w:tcW w:type="dxa" w:w="5156"/>
+            <w:vAlign w:val="top"/>
           </w:tcPr>
           <w:p>
+            <w:pPr>
+              <w:spacing w:after="0"/>
+            </w:pPr>
             <w:r/>
             <w:r>
               <w:rPr>
                 <w:b w:val="0"/>
-                <w:sz w:val="17"/>
               </w:rPr>
-              <w:t>Consultare SIM in uso, disponibili e disattivate. Registrare, modificare o eliminare SIM disattivate.</w:t>
+              <w:t>Consultare SIM in uso, disponibili e disattivate. Gestire lo storico delle SIM disattivate.</w:t>
             </w:r>
           </w:p>
         </w:tc>
@@ -1166,194 +1640,114 @@
         <w:pStyle w:val="Heading1"/>
       </w:pPr>
       <w:r>
-        <w:t>7. Verifica finale</w:t>
+        <w:t>7. Domande frequenti</w:t>
       </w:r>
     </w:p>
     <w:p>
       <w:pPr>
-        <w:pStyle w:val="ManualStep"/>
+        <w:pStyle w:val="Heading2"/>
+      </w:pPr>
+      <w:r>
+        <w:t>Lo script chiede password?</w:t>
+      </w:r>
+    </w:p>
+    <w:p>
+      <w:pPr>
+        <w:ind w:left="255" w:hanging="113"/>
       </w:pPr>
       <w:r>
         <w:rPr>
           <w:b/>
         </w:rPr>
-        <w:t xml:space="preserve">1. </w:t>
+        <w:t xml:space="preserve">• </w:t>
       </w:r>
       <w:r>
-        <w:t>Controllare il progetto Django.</w:t>
+        <w:t>Sì. Lo script chiede una password per l'utente applicativo progetto2_user e la password dell'utente amministratore PostgreSQL.</w:t>
       </w:r>
     </w:p>
     <w:p>
       <w:pPr>
-        <w:spacing w:after="60"/>
-        <w:ind w:left="227"/>
-      </w:pPr>
-      <w:r>
-        <w:rPr>
-          <w:rFonts w:ascii="Consolas" w:hAnsi="Consolas" w:eastAsia="Consolas"/>
-          <w:sz w:val="17"/>
-        </w:rPr>
-        <w:t>python manage.py check</w:t>
-      </w:r>
-    </w:p>
-    <w:p>
-      <w:pPr>
-        <w:pStyle w:val="ManualNote"/>
+        <w:ind w:left="255" w:hanging="113"/>
       </w:pPr>
       <w:r>
         <w:rPr>
           <w:b/>
         </w:rPr>
-        <w:t xml:space="preserve">Se compare errore: </w:t>
+        <w:t xml:space="preserve">• </w:t>
       </w:r>
       <w:r>
-        <w:t>il comando deve mostrare "System check identified no issues".</w:t>
+        <w:t>La password dell'utente applicativo viene salvata solo nel file locale .env.</w:t>
       </w:r>
     </w:p>
     <w:p>
       <w:pPr>
-        <w:pStyle w:val="ManualStep"/>
+        <w:ind w:left="255" w:hanging="113"/>
       </w:pPr>
       <w:r>
         <w:rPr>
           <w:b/>
         </w:rPr>
-        <w:t xml:space="preserve">2. </w:t>
+        <w:t xml:space="preserve">• </w:t>
       </w:r>
       <w:r>
-        <w:t>Controllare il database importato.</w:t>
+        <w:t>La password amministratore PostgreSQL serve solo per creare il database. Non viene salvata nel progetto.</w:t>
       </w:r>
     </w:p>
     <w:p>
       <w:pPr>
-        <w:spacing w:after="60"/>
-        <w:ind w:left="227"/>
+        <w:pStyle w:val="Heading2"/>
       </w:pPr>
       <w:r>
-        <w:rPr>
-          <w:rFonts w:ascii="Consolas" w:hAnsi="Consolas" w:eastAsia="Consolas"/>
-          <w:sz w:val="17"/>
-        </w:rPr>
-        <w:t>python manage.py verify_import</w:t>
+        <w:t>Si può provare lo script più volte?</w:t>
       </w:r>
     </w:p>
     <w:p>
       <w:pPr>
-        <w:pStyle w:val="ManualNote"/>
+        <w:ind w:left="255" w:hanging="113"/>
       </w:pPr>
       <w:r>
         <w:rPr>
           <w:b/>
         </w:rPr>
-        <w:t xml:space="preserve">Se compare errore: </w:t>
+        <w:t xml:space="preserve">• </w:t>
       </w:r>
       <w:r>
-        <w:t>il comando deve terminare con "Verifica completata: database coerente".</w:t>
+        <w:t>Sì, ma lo script elimina e ricrea il database indicato solo dopo la conferma SI.</w:t>
       </w:r>
     </w:p>
     <w:p>
       <w:pPr>
-        <w:pStyle w:val="ManualStep"/>
+        <w:ind w:left="255" w:hanging="113"/>
       </w:pPr>
       <w:r>
         <w:rPr>
           <w:b/>
         </w:rPr>
-        <w:t xml:space="preserve">3. </w:t>
+        <w:t xml:space="preserve">• </w:t>
       </w:r>
       <w:r>
-        <w:t>Aprire Panoramica, Numeri telefonici, Chiamate e SIM.</w:t>
+        <w:t>Non scrivere SI se non si vuole ricreare il database locale.</w:t>
       </w:r>
     </w:p>
     <w:p>
       <w:pPr>
-        <w:pStyle w:val="ManualStep"/>
+        <w:ind w:left="255" w:hanging="113"/>
       </w:pPr>
       <w:r>
         <w:rPr>
           <w:b/>
         </w:rPr>
-        <w:t xml:space="preserve">4. </w:t>
+        <w:t xml:space="preserve">• </w:t>
       </w:r>
       <w:r>
-        <w:t>Provare almeno una ricerca, una vista tabellare, una scheda e una esportazione Excel.</w:t>
-      </w:r>
-    </w:p>
-    <w:p>
-      <w:pPr>
-        <w:pStyle w:val="ManualStep"/>
-      </w:pPr>
-      <w:r>
-        <w:rPr>
-          <w:b/>
-        </w:rPr>
-        <w:t xml:space="preserve">5. </w:t>
-      </w:r>
-      <w:r>
-        <w:t>Fermare il server con CTRL + C nel terminale.</w:t>
-      </w:r>
-    </w:p>
-    <w:p>
-      <w:pPr>
-        <w:pStyle w:val="Heading1"/>
-      </w:pPr>
-      <w:r>
-        <w:t>8. File necessari nella consegna</w:t>
-      </w:r>
-    </w:p>
-    <w:p>
-      <w:pPr>
-        <w:pStyle w:val="ManualBullet"/>
-      </w:pPr>
-      <w:r>
-        <w:t>Cartella del progetto Django.</w:t>
-      </w:r>
-    </w:p>
-    <w:p>
-      <w:pPr>
-        <w:pStyle w:val="ManualBullet"/>
-      </w:pPr>
-      <w:r>
-        <w:t>requirements.txt.</w:t>
-      </w:r>
-    </w:p>
-    <w:p>
-      <w:pPr>
-        <w:pStyle w:val="ManualBullet"/>
-      </w:pPr>
-      <w:r>
-        <w:t>Cartella scripts/.</w:t>
-      </w:r>
-    </w:p>
-    <w:p>
-      <w:pPr>
-        <w:pStyle w:val="ManualBullet"/>
-      </w:pPr>
-      <w:r>
-        <w:t>File database/generated/progetto2_db.backup.</w:t>
-      </w:r>
-    </w:p>
-    <w:p>
-      <w:pPr>
-        <w:pStyle w:val="ManualBullet"/>
-      </w:pPr>
-      <w:r>
-        <w:t>Manuale utente in PDF.</w:t>
-      </w:r>
-    </w:p>
-    <w:p>
-      <w:pPr>
-        <w:pStyle w:val="ManualBullet"/>
-      </w:pPr>
-      <w:r>
-        <w:t>Documento delle scelte progettuali.</w:t>
+        <w:t>Lo script di avvio start_windows.bat o start_macos.sh non ricrea il database. Serve solo ad avviare il sito.</w:t>
       </w:r>
     </w:p>
     <w:sectPr>
       <w:headerReference w:type="default" r:id="rId9"/>
       <w:footerReference w:type="default" r:id="rId10"/>
       <w:pgSz w:w="12240" w:h="15840"/>
-      <w:pgMar w:top="794" w:right="850" w:bottom="709" w:left="850" w:header="720" w:footer="720" w:gutter="0"/>
+      <w:pgMar w:top="765" w:right="964" w:bottom="765" w:left="964" w:header="720" w:footer="720" w:gutter="0"/>
       <w:cols w:space="720"/>
       <w:docGrid w:linePitch="360"/>
     </w:sectPr>
@@ -1370,10 +1764,10 @@
     </w:pPr>
     <w:r>
       <w:rPr>
-        <w:color w:val="787878"/>
+        <w:color w:val="6E6E6E"/>
         <w:sz w:val="16"/>
       </w:rPr>
-      <w:t>Gestione Numeri Telefonici - installazione locale</w:t>
+      <w:t>Gestione Numeri Telefonici - Manuale utente</w:t>
     </w:r>
   </w:p>
 </w:ftr>
@@ -1388,10 +1782,10 @@
     </w:pPr>
     <w:r>
       <w:rPr>
-        <w:color w:val="787878"/>
-        <w:sz w:val="16"/>
-      </w:rPr>
-      <w:t>Secondo progetto Programmazione Web - Manuale utente</w:t>
+        <w:color w:val="646464"/>
+        <w:sz w:val="18"/>
+      </w:rPr>
+      <w:t>Gestione Numeri Telefonici - Manuale utente</w:t>
     </w:r>
   </w:p>
 </w:hdr>
@@ -1764,8 +2158,8 @@
       <w:spacing w:after="80" w:line="252" w:lineRule="auto"/>
     </w:pPr>
     <w:rPr>
-      <w:rFonts w:ascii="Arial" w:hAnsi="Arial" w:eastAsia="Arial"/>
-      <w:sz w:val="19"/>
+      <w:rFonts w:ascii="Calibri" w:hAnsi="Calibri" w:eastAsia="Calibri"/>
+      <w:sz w:val="21"/>
     </w:rPr>
   </w:style>
   <w:style w:type="paragraph" w:styleId="Header">
@@ -1823,15 +2217,15 @@
     <w:pPr>
       <w:keepNext/>
       <w:keepLines/>
-      <w:spacing w:before="480" w:after="0"/>
+      <w:spacing w:before="160" w:after="100"/>
       <w:outlineLvl w:val="0"/>
     </w:pPr>
     <w:rPr>
-      <w:rFonts w:asciiTheme="majorHAnsi" w:eastAsiaTheme="majorEastAsia" w:hAnsiTheme="majorHAnsi" w:cstheme="majorBidi" w:ascii="Arial" w:hAnsi="Arial" w:eastAsia="Arial"/>
+      <w:rFonts w:asciiTheme="majorHAnsi" w:eastAsiaTheme="majorEastAsia" w:hAnsiTheme="majorHAnsi" w:cstheme="majorBidi" w:ascii="Calibri" w:hAnsi="Calibri" w:eastAsia="Calibri"/>
       <w:b/>
       <w:bCs/>
-      <w:color w:val="2C5282"/>
-      <w:sz w:val="26"/>
+      <w:color w:val="1F4E79"/>
+      <w:sz w:val="36"/>
       <w:szCs w:val="28"/>
     </w:rPr>
   </w:style>
@@ -1847,15 +2241,15 @@
     <w:pPr>
       <w:keepNext/>
       <w:keepLines/>
-      <w:spacing w:before="200" w:after="0"/>
+      <w:spacing w:before="140" w:after="60"/>
       <w:outlineLvl w:val="1"/>
     </w:pPr>
     <w:rPr>
-      <w:rFonts w:asciiTheme="majorHAnsi" w:eastAsiaTheme="majorEastAsia" w:hAnsiTheme="majorHAnsi" w:cstheme="majorBidi" w:ascii="Arial" w:hAnsi="Arial" w:eastAsia="Arial"/>
+      <w:rFonts w:asciiTheme="majorHAnsi" w:eastAsiaTheme="majorEastAsia" w:hAnsiTheme="majorHAnsi" w:cstheme="majorBidi" w:ascii="Calibri" w:hAnsi="Calibri" w:eastAsia="Calibri"/>
       <w:b/>
       <w:bCs/>
-      <w:color w:val="594D43"/>
-      <w:sz w:val="22"/>
+      <w:color w:val="1F4E79"/>
+      <w:sz w:val="26"/>
       <w:szCs w:val="26"/>
     </w:rPr>
   </w:style>
@@ -1871,14 +2265,15 @@
     <w:pPr>
       <w:keepNext/>
       <w:keepLines/>
-      <w:spacing w:before="200" w:after="0"/>
+      <w:spacing w:before="100" w:after="40"/>
       <w:outlineLvl w:val="2"/>
     </w:pPr>
     <w:rPr>
-      <w:rFonts w:asciiTheme="majorHAnsi" w:eastAsiaTheme="majorEastAsia" w:hAnsiTheme="majorHAnsi" w:cstheme="majorBidi"/>
+      <w:rFonts w:asciiTheme="majorHAnsi" w:eastAsiaTheme="majorEastAsia" w:hAnsiTheme="majorHAnsi" w:cstheme="majorBidi" w:ascii="Calibri" w:hAnsi="Calibri" w:eastAsia="Calibri"/>
       <w:b/>
       <w:bCs/>
-      <w:color w:val="4F81BD" w:themeColor="accent1"/>
+      <w:color w:val="545454"/>
+      <w:sz w:val="22"/>
     </w:rPr>
   </w:style>
   <w:style w:type="paragraph" w:styleId="Heading4">
@@ -2116,12 +2511,11 @@
       <w:contextualSpacing/>
     </w:pPr>
     <w:rPr>
-      <w:rFonts w:asciiTheme="majorHAnsi" w:eastAsiaTheme="majorEastAsia" w:hAnsiTheme="majorHAnsi" w:cstheme="majorBidi" w:ascii="Arial" w:hAnsi="Arial" w:eastAsia="Arial"/>
-      <w:b/>
-      <w:color w:val="2C5282"/>
+      <w:rFonts w:asciiTheme="majorHAnsi" w:eastAsiaTheme="majorEastAsia" w:hAnsiTheme="majorHAnsi" w:cstheme="majorBidi"/>
+      <w:color w:val="17365D" w:themeColor="text2" w:themeShade="BF"/>
       <w:spacing w:val="5"/>
       <w:kern w:val="28"/>
-      <w:sz w:val="36"/>
+      <w:sz w:val="52"/>
       <w:szCs w:val="52"/>
     </w:rPr>
   </w:style>
@@ -13451,41 +13845,25 @@
       </w:tcPr>
     </w:tblStylePr>
   </w:style>
-  <w:style w:type="paragraph" w:customStyle="1" w:styleId="ManualStep">
-    <w:name w:val="ManualStep"/>
-    <w:basedOn w:val="Normal"/>
-    <w:pPr>
-      <w:spacing w:after="60"/>
-      <w:ind w:left="0"/>
+  <w:style w:type="paragraph" w:customStyle="1" w:styleId="CodeBlock">
+    <w:name w:val="CodeBlock"/>
+    <w:pPr>
+      <w:spacing w:before="40" w:after="60"/>
     </w:pPr>
     <w:rPr>
-      <w:rFonts w:ascii="Arial" w:hAnsi="Arial" w:eastAsia="Arial"/>
-      <w:sz w:val="19"/>
+      <w:rFonts w:ascii="Consolas" w:hAnsi="Consolas" w:eastAsia="Consolas"/>
+      <w:sz w:val="18"/>
     </w:rPr>
   </w:style>
-  <w:style w:type="paragraph" w:customStyle="1" w:styleId="ManualBullet">
-    <w:name w:val="ManualBullet"/>
-    <w:basedOn w:val="Normal"/>
-    <w:pPr>
-      <w:spacing w:after="40"/>
-      <w:ind w:left="198" w:hanging="102"/>
+  <w:style w:type="paragraph" w:customStyle="1" w:styleId="SmallNote">
+    <w:name w:val="SmallNote"/>
+    <w:pPr>
+      <w:spacing w:after="80"/>
     </w:pPr>
     <w:rPr>
-      <w:rFonts w:ascii="Arial" w:hAnsi="Arial" w:eastAsia="Arial"/>
-      <w:sz w:val="19"/>
-    </w:rPr>
-  </w:style>
-  <w:style w:type="paragraph" w:customStyle="1" w:styleId="ManualNote">
-    <w:name w:val="ManualNote"/>
-    <w:basedOn w:val="Normal"/>
-    <w:pPr>
-      <w:spacing w:after="60"/>
-      <w:ind w:left="227"/>
-    </w:pPr>
-    <w:rPr>
-      <w:rFonts w:ascii="Arial" w:hAnsi="Arial" w:eastAsia="Arial"/>
-      <w:color w:val="695245"/>
-      <w:sz w:val="17"/>
+      <w:rFonts w:ascii="Calibri" w:hAnsi="Calibri" w:eastAsia="Calibri"/>
+      <w:color w:val="505050"/>
+      <w:sz w:val="18"/>
     </w:rPr>
   </w:style>
 </w:styles>

</xml_diff>

<commit_message>
Correggi script database e guida installazione macOS
- Corretto prepare_database.py per evitare l’errore SQL sul comando ALTER ROLE
- Corretto l’uso della password dell’utente applicativo PostgreSQL nei comandi di creazione e modifica ruolo
- Aggiornato il punto 4.6 del manuale utente macOS
- Chiarito quando premere Invio senza scrivere nulla durante l’installazione
- Migliorata la spiegazione dell’utente amministratore PostgreSQL su macOS/Homebrew
- Rigenerato il manuale PDF aggiornato
</commit_message>
<xml_diff>
--- a/progetto2/docs/MANUALE_UTENTE.docx
+++ b/progetto2/docs/MANUALE_UTENTE.docx
@@ -1365,82 +1365,102 @@
     <w:p>
       <w:pPr/>
       <w:r>
-        <w:rPr>
-          <w:b w:val="0"/>
-          <w:lang w:val="it-IT"/>
-        </w:rPr>
-        <w:t>Durante l’installazione lasciare i valori proposti premendo Invio, quando non serve cambiarli.</w:t>
+        <w:t>Durante l’installazione lo script mostra alcune richieste. Premere Invio per usare il valore tra parentesi quando non serve cambiarlo.</w:t>
       </w:r>
     </w:p>
     <w:p>
-      <w:pPr>
-        <w:ind w:left="255" w:hanging="170"/>
-      </w:pPr>
+      <w:pPr/>
       <w:r>
         <w:rPr>
           <w:b/>
-          <w:lang w:val="it-IT"/>
         </w:rPr>
         <w:t xml:space="preserve">• </w:t>
       </w:r>
       <w:r>
-        <w:rPr>
-          <w:lang w:val="it-IT"/>
-        </w:rPr>
-        <w:t>Alla richiesta Password utente applicativo PostgreSQL, scegliere una password locale. Annotarla.</w:t>
+        <w:t>Host PostgreSQL: lasciare 127.0.0.1. Non scrivere postgres: postgres è di solito il nome dell’utente amministratore, non l’host.</w:t>
       </w:r>
     </w:p>
     <w:p>
-      <w:pPr>
-        <w:ind w:left="255" w:hanging="170"/>
-      </w:pPr>
+      <w:pPr/>
       <w:r>
         <w:rPr>
           <w:b/>
-          <w:lang w:val="it-IT"/>
         </w:rPr>
         <w:t xml:space="preserve">• </w:t>
       </w:r>
       <w:r>
-        <w:rPr>
-          <w:lang w:val="it-IT"/>
-        </w:rPr>
-        <w:t>Alla richiesta Utente amministratore PostgreSQL, usare postgres se non è stato scelto un altro nome.</w:t>
+        <w:t>Porta PostgreSQL: lasciare 5432. Non usare 8000 o 8001: sono porte del sito Django.</w:t>
       </w:r>
     </w:p>
     <w:p>
-      <w:pPr>
-        <w:ind w:left="255" w:hanging="170"/>
-      </w:pPr>
+      <w:pPr/>
       <w:r>
         <w:rPr>
           <w:b/>
-          <w:lang w:val="it-IT"/>
         </w:rPr>
         <w:t xml:space="preserve">• </w:t>
       </w:r>
       <w:r>
-        <w:rPr>
-          <w:lang w:val="it-IT"/>
-        </w:rPr>
-        <w:t>Alla richiesta Password utente amministratore PostgreSQL, scrivere la password dell’installazione PostgreSQL presente nel computer.</w:t>
+        <w:t>Nome database applicativo: lasciare progetto2_db.</w:t>
       </w:r>
     </w:p>
     <w:p>
-      <w:pPr>
-        <w:ind w:left="255" w:hanging="170"/>
-      </w:pPr>
+      <w:pPr/>
       <w:r>
         <w:rPr>
           <w:b/>
-          <w:lang w:val="it-IT"/>
         </w:rPr>
         <w:t xml:space="preserve">• </w:t>
       </w:r>
       <w:r>
+        <w:t>Utente applicativo PostgreSQL: lasciare progetto2_user.</w:t>
+      </w:r>
+    </w:p>
+    <w:p>
+      <w:pPr/>
+      <w:r>
         <w:rPr>
-          <w:lang w:val="it-IT"/>
+          <w:b/>
         </w:rPr>
+        <w:t xml:space="preserve">• </w:t>
+      </w:r>
+      <w:r>
+        <w:t>Password utente applicativo PostgreSQL: scegliere una password locale per il progetto. Se viene proposta la password del file .env e non serve cambiarla, premere Invio.</w:t>
+      </w:r>
+    </w:p>
+    <w:p>
+      <w:pPr/>
+      <w:r>
+        <w:rPr>
+          <w:b/>
+        </w:rPr>
+        <w:t xml:space="preserve">• </w:t>
+      </w:r>
+      <w:r>
+        <w:t>Utente amministratore PostgreSQL: su Windows usare di solito postgres, salvo diversa configurazione di PostgreSQL.</w:t>
+      </w:r>
+    </w:p>
+    <w:p>
+      <w:pPr/>
+      <w:r>
+        <w:rPr>
+          <w:b/>
+        </w:rPr>
+        <w:t xml:space="preserve">• </w:t>
+      </w:r>
+      <w:r>
+        <w:t>Password utente amministratore PostgreSQL: scrivere la password scelta durante l’installazione di PostgreSQL.</w:t>
+      </w:r>
+    </w:p>
+    <w:p>
+      <w:pPr/>
+      <w:r>
+        <w:rPr>
+          <w:b/>
+        </w:rPr>
+        <w:t xml:space="preserve">• </w:t>
+      </w:r>
+      <w:r>
         <w:t>Quando compare la richiesta di conferma, scrivere SI e premere Invio.</w:t>
       </w:r>
     </w:p>
@@ -1525,6 +1545,77 @@
         </w:tc>
       </w:tr>
     </w:tbl>
+    <w:p>
+      <w:pPr/>
+    </w:p>
+    <w:tbl>
+      <w:tblPr>
+        <w:tblW w:type="auto" w:w="0"/>
+        <w:jc w:val="center"/>
+        <w:tblLayout w:type="autofit"/>
+        <w:tblLook w:firstColumn="1" w:firstRow="1" w:lastColumn="0" w:lastRow="0" w:noHBand="0" w:noVBand="1" w:val="04A0"/>
+      </w:tblPr>
+      <w:tblGrid>
+        <w:gridCol w:w="10482"/>
+      </w:tblGrid>
+      <w:tr>
+        <w:tc>
+          <w:tcPr>
+            <w:tcW w:type="dxa" w:w="10482"/>
+            <w:shd w:fill="FFF3E5"/>
+            <w:tcBorders>
+              <w:top w:val="single" w:sz="6" w:space="0" w:color="D9B27E"/>
+              <w:left w:val="single" w:sz="6" w:space="0" w:color="D9B27E"/>
+              <w:bottom w:val="single" w:sz="6" w:space="0" w:color="D9B27E"/>
+              <w:right w:val="single" w:sz="6" w:space="0" w:color="D9B27E"/>
+            </w:tcBorders>
+            <w:vAlign w:val="center"/>
+          </w:tcPr>
+          <w:p>
+            <w:r>
+              <w:t>Se compare errore. Se compare failed to resolve host 'postgres', ripetere il comando e alla richiesta Host PostgreSQL scrivere 127.0.0.1.</w:t>
+            </w:r>
+          </w:p>
+        </w:tc>
+      </w:tr>
+    </w:tbl>
+    <w:p>
+      <w:pPr/>
+    </w:p>
+    <w:tbl>
+      <w:tblPr>
+        <w:tblW w:type="auto" w:w="0"/>
+        <w:jc w:val="center"/>
+        <w:tblLayout w:type="autofit"/>
+        <w:tblLook w:firstColumn="1" w:firstRow="1" w:lastColumn="0" w:lastRow="0" w:noHBand="0" w:noVBand="1" w:val="04A0"/>
+      </w:tblPr>
+      <w:tblGrid>
+        <w:gridCol w:w="10482"/>
+      </w:tblGrid>
+      <w:tr>
+        <w:tc>
+          <w:tcPr>
+            <w:tcW w:type="dxa" w:w="10482"/>
+            <w:shd w:fill="FFF3E5"/>
+            <w:tcBorders>
+              <w:top w:val="single" w:sz="6" w:space="0" w:color="D9B27E"/>
+              <w:left w:val="single" w:sz="6" w:space="0" w:color="D9B27E"/>
+              <w:bottom w:val="single" w:sz="6" w:space="0" w:color="D9B27E"/>
+              <w:right w:val="single" w:sz="6" w:space="0" w:color="D9B27E"/>
+            </w:tcBorders>
+            <w:vAlign w:val="center"/>
+          </w:tcPr>
+          <w:p>
+            <w:r>
+              <w:t>Se compare errore. Se compare errore di connessione dopo aver scritto 8000 o 8001 come porta PostgreSQL, ripetere il comando e alla richiesta Porta PostgreSQL scrivere 5432.</w:t>
+            </w:r>
+          </w:p>
+        </w:tc>
+      </w:tr>
+    </w:tbl>
+    <w:p>
+      <w:pPr/>
+    </w:p>
     <w:p/>
     <w:tbl>
       <w:tblPr>
@@ -3025,83 +3116,76 @@
     <w:p>
       <w:pPr/>
       <w:r>
-        <w:rPr>
-          <w:b w:val="0"/>
-          <w:lang w:val="it-IT"/>
-        </w:rPr>
-        <w:t>Durante l’installazione lasciare i valori proposti premendo Invio, quando non serve cambiarli.</w:t>
+        <w:t>Durante l’installazione lo script mostra alcune richieste. Quando il valore corretto è già scritto tra parentesi quadre, non scrivere nulla e premere Invio.</w:t>
       </w:r>
     </w:p>
     <w:p>
       <w:pPr>
-        <w:ind w:left="255" w:hanging="170"/>
+        <w:pStyle w:val="StepManual"/>
       </w:pPr>
       <w:r>
-        <w:rPr>
-          <w:b/>
-          <w:lang w:val="it-IT"/>
-        </w:rPr>
-        <w:t xml:space="preserve">• </w:t>
-      </w:r>
-      <w:r>
-        <w:rPr>
-          <w:lang w:val="it-IT"/>
-        </w:rPr>
-        <w:t>Alla richiesta Password utente applicativo PostgreSQL, scegliere una password locale. Annotarla.</w:t>
+        <w:t>1. Alla richiesta Host PostgreSQL [127.0.0.1]: non scrivere nulla e premere Invio. Non scrivere postgres: postgres è di solito il nome dell’utente amministratore, non l’host.</w:t>
       </w:r>
     </w:p>
     <w:p>
       <w:pPr>
-        <w:ind w:left="255" w:hanging="170"/>
+        <w:pStyle w:val="StepManual"/>
       </w:pPr>
       <w:r>
-        <w:rPr>
-          <w:b/>
-          <w:lang w:val="it-IT"/>
-        </w:rPr>
-        <w:t xml:space="preserve">• </w:t>
-      </w:r>
-      <w:r>
-        <w:rPr>
-          <w:lang w:val="it-IT"/>
-        </w:rPr>
-        <w:t>Alla richiesta Utente amministratore PostgreSQL, usare postgres se non è stato scelto un altro nome.</w:t>
+        <w:t>2. Alla richiesta Porta PostgreSQL [5432]: non scrivere nulla e premere Invio. Non usare 8000 o 8001: sono porte del sito Django.</w:t>
       </w:r>
     </w:p>
     <w:p>
       <w:pPr>
-        <w:ind w:left="255" w:hanging="170"/>
+        <w:pStyle w:val="StepManual"/>
       </w:pPr>
       <w:r>
-        <w:rPr>
-          <w:b/>
-          <w:lang w:val="it-IT"/>
-        </w:rPr>
-        <w:t xml:space="preserve">• </w:t>
-      </w:r>
-      <w:r>
-        <w:rPr>
-          <w:lang w:val="it-IT"/>
-        </w:rPr>
-        <w:t>Alla richiesta Password utente amministratore PostgreSQL, scrivere la password dell’installazione PostgreSQL presente nel computer.</w:t>
+        <w:t>3. Alla richiesta Nome database applicativo [progetto2_db]: non scrivere nulla e premere Invio.</w:t>
       </w:r>
     </w:p>
     <w:p>
       <w:pPr>
-        <w:ind w:left="255" w:hanging="170"/>
+        <w:pStyle w:val="StepManual"/>
       </w:pPr>
       <w:r>
-        <w:rPr>
-          <w:b/>
-          <w:lang w:val="it-IT"/>
-        </w:rPr>
-        <w:t xml:space="preserve">• </w:t>
+        <w:t>4. Alla richiesta Utente applicativo PostgreSQL [progetto2_user]: non scrivere nulla e premere Invio.</w:t>
       </w:r>
+    </w:p>
+    <w:p>
+      <w:pPr>
+        <w:pStyle w:val="StepManual"/>
+      </w:pPr>
       <w:r>
-        <w:rPr>
-          <w:lang w:val="it-IT"/>
-        </w:rPr>
-        <w:t>Quando compare la richiesta di conferma, scrivere SI e premere Invio.</w:t>
+        <w:t>5. Alla richiesta Password utente applicativo PostgreSQL: scegliere una password locale per il progetto. Se compare il messaggio Invio per mantenere quella del file .env e non serve cambiarla, non scrivere nulla e premere Invio.</w:t>
+      </w:r>
+    </w:p>
+    <w:p>
+      <w:pPr>
+        <w:pStyle w:val="StepManual"/>
+      </w:pPr>
+      <w:r>
+        <w:t>6. Alla richiesta Utente amministratore PostgreSQL [nome_utente_Mac]: scrivere il nome proposto tra parentesi quadre e premere Invio. Usare postgres solo se PostgreSQL è stato configurato con quell’utente.</w:t>
+      </w:r>
+    </w:p>
+    <w:p>
+      <w:pPr>
+        <w:pStyle w:val="StepManual"/>
+      </w:pPr>
+      <w:r>
+        <w:t>7. Alla richiesta Password utente amministratore PostgreSQL: se PostgreSQL locale non richiede password, non scrivere nulla e premere Invio. Se invece la richiede, scrivere la password di PostgreSQL e premere Invio.</w:t>
+      </w:r>
+    </w:p>
+    <w:p>
+      <w:pPr>
+        <w:pStyle w:val="StepManual"/>
+      </w:pPr>
+      <w:r>
+        <w:t>8. Quando compare la richiesta di conferma, scrivere SI e premere Invio.</w:t>
+      </w:r>
+    </w:p>
+    <w:p>
+      <w:r>
+        <w:br w:type="page"/>
       </w:r>
     </w:p>
     <w:tbl>
@@ -3169,22 +3253,84 @@
             <w:vAlign w:val="center"/>
           </w:tcPr>
           <w:p>
-            <w:pPr>
-              <w:pStyle w:val="BoxTextManual"/>
-            </w:pPr>
             <w:r>
-              <w:rPr>
-                <w:b/>
-              </w:rPr>
-              <w:t>Se compare errore.</w:t>
-            </w:r>
-            <w:r>
-              <w:t xml:space="preserve"> Se compare autenticazione fallita, ripetere il comando e inserire la password corretta dell’utente amministratore PostgreSQL.</w:t>
+              <w:t>Se compare errore. Se compare autenticazione fallita, ripetere il comando e inserire l’utente amministratore PostgreSQL corretto. Se PostgreSQL locale non richiede password, alla richiesta della password premere Invio.</w:t>
             </w:r>
           </w:p>
         </w:tc>
       </w:tr>
     </w:tbl>
+    <w:p>
+      <w:pPr/>
+    </w:p>
+    <w:tbl>
+      <w:tblPr>
+        <w:tblW w:type="auto" w:w="0"/>
+        <w:jc w:val="center"/>
+        <w:tblLayout w:type="autofit"/>
+        <w:tblLook w:firstColumn="1" w:firstRow="1" w:lastColumn="0" w:lastRow="0" w:noHBand="0" w:noVBand="1" w:val="04A0"/>
+      </w:tblPr>
+      <w:tblGrid>
+        <w:gridCol w:w="10482"/>
+      </w:tblGrid>
+      <w:tr>
+        <w:tc>
+          <w:tcPr>
+            <w:tcW w:type="dxa" w:w="10482"/>
+            <w:shd w:fill="FFF3E5"/>
+            <w:tcBorders>
+              <w:top w:val="single" w:sz="6" w:space="0" w:color="D9B27E"/>
+              <w:left w:val="single" w:sz="6" w:space="0" w:color="D9B27E"/>
+              <w:bottom w:val="single" w:sz="6" w:space="0" w:color="D9B27E"/>
+              <w:right w:val="single" w:sz="6" w:space="0" w:color="D9B27E"/>
+            </w:tcBorders>
+            <w:vAlign w:val="center"/>
+          </w:tcPr>
+          <w:p>
+            <w:r>
+              <w:t>Se compare errore. Se compare failed to resolve host 'postgres', ripetere il comando e alla richiesta Host PostgreSQL scrivere 127.0.0.1.</w:t>
+            </w:r>
+          </w:p>
+        </w:tc>
+      </w:tr>
+    </w:tbl>
+    <w:p>
+      <w:pPr/>
+    </w:p>
+    <w:tbl>
+      <w:tblPr>
+        <w:tblW w:type="auto" w:w="0"/>
+        <w:jc w:val="center"/>
+        <w:tblLayout w:type="autofit"/>
+        <w:tblLook w:firstColumn="1" w:firstRow="1" w:lastColumn="0" w:lastRow="0" w:noHBand="0" w:noVBand="1" w:val="04A0"/>
+      </w:tblPr>
+      <w:tblGrid>
+        <w:gridCol w:w="10482"/>
+      </w:tblGrid>
+      <w:tr>
+        <w:tc>
+          <w:tcPr>
+            <w:tcW w:type="dxa" w:w="10482"/>
+            <w:shd w:fill="FFF3E5"/>
+            <w:tcBorders>
+              <w:top w:val="single" w:sz="6" w:space="0" w:color="D9B27E"/>
+              <w:left w:val="single" w:sz="6" w:space="0" w:color="D9B27E"/>
+              <w:bottom w:val="single" w:sz="6" w:space="0" w:color="D9B27E"/>
+              <w:right w:val="single" w:sz="6" w:space="0" w:color="D9B27E"/>
+            </w:tcBorders>
+            <w:vAlign w:val="center"/>
+          </w:tcPr>
+          <w:p>
+            <w:r>
+              <w:t>Se compare errore. Se compare errore di connessione dopo aver scritto 8000 o 8001 come porta PostgreSQL, ripetere il comando e alla richiesta Porta PostgreSQL scrivere 5432.</w:t>
+            </w:r>
+          </w:p>
+        </w:tc>
+      </w:tr>
+    </w:tbl>
+    <w:p>
+      <w:pPr/>
+    </w:p>
     <w:p/>
     <w:p>
       <w:pPr>

</xml_diff>

<commit_message>
Correggi manuale installazione Windows e macOS
- Sistemata l’indentazione del punto 3.5 nella procedura Windows
- Chiarito quando premere Invio senza scrivere valori durante l’installazione
- Rese più specifiche le indicazioni sugli errori di installazione
- Uniformata la spiegazione degli errori tra Windows e macOS
- Rigenerato il manuale PDF aggiornato
</commit_message>
<xml_diff>
--- a/progetto2/docs/MANUALE_UTENTE.docx
+++ b/progetto2/docs/MANUALE_UTENTE.docx
@@ -415,6 +415,8 @@
     <w:p>
       <w:pPr>
         <w:pStyle w:val="StepManual"/>
+        <w:spacing w:after="60" w:before="0" w:line="240" w:lineRule="auto"/>
+        <w:ind w:left="312" w:hanging="312"/>
       </w:pPr>
       <w:r>
         <w:rPr>
@@ -433,6 +435,8 @@
     <w:p>
       <w:pPr>
         <w:pStyle w:val="StepManual"/>
+        <w:spacing w:after="60" w:before="0" w:line="240" w:lineRule="auto"/>
+        <w:ind w:left="312" w:hanging="312"/>
       </w:pPr>
       <w:r>
         <w:rPr>
@@ -451,6 +455,8 @@
     <w:p>
       <w:pPr>
         <w:pStyle w:val="StepManual"/>
+        <w:spacing w:after="60" w:before="0" w:line="240" w:lineRule="auto"/>
+        <w:ind w:left="312" w:hanging="312"/>
       </w:pPr>
       <w:r>
         <w:rPr>
@@ -469,6 +475,8 @@
     <w:p>
       <w:pPr>
         <w:pStyle w:val="StepManual"/>
+        <w:spacing w:after="60" w:before="0" w:line="240" w:lineRule="auto"/>
+        <w:ind w:left="312" w:hanging="312"/>
       </w:pPr>
       <w:r>
         <w:rPr>
@@ -487,6 +495,8 @@
     <w:p>
       <w:pPr>
         <w:pStyle w:val="StepManual"/>
+        <w:spacing w:after="60" w:before="0" w:line="240" w:lineRule="auto"/>
+        <w:ind w:left="312" w:hanging="312"/>
       </w:pPr>
       <w:r>
         <w:rPr>
@@ -505,6 +515,8 @@
     <w:p>
       <w:pPr>
         <w:pStyle w:val="StepManual"/>
+        <w:spacing w:after="60" w:before="0" w:line="240" w:lineRule="auto"/>
+        <w:ind w:left="312" w:hanging="312"/>
       </w:pPr>
       <w:r>
         <w:rPr>
@@ -523,6 +535,8 @@
     <w:p>
       <w:pPr>
         <w:pStyle w:val="StepManual"/>
+        <w:spacing w:after="60" w:before="0" w:line="240" w:lineRule="auto"/>
+        <w:ind w:left="312" w:hanging="312"/>
       </w:pPr>
       <w:r>
         <w:rPr>
@@ -541,6 +555,8 @@
     <w:p>
       <w:pPr>
         <w:pStyle w:val="StepManual"/>
+        <w:spacing w:after="60" w:before="0" w:line="240" w:lineRule="auto"/>
+        <w:ind w:left="312" w:hanging="312"/>
       </w:pPr>
       <w:r>
         <w:rPr>
@@ -587,10 +603,10 @@
               <w:rPr>
                 <w:b/>
               </w:rPr>
-              <w:t>Se compare errore.</w:t>
+              <w:t>Se il file manage.py non si vede</w:t>
             </w:r>
             <w:r>
-              <w:t xml:space="preserve"> Se il file manage.py non si vede, aprire la cartella interna successiva. Non avviare comandi da una cartella che non contiene manage.py.</w:t>
+              <w:t>, aprire la cartella interna successiva. Non avviare comandi da una cartella che non contiene manage.py.</w:t>
             </w:r>
           </w:p>
         </w:tc>
@@ -611,6 +627,8 @@
     <w:p>
       <w:pPr>
         <w:pStyle w:val="StepManual"/>
+        <w:spacing w:after="60" w:before="0" w:line="240" w:lineRule="auto"/>
+        <w:ind w:left="312" w:hanging="312"/>
       </w:pPr>
       <w:r>
         <w:rPr>
@@ -629,6 +647,8 @@
     <w:p>
       <w:pPr>
         <w:pStyle w:val="StepManual"/>
+        <w:spacing w:after="60" w:before="0" w:line="240" w:lineRule="auto"/>
+        <w:ind w:left="312" w:hanging="312"/>
       </w:pPr>
       <w:r>
         <w:rPr>
@@ -647,6 +667,8 @@
     <w:p>
       <w:pPr>
         <w:pStyle w:val="StepManual"/>
+        <w:spacing w:after="60" w:before="0" w:line="240" w:lineRule="auto"/>
+        <w:ind w:left="312" w:hanging="312"/>
       </w:pPr>
       <w:r>
         <w:rPr>
@@ -665,6 +687,8 @@
     <w:p>
       <w:pPr>
         <w:pStyle w:val="StepManual"/>
+        <w:spacing w:after="60" w:before="0" w:line="240" w:lineRule="auto"/>
+        <w:ind w:left="312" w:hanging="312"/>
       </w:pPr>
       <w:r>
         <w:rPr>
@@ -683,6 +707,8 @@
     <w:p>
       <w:pPr>
         <w:pStyle w:val="StepManual"/>
+        <w:spacing w:after="60" w:before="0" w:line="240" w:lineRule="auto"/>
+        <w:ind w:left="312" w:hanging="312"/>
       </w:pPr>
       <w:r>
         <w:rPr>
@@ -805,10 +831,10 @@
               <w:rPr>
                 <w:b/>
               </w:rPr>
-              <w:t>Se compare errore.</w:t>
+              <w:t>Se questi nomi non compaiono</w:t>
             </w:r>
             <w:r>
-              <w:t xml:space="preserve"> Se questi nomi non compaiono, chiudere PowerShell, aprire la cartella interna corretta e ripetere il punto 3.2.</w:t>
+              <w:t>, chiudere PowerShell, aprire la cartella interna corretta e ripetere il punto 3.2.</w:t>
             </w:r>
           </w:p>
         </w:tc>
@@ -943,10 +969,10 @@
               <w:rPr>
                 <w:b/>
               </w:rPr>
-              <w:t>Se compare errore.</w:t>
+              <w:t>Se Python non viene trovato o la versione non è 3.12</w:t>
             </w:r>
             <w:r>
-              <w:t xml:space="preserve"> Se Python non viene trovato o la versione non è 3.12, scrivere questo comando e premere Invio:</w:t>
+              <w:t>, scrivere questo comando e premere Invio:</w:t>
             </w:r>
           </w:p>
         </w:tc>
@@ -1161,10 +1187,10 @@
               <w:rPr>
                 <w:b/>
               </w:rPr>
-              <w:t>Se compare errore.</w:t>
+              <w:t>Se psql o pg_restore non vengono trovati</w:t>
             </w:r>
             <w:r>
-              <w:t xml:space="preserve"> Se psql o pg_restore non vengono trovati, scrivere questi comandi e premere Invio dopo ogni riga:</w:t>
+              <w:t>, scrivere questi comandi e premere Invio dopo ogni riga:</w:t>
             </w:r>
           </w:p>
         </w:tc>
@@ -1365,103 +1391,87 @@
     <w:p>
       <w:pPr/>
       <w:r>
-        <w:t>Durante l’installazione lo script mostra alcune richieste. Premere Invio per usare il valore tra parentesi quando non serve cambiarlo.</w:t>
+        <w:t>Durante l’installazione lo script mostra alcune richieste. Quando il valore corretto è già scritto tra parentesi quadre, non scrivere nulla e premere Invio.</w:t>
       </w:r>
     </w:p>
     <w:p>
-      <w:pPr/>
+      <w:pPr>
+        <w:pStyle w:val="StepManual"/>
+        <w:spacing w:after="60" w:before="0" w:line="240" w:lineRule="auto"/>
+        <w:ind w:left="312" w:hanging="312"/>
+      </w:pPr>
       <w:r>
-        <w:rPr>
-          <w:b/>
-        </w:rPr>
-        <w:t xml:space="preserve">• </w:t>
-      </w:r>
-      <w:r>
-        <w:t>Host PostgreSQL: lasciare 127.0.0.1. Non scrivere postgres: postgres è di solito il nome dell’utente amministratore, non l’host.</w:t>
+        <w:t>1. Alla richiesta Host PostgreSQL [127.0.0.1]: non scrivere nulla e premere Invio. Non scrivere postgres: postgres è di solito il nome dell’utente amministratore, non l’host.</w:t>
       </w:r>
     </w:p>
     <w:p>
-      <w:pPr/>
+      <w:pPr>
+        <w:pStyle w:val="StepManual"/>
+        <w:spacing w:after="60" w:before="0" w:line="240" w:lineRule="auto"/>
+        <w:ind w:left="312" w:hanging="312"/>
+      </w:pPr>
       <w:r>
-        <w:rPr>
-          <w:b/>
-        </w:rPr>
-        <w:t xml:space="preserve">• </w:t>
-      </w:r>
-      <w:r>
-        <w:t>Porta PostgreSQL: lasciare 5432. Non usare 8000 o 8001: sono porte del sito Django.</w:t>
+        <w:t>2. Alla richiesta Porta PostgreSQL [5432]: non scrivere nulla e premere Invio. Non usare 8000 o 8001: sono porte del sito Django.</w:t>
       </w:r>
     </w:p>
     <w:p>
-      <w:pPr/>
+      <w:pPr>
+        <w:pStyle w:val="StepManual"/>
+        <w:spacing w:after="60" w:before="0" w:line="240" w:lineRule="auto"/>
+        <w:ind w:left="312" w:hanging="312"/>
+      </w:pPr>
       <w:r>
-        <w:rPr>
-          <w:b/>
-        </w:rPr>
-        <w:t xml:space="preserve">• </w:t>
-      </w:r>
-      <w:r>
-        <w:t>Nome database applicativo: lasciare progetto2_db.</w:t>
+        <w:t>3. Alla richiesta Nome database applicativo [progetto2_db]: non scrivere nulla e premere Invio.</w:t>
       </w:r>
     </w:p>
     <w:p>
-      <w:pPr/>
+      <w:pPr>
+        <w:pStyle w:val="StepManual"/>
+        <w:spacing w:after="60" w:before="0" w:line="240" w:lineRule="auto"/>
+        <w:ind w:left="312" w:hanging="312"/>
+      </w:pPr>
       <w:r>
-        <w:rPr>
-          <w:b/>
-        </w:rPr>
-        <w:t xml:space="preserve">• </w:t>
-      </w:r>
-      <w:r>
-        <w:t>Utente applicativo PostgreSQL: lasciare progetto2_user.</w:t>
+        <w:t>4. Alla richiesta Utente applicativo PostgreSQL [progetto2_user]: non scrivere nulla e premere Invio.</w:t>
       </w:r>
     </w:p>
     <w:p>
-      <w:pPr/>
+      <w:pPr>
+        <w:pStyle w:val="StepManual"/>
+        <w:spacing w:after="60" w:before="0" w:line="240" w:lineRule="auto"/>
+        <w:ind w:left="312" w:hanging="312"/>
+      </w:pPr>
       <w:r>
-        <w:rPr>
-          <w:b/>
-        </w:rPr>
-        <w:t xml:space="preserve">• </w:t>
-      </w:r>
-      <w:r>
-        <w:t>Password utente applicativo PostgreSQL: scegliere una password locale per il progetto. Se viene proposta la password del file .env e non serve cambiarla, premere Invio.</w:t>
+        <w:t>5. Alla richiesta Password utente applicativo PostgreSQL: scegliere una password locale per il progetto. Se compare il messaggio Invio per mantenere quella del file .env e non serve cambiarla, non scrivere nulla e premere Invio.</w:t>
       </w:r>
     </w:p>
     <w:p>
-      <w:pPr/>
+      <w:pPr>
+        <w:pStyle w:val="StepManual"/>
+        <w:spacing w:after="60" w:before="0" w:line="240" w:lineRule="auto"/>
+        <w:ind w:left="312" w:hanging="312"/>
+      </w:pPr>
       <w:r>
-        <w:rPr>
-          <w:b/>
-        </w:rPr>
-        <w:t xml:space="preserve">• </w:t>
-      </w:r>
-      <w:r>
-        <w:t>Utente amministratore PostgreSQL: su Windows usare di solito postgres, salvo diversa configurazione di PostgreSQL.</w:t>
+        <w:t>6. Alla richiesta Utente amministratore PostgreSQL [postgres]: non scrivere nulla e premere Invio, salvo diversa configurazione di PostgreSQL.</w:t>
       </w:r>
     </w:p>
     <w:p>
-      <w:pPr/>
+      <w:pPr>
+        <w:pStyle w:val="StepManual"/>
+        <w:spacing w:after="60" w:before="0" w:line="240" w:lineRule="auto"/>
+        <w:ind w:left="312" w:hanging="312"/>
+      </w:pPr>
       <w:r>
-        <w:rPr>
-          <w:b/>
-        </w:rPr>
-        <w:t xml:space="preserve">• </w:t>
-      </w:r>
-      <w:r>
-        <w:t>Password utente amministratore PostgreSQL: scrivere la password scelta durante l’installazione di PostgreSQL.</w:t>
+        <w:t>7. Alla richiesta Password utente amministratore PostgreSQL: scrivere la password scelta durante l’installazione di PostgreSQL e premere Invio.</w:t>
       </w:r>
     </w:p>
     <w:p>
-      <w:pPr/>
+      <w:pPr>
+        <w:pStyle w:val="StepManual"/>
+        <w:spacing w:after="60" w:before="0" w:line="240" w:lineRule="auto"/>
+        <w:ind w:left="312" w:hanging="312"/>
+      </w:pPr>
       <w:r>
-        <w:rPr>
-          <w:b/>
-        </w:rPr>
-        <w:t xml:space="preserve">• </w:t>
-      </w:r>
-      <w:r>
-        <w:t>Quando compare la richiesta di conferma, scrivere SI e premere Invio.</w:t>
+        <w:t>8. Quando compare la richiesta di conferma, scrivere SI e premere Invio.</w:t>
       </w:r>
     </w:p>
     <w:tbl>
@@ -1495,10 +1505,10 @@
               <w:rPr>
                 <w:b/>
               </w:rPr>
-              <w:t>Se compare errore.</w:t>
+              <w:t>Se compare l’errore Backup non trovato</w:t>
             </w:r>
             <w:r>
-              <w:t xml:space="preserve"> Se compare Backup non trovato, copiare progetto2_db.backup nella cartella database/generated e ripetere il comando scripts\install_windows.bat.</w:t>
+              <w:t>, il file progetto2_db.backup non è presente nella cartella database/generated. Copiare progetto2_db.backup in quella cartella e ripetere il comando scripts\install_windows.bat.</w:t>
             </w:r>
           </w:p>
         </w:tc>
@@ -1536,10 +1546,10 @@
               <w:rPr>
                 <w:b/>
               </w:rPr>
-              <w:t>Se compare errore.</w:t>
+              <w:t>Se compare l’errore password errata o autenticazione fallita</w:t>
             </w:r>
             <w:r>
-              <w:t xml:space="preserve"> Se compare password errata o autenticazione fallita, ripetere il comando e inserire la password corretta dell’utente amministratore PostgreSQL.</w:t>
+              <w:t>, ripetere il comando e inserire la password corretta dell’utente amministratore PostgreSQL.</w:t>
             </w:r>
           </w:p>
         </w:tc>
@@ -1572,8 +1582,15 @@
             <w:vAlign w:val="center"/>
           </w:tcPr>
           <w:p>
+            <w:pPr/>
             <w:r>
-              <w:t>Se compare errore. Se compare failed to resolve host 'postgres', ripetere il comando e alla richiesta Host PostgreSQL scrivere 127.0.0.1.</w:t>
+              <w:rPr>
+                <w:b/>
+              </w:rPr>
+              <w:t>Se compare l’errore failed to resolve host 'postgres'</w:t>
+            </w:r>
+            <w:r>
+              <w:t>, ripetere il comando e alla richiesta Host PostgreSQL non scrivere postgres. Scrivere 127.0.0.1, oppure non scrivere nulla se 127.0.0.1 è già proposto tra parentesi quadre.</w:t>
             </w:r>
           </w:p>
         </w:tc>
@@ -1606,8 +1623,15 @@
             <w:vAlign w:val="center"/>
           </w:tcPr>
           <w:p>
+            <w:pPr/>
             <w:r>
-              <w:t>Se compare errore. Se compare errore di connessione dopo aver scritto 8000 o 8001 come porta PostgreSQL, ripetere il comando e alla richiesta Porta PostgreSQL scrivere 5432.</w:t>
+              <w:rPr>
+                <w:b/>
+              </w:rPr>
+              <w:t>Se compare un errore di connessione dopo avere scritto 8000 o 8001 come porta PostgreSQL</w:t>
+            </w:r>
+            <w:r>
+              <w:t>, ripetere il comando e alla richiesta Porta PostgreSQL non scrivere 8000 o 8001. Scrivere 5432, oppure non scrivere nulla se 5432 è già proposto tra parentesi quadre.</w:t>
             </w:r>
           </w:p>
         </w:tc>
@@ -1648,10 +1672,10 @@
               <w:rPr>
                 <w:b/>
               </w:rPr>
-              <w:t>Se compare errore.</w:t>
+              <w:t>Se compare l’errore Python 3.12 non disponibile</w:t>
             </w:r>
             <w:r>
-              <w:t xml:space="preserve"> Se compare Python 3.12 non disponibile, tornare al punto 3.3.</w:t>
+              <w:t>, tornare al punto 3.3.</w:t>
             </w:r>
           </w:p>
         </w:tc>
@@ -1689,10 +1713,10 @@
               <w:rPr>
                 <w:b/>
               </w:rPr>
-              <w:t>Se compare errore.</w:t>
+              <w:t>Se compare l’errore pg_restore non trovato</w:t>
             </w:r>
             <w:r>
-              <w:t xml:space="preserve"> Se compare pg_restore non trovato, tornare al punto 3.4.</w:t>
+              <w:t>, tornare al punto 3.4.</w:t>
             </w:r>
           </w:p>
         </w:tc>
@@ -1831,10 +1855,10 @@
               <w:rPr>
                 <w:b/>
               </w:rPr>
-              <w:t>Se compare errore.</w:t>
+              <w:t>Se compare l’errore Porta 8000 già in uso</w:t>
             </w:r>
             <w:r>
-              <w:t xml:space="preserve"> Se compare Porta 8000 già in uso, tornare in PowerShell e scrivere questo comando:</w:t>
+              <w:t>, tornare in PowerShell e scrivere questo comando:</w:t>
             </w:r>
           </w:p>
         </w:tc>
@@ -1929,6 +1953,8 @@
     <w:p>
       <w:pPr>
         <w:pStyle w:val="StepManual"/>
+        <w:spacing w:after="60" w:before="0" w:line="240" w:lineRule="auto"/>
+        <w:ind w:left="312" w:hanging="312"/>
       </w:pPr>
       <w:r>
         <w:rPr>
@@ -1947,6 +1973,8 @@
     <w:p>
       <w:pPr>
         <w:pStyle w:val="StepManual"/>
+        <w:spacing w:after="60" w:before="0" w:line="240" w:lineRule="auto"/>
+        <w:ind w:left="312" w:hanging="312"/>
       </w:pPr>
       <w:r>
         <w:rPr>
@@ -1965,6 +1993,8 @@
     <w:p>
       <w:pPr>
         <w:pStyle w:val="StepManual"/>
+        <w:spacing w:after="60" w:before="0" w:line="240" w:lineRule="auto"/>
+        <w:ind w:left="312" w:hanging="312"/>
       </w:pPr>
       <w:r>
         <w:rPr>
@@ -1983,6 +2013,8 @@
     <w:p>
       <w:pPr>
         <w:pStyle w:val="StepManual"/>
+        <w:spacing w:after="60" w:before="0" w:line="240" w:lineRule="auto"/>
+        <w:ind w:left="312" w:hanging="312"/>
       </w:pPr>
       <w:r>
         <w:rPr>
@@ -2001,6 +2033,8 @@
     <w:p>
       <w:pPr>
         <w:pStyle w:val="StepManual"/>
+        <w:spacing w:after="60" w:before="0" w:line="240" w:lineRule="auto"/>
+        <w:ind w:left="312" w:hanging="312"/>
       </w:pPr>
       <w:r>
         <w:rPr>
@@ -2019,6 +2053,8 @@
     <w:p>
       <w:pPr>
         <w:pStyle w:val="StepManual"/>
+        <w:spacing w:after="60" w:before="0" w:line="240" w:lineRule="auto"/>
+        <w:ind w:left="312" w:hanging="312"/>
       </w:pPr>
       <w:r>
         <w:rPr>
@@ -2065,10 +2101,10 @@
               <w:rPr>
                 <w:b/>
               </w:rPr>
-              <w:t>Se compare errore.</w:t>
+              <w:t>Se il file manage.py non si vede</w:t>
             </w:r>
             <w:r>
-              <w:t xml:space="preserve"> Se il file manage.py non si vede, aprire la cartella interna successiva. Non avviare comandi da una cartella che non contiene manage.py.</w:t>
+              <w:t>, aprire la cartella interna successiva. Non avviare comandi da una cartella che non contiene manage.py.</w:t>
             </w:r>
           </w:p>
         </w:tc>
@@ -2089,6 +2125,8 @@
     <w:p>
       <w:pPr>
         <w:pStyle w:val="StepManual"/>
+        <w:spacing w:after="60" w:before="0" w:line="240" w:lineRule="auto"/>
+        <w:ind w:left="312" w:hanging="312"/>
       </w:pPr>
       <w:r>
         <w:rPr>
@@ -2107,6 +2145,8 @@
     <w:p>
       <w:pPr>
         <w:pStyle w:val="StepManual"/>
+        <w:spacing w:after="60" w:before="0" w:line="240" w:lineRule="auto"/>
+        <w:ind w:left="312" w:hanging="312"/>
       </w:pPr>
       <w:r>
         <w:rPr>
@@ -2125,6 +2165,8 @@
     <w:p>
       <w:pPr>
         <w:pStyle w:val="StepManual"/>
+        <w:spacing w:after="60" w:before="0" w:line="240" w:lineRule="auto"/>
+        <w:ind w:left="312" w:hanging="312"/>
       </w:pPr>
       <w:r>
         <w:rPr>
@@ -2143,6 +2185,8 @@
     <w:p>
       <w:pPr>
         <w:pStyle w:val="StepManual"/>
+        <w:spacing w:after="60" w:before="0" w:line="240" w:lineRule="auto"/>
+        <w:ind w:left="312" w:hanging="312"/>
       </w:pPr>
       <w:r>
         <w:rPr>
@@ -2196,6 +2240,8 @@
     <w:p>
       <w:pPr>
         <w:pStyle w:val="StepManual"/>
+        <w:spacing w:after="60" w:before="0" w:line="240" w:lineRule="auto"/>
+        <w:ind w:left="312" w:hanging="312"/>
       </w:pPr>
       <w:r>
         <w:rPr>
@@ -2214,6 +2260,8 @@
     <w:p>
       <w:pPr>
         <w:pStyle w:val="StepManual"/>
+        <w:spacing w:after="60" w:before="0" w:line="240" w:lineRule="auto"/>
+        <w:ind w:left="312" w:hanging="312"/>
       </w:pPr>
       <w:r>
         <w:rPr>
@@ -2232,6 +2280,8 @@
     <w:p>
       <w:pPr>
         <w:pStyle w:val="StepManual"/>
+        <w:spacing w:after="60" w:before="0" w:line="240" w:lineRule="auto"/>
+        <w:ind w:left="312" w:hanging="312"/>
       </w:pPr>
       <w:r>
         <w:rPr>
@@ -2354,10 +2404,10 @@
               <w:rPr>
                 <w:b/>
               </w:rPr>
-              <w:t>Se compare errore.</w:t>
+              <w:t>Se questi nomi non compaiono</w:t>
             </w:r>
             <w:r>
-              <w:t xml:space="preserve"> Se questi nomi non compaiono, ripetere il punto 4.2 trascinando la cartella interna corretta.</w:t>
+              <w:t>, ripetere il punto 4.2 trascinando la cartella interna corretta.</w:t>
             </w:r>
           </w:p>
         </w:tc>
@@ -2492,10 +2542,10 @@
               <w:rPr>
                 <w:b/>
               </w:rPr>
-              <w:t>Se compare errore.</w:t>
+              <w:t>Se python3.12 non viene trovato</w:t>
             </w:r>
             <w:r>
-              <w:t xml:space="preserve"> Se python3.12 non viene trovato, provare questo comando:</w:t>
+              <w:t>, provare questo comando:</w:t>
             </w:r>
           </w:p>
         </w:tc>
@@ -2568,10 +2618,10 @@
               <w:rPr>
                 <w:b/>
               </w:rPr>
-              <w:t>Se compare errore.</w:t>
+              <w:t>Se Python 3.12 non è disponibile</w:t>
             </w:r>
             <w:r>
-              <w:t xml:space="preserve"> Se Python 3.12 non è disponibile, verificare prima Homebrew con brew --version. Se brew non viene trovato, installare Homebrew dal sito https://brew.sh/, chiudere e riaprire il Terminale e ripetere il punto 4.3. Se Homebrew è presente, installare Python 3.12 con:</w:t>
+              <w:t>, verificare prima Homebrew con brew --version. Se brew non viene trovato, installare Homebrew dal sito https://brew.sh/, chiudere e riaprire il Terminale e ripetere il punto 4.3. Se Homebrew è presente, installare Python 3.12 con:</w:t>
             </w:r>
           </w:p>
         </w:tc>
@@ -2786,10 +2836,10 @@
               <w:rPr>
                 <w:b/>
               </w:rPr>
-              <w:t>Se compare errore.</w:t>
+              <w:t>Se psql o pg_restore non vengono trovati</w:t>
             </w:r>
             <w:r>
-              <w:t xml:space="preserve"> Se psql o pg_restore non vengono trovati, provare prima questi comandi:</w:t>
+              <w:t>, provare prima questi comandi:</w:t>
             </w:r>
           </w:p>
         </w:tc>
@@ -3122,6 +3172,8 @@
     <w:p>
       <w:pPr>
         <w:pStyle w:val="StepManual"/>
+        <w:spacing w:after="60" w:before="0" w:line="240" w:lineRule="auto"/>
+        <w:ind w:left="312" w:hanging="312"/>
       </w:pPr>
       <w:r>
         <w:t>1. Alla richiesta Host PostgreSQL [127.0.0.1]: non scrivere nulla e premere Invio. Non scrivere postgres: postgres è di solito il nome dell’utente amministratore, non l’host.</w:t>
@@ -3130,6 +3182,8 @@
     <w:p>
       <w:pPr>
         <w:pStyle w:val="StepManual"/>
+        <w:spacing w:after="60" w:before="0" w:line="240" w:lineRule="auto"/>
+        <w:ind w:left="312" w:hanging="312"/>
       </w:pPr>
       <w:r>
         <w:t>2. Alla richiesta Porta PostgreSQL [5432]: non scrivere nulla e premere Invio. Non usare 8000 o 8001: sono porte del sito Django.</w:t>
@@ -3138,6 +3192,8 @@
     <w:p>
       <w:pPr>
         <w:pStyle w:val="StepManual"/>
+        <w:spacing w:after="60" w:before="0" w:line="240" w:lineRule="auto"/>
+        <w:ind w:left="312" w:hanging="312"/>
       </w:pPr>
       <w:r>
         <w:t>3. Alla richiesta Nome database applicativo [progetto2_db]: non scrivere nulla e premere Invio.</w:t>
@@ -3146,6 +3202,8 @@
     <w:p>
       <w:pPr>
         <w:pStyle w:val="StepManual"/>
+        <w:spacing w:after="60" w:before="0" w:line="240" w:lineRule="auto"/>
+        <w:ind w:left="312" w:hanging="312"/>
       </w:pPr>
       <w:r>
         <w:t>4. Alla richiesta Utente applicativo PostgreSQL [progetto2_user]: non scrivere nulla e premere Invio.</w:t>
@@ -3154,6 +3212,8 @@
     <w:p>
       <w:pPr>
         <w:pStyle w:val="StepManual"/>
+        <w:spacing w:after="60" w:before="0" w:line="240" w:lineRule="auto"/>
+        <w:ind w:left="312" w:hanging="312"/>
       </w:pPr>
       <w:r>
         <w:t>5. Alla richiesta Password utente applicativo PostgreSQL: scegliere una password locale per il progetto. Se compare il messaggio Invio per mantenere quella del file .env e non serve cambiarla, non scrivere nulla e premere Invio.</w:t>
@@ -3162,14 +3222,18 @@
     <w:p>
       <w:pPr>
         <w:pStyle w:val="StepManual"/>
+        <w:spacing w:after="60" w:before="0" w:line="240" w:lineRule="auto"/>
+        <w:ind w:left="312" w:hanging="312"/>
       </w:pPr>
       <w:r>
-        <w:t>6. Alla richiesta Utente amministratore PostgreSQL [nome_utente_Mac]: scrivere il nome proposto tra parentesi quadre e premere Invio. Usare postgres solo se PostgreSQL è stato configurato con quell’utente.</w:t>
+        <w:t>6. Alla richiesta Utente amministratore PostgreSQL [nome_utente_Mac]: scrivere il nome proposto tra parentesi quadre e premere Invio. Di solito, con Homebrew, il nome proposto è il nome utente del Mac. Usare postgres solo se PostgreSQL è stato configurato con quell’utente.</w:t>
       </w:r>
     </w:p>
     <w:p>
       <w:pPr>
         <w:pStyle w:val="StepManual"/>
+        <w:spacing w:after="60" w:before="0" w:line="240" w:lineRule="auto"/>
+        <w:ind w:left="312" w:hanging="312"/>
       </w:pPr>
       <w:r>
         <w:t>7. Alla richiesta Password utente amministratore PostgreSQL: se PostgreSQL locale non richiede password, non scrivere nulla e premere Invio. Se invece la richiede, scrivere la password di PostgreSQL e premere Invio.</w:t>
@@ -3178,14 +3242,11 @@
     <w:p>
       <w:pPr>
         <w:pStyle w:val="StepManual"/>
+        <w:spacing w:after="60" w:before="0" w:line="240" w:lineRule="auto"/>
+        <w:ind w:left="312" w:hanging="312"/>
       </w:pPr>
       <w:r>
         <w:t>8. Quando compare la richiesta di conferma, scrivere SI e premere Invio.</w:t>
-      </w:r>
-    </w:p>
-    <w:p>
-      <w:r>
-        <w:br w:type="page"/>
       </w:r>
     </w:p>
     <w:tbl>
@@ -3219,10 +3280,10 @@
               <w:rPr>
                 <w:b/>
               </w:rPr>
-              <w:t>Se compare errore.</w:t>
+              <w:t>Se compare l’errore Backup non trovato</w:t>
             </w:r>
             <w:r>
-              <w:t xml:space="preserve"> Se compare Backup non trovato, copiare progetto2_db.backup nella cartella database/generated e ripetere ./scripts/install_macos.sh.</w:t>
+              <w:t>, il file progetto2_db.backup non è presente nella cartella database/generated. Copiare progetto2_db.backup in quella cartella e ripetere ./scripts/install_macos.sh.</w:t>
             </w:r>
           </w:p>
         </w:tc>
@@ -3253,8 +3314,15 @@
             <w:vAlign w:val="center"/>
           </w:tcPr>
           <w:p>
+            <w:pPr/>
             <w:r>
-              <w:t>Se compare errore. Se compare autenticazione fallita, ripetere il comando e inserire l’utente amministratore PostgreSQL corretto. Se PostgreSQL locale non richiede password, alla richiesta della password premere Invio.</w:t>
+              <w:rPr>
+                <w:b/>
+              </w:rPr>
+              <w:t>Se compare l’errore autenticazione fallita</w:t>
+            </w:r>
+            <w:r>
+              <w:t>, ripetere il comando e inserire l’utente amministratore PostgreSQL corretto. Se PostgreSQL locale non richiede password, alla richiesta della password premere Invio.</w:t>
             </w:r>
           </w:p>
         </w:tc>
@@ -3287,8 +3355,15 @@
             <w:vAlign w:val="center"/>
           </w:tcPr>
           <w:p>
+            <w:pPr/>
             <w:r>
-              <w:t>Se compare errore. Se compare failed to resolve host 'postgres', ripetere il comando e alla richiesta Host PostgreSQL scrivere 127.0.0.1.</w:t>
+              <w:rPr>
+                <w:b/>
+              </w:rPr>
+              <w:t>Se compare l’errore failed to resolve host 'postgres'</w:t>
+            </w:r>
+            <w:r>
+              <w:t>, ripetere il comando e alla richiesta Host PostgreSQL non scrivere postgres. Scrivere 127.0.0.1, oppure non scrivere nulla se 127.0.0.1 è già proposto tra parentesi quadre.</w:t>
             </w:r>
           </w:p>
         </w:tc>
@@ -3321,8 +3396,15 @@
             <w:vAlign w:val="center"/>
           </w:tcPr>
           <w:p>
+            <w:pPr/>
             <w:r>
-              <w:t>Se compare errore. Se compare errore di connessione dopo aver scritto 8000 o 8001 come porta PostgreSQL, ripetere il comando e alla richiesta Porta PostgreSQL scrivere 5432.</w:t>
+              <w:rPr>
+                <w:b/>
+              </w:rPr>
+              <w:t>Se compare un errore di connessione dopo avere scritto 8000 o 8001 come porta PostgreSQL</w:t>
+            </w:r>
+            <w:r>
+              <w:t>, ripetere il comando e alla richiesta Porta PostgreSQL non scrivere 8000 o 8001. Scrivere 5432, oppure non scrivere nulla se 5432 è già proposto tra parentesi quadre.</w:t>
             </w:r>
           </w:p>
         </w:tc>
@@ -3464,10 +3546,10 @@
               <w:rPr>
                 <w:b/>
               </w:rPr>
-              <w:t>Se compare errore.</w:t>
+              <w:t>Se compare l’errore Porta 8000 già in uso</w:t>
             </w:r>
             <w:r>
-              <w:t xml:space="preserve"> Se compare Porta 8000 già in uso, tornare nel Terminale e scrivere questo comando:</w:t>
+              <w:t>, tornare nel Terminale e scrivere questo comando:</w:t>
             </w:r>
           </w:p>
         </w:tc>
@@ -3551,6 +3633,8 @@
     <w:p>
       <w:pPr>
         <w:pStyle w:val="StepManual"/>
+        <w:spacing w:after="60" w:before="0" w:line="240" w:lineRule="auto"/>
+        <w:ind w:left="312" w:hanging="312"/>
       </w:pPr>
       <w:r>
         <w:rPr>
@@ -3569,6 +3653,8 @@
     <w:p>
       <w:pPr>
         <w:pStyle w:val="StepManual"/>
+        <w:spacing w:after="60" w:before="0" w:line="240" w:lineRule="auto"/>
+        <w:ind w:left="312" w:hanging="312"/>
       </w:pPr>
       <w:r>
         <w:rPr>
@@ -3587,6 +3673,8 @@
     <w:p>
       <w:pPr>
         <w:pStyle w:val="StepManual"/>
+        <w:spacing w:after="60" w:before="0" w:line="240" w:lineRule="auto"/>
+        <w:ind w:left="312" w:hanging="312"/>
       </w:pPr>
       <w:r>
         <w:rPr>
@@ -3605,6 +3693,8 @@
     <w:p>
       <w:pPr>
         <w:pStyle w:val="StepManual"/>
+        <w:spacing w:after="60" w:before="0" w:line="240" w:lineRule="auto"/>
+        <w:ind w:left="312" w:hanging="312"/>
       </w:pPr>
       <w:r>
         <w:rPr>
@@ -3623,6 +3713,8 @@
     <w:p>
       <w:pPr>
         <w:pStyle w:val="StepManual"/>
+        <w:spacing w:after="60" w:before="0" w:line="240" w:lineRule="auto"/>
+        <w:ind w:left="312" w:hanging="312"/>
       </w:pPr>
       <w:r>
         <w:rPr>
@@ -3641,6 +3733,8 @@
     <w:p>
       <w:pPr>
         <w:pStyle w:val="StepManual"/>
+        <w:spacing w:after="60" w:before="0" w:line="240" w:lineRule="auto"/>
+        <w:ind w:left="312" w:hanging="312"/>
       </w:pPr>
       <w:r>
         <w:rPr>
@@ -3659,6 +3753,8 @@
     <w:p>
       <w:pPr>
         <w:pStyle w:val="StepManual"/>
+        <w:spacing w:after="60" w:before="0" w:line="240" w:lineRule="auto"/>
+        <w:ind w:left="312" w:hanging="312"/>
       </w:pPr>
       <w:r>
         <w:rPr>
@@ -3705,10 +3801,10 @@
               <w:rPr>
                 <w:b/>
               </w:rPr>
-              <w:t>Se compare errore.</w:t>
+              <w:t>Se le pagine sono vuote</w:t>
             </w:r>
             <w:r>
-              <w:t xml:space="preserve"> Se le pagine sono vuote, controllare il database con questo comando:</w:t>
+              <w:t>, controllare il database con questo comando:</w:t>
             </w:r>
           </w:p>
         </w:tc>

</xml_diff>

<commit_message>
Completa la documentazione finale del progetto
- Aggiunto il documento PDF sulle scelte progettuali
- Descritta la ristrutturazione con Django, PostgreSQL e Bootstrap
- Documentate le ottimizzazioni per il database delle chiamate
- Corretto il README con i collegamenti ai documenti realmente presenti
- Corretto il comando verify_import per Windows e macOS
- Rigenerato e verificato il manuale utente aggiornato
</commit_message>
<xml_diff>
--- a/progetto2/docs/MANUALE_UTENTE.docx
+++ b/progetto2/docs/MANUALE_UTENTE.docx
@@ -3801,10 +3801,10 @@
               <w:rPr>
                 <w:b/>
               </w:rPr>
-              <w:t>Se le pagine sono vuote</w:t>
+              <w:t xml:space="preserve">Se le pagine sono vuote, </w:t>
             </w:r>
             <w:r>
-              <w:t>, controllare il database con questo comando:</w:t>
+              <w:t>controllare il database con il comando corrispondente al sistema operativo:</w:t>
             </w:r>
           </w:p>
         </w:tc>
@@ -3838,8 +3838,21 @@
             <w:pPr>
               <w:pStyle w:val="CodeManual"/>
             </w:pPr>
+            <w:r/>
             <w:r>
-              <w:t>python manage.py verify_import</w:t>
+              <w:t>Windows:</w:t>
+              <w:br/>
+            </w:r>
+            <w:r>
+              <w:t>.venv\Scripts\python.exe manage.py verify_import</w:t>
+              <w:br/>
+            </w:r>
+            <w:r>
+              <w:t>macOS:</w:t>
+              <w:br/>
+            </w:r>
+            <w:r>
+              <w:t>.venv/bin/python manage.py verify_import</w:t>
             </w:r>
           </w:p>
         </w:tc>

</xml_diff>